<commit_message>
feat: Criado Aluno e Disciplina, requisições completas e testadas com H2
</commit_message>
<xml_diff>
--- a/AT/documentos/samuel_hermany_DR3_AT.docx
+++ b/AT/documentos/samuel_hermany_DR3_AT.docx
@@ -276,7 +276,7 @@
                                     <w:tag w:val=""/>
                                     <w:id w:val="-650599894"/>
                                     <w:dataBinding w:prefixMappings="xmlns:ns0='http://schemas.microsoft.com/office/2006/coverPageProps' " w:xpath="/ns0:CoverPageProperties[1]/ns0:PublishDate[1]" w:storeItemID="{55AF091B-3C7A-41E3-B477-F2FDAA23CFDA}"/>
-                                    <w:date w:fullDate="2025-09-23T00:00:00Z">
+                                    <w:date w:fullDate="2025-09-22T00:00:00Z">
                                       <w:dateFormat w:val="d/M/yyyy"/>
                                       <w:lid w:val="pt-BR"/>
                                       <w:storeMappedDataAs w:val="dateTime"/>
@@ -301,7 +301,23 @@
                                           <w:sz w:val="28"/>
                                           <w:szCs w:val="28"/>
                                         </w:rPr>
-                                        <w:t>23/9/2025</w:t>
+                                        <w:t>2</w:t>
+                                      </w:r>
+                                      <w:r>
+                                        <w:rPr>
+                                          <w:color w:val="FFFFFF" w:themeColor="background1"/>
+                                          <w:sz w:val="28"/>
+                                          <w:szCs w:val="28"/>
+                                        </w:rPr>
+                                        <w:t>2</w:t>
+                                      </w:r>
+                                      <w:r>
+                                        <w:rPr>
+                                          <w:color w:val="FFFFFF" w:themeColor="background1"/>
+                                          <w:sz w:val="28"/>
+                                          <w:szCs w:val="28"/>
+                                        </w:rPr>
+                                        <w:t>/9/2025</w:t>
                                       </w:r>
                                     </w:p>
                                   </w:sdtContent>
@@ -3589,7 +3605,7 @@
                               <w:tag w:val=""/>
                               <w:id w:val="-650599894"/>
                               <w:dataBinding w:prefixMappings="xmlns:ns0='http://schemas.microsoft.com/office/2006/coverPageProps' " w:xpath="/ns0:CoverPageProperties[1]/ns0:PublishDate[1]" w:storeItemID="{55AF091B-3C7A-41E3-B477-F2FDAA23CFDA}"/>
-                              <w:date w:fullDate="2025-09-23T00:00:00Z">
+                              <w:date w:fullDate="2025-09-22T00:00:00Z">
                                 <w:dateFormat w:val="d/M/yyyy"/>
                                 <w:lid w:val="pt-BR"/>
                                 <w:storeMappedDataAs w:val="dateTime"/>
@@ -3614,7 +3630,23 @@
                                     <w:sz w:val="28"/>
                                     <w:szCs w:val="28"/>
                                   </w:rPr>
-                                  <w:t>23/9/2025</w:t>
+                                  <w:t>2</w:t>
+                                </w:r>
+                                <w:r>
+                                  <w:rPr>
+                                    <w:color w:val="FFFFFF" w:themeColor="background1"/>
+                                    <w:sz w:val="28"/>
+                                    <w:szCs w:val="28"/>
+                                  </w:rPr>
+                                  <w:t>2</w:t>
+                                </w:r>
+                                <w:r>
+                                  <w:rPr>
+                                    <w:color w:val="FFFFFF" w:themeColor="background1"/>
+                                    <w:sz w:val="28"/>
+                                    <w:szCs w:val="28"/>
+                                  </w:rPr>
+                                  <w:t>/9/2025</w:t>
                                 </w:r>
                               </w:p>
                             </w:sdtContent>
@@ -4185,20 +4217,8 @@
                                         <w:szCs w:val="28"/>
                                         <w:lang w:eastAsia="pt-BR"/>
                                       </w:rPr>
-                                      <w:t xml:space="preserve">Desenvolvimento de Serviços com </w:t>
+                                      <w:t>Desenvolvimento de Serviços com SpringBoot</w:t>
                                     </w:r>
-                                    <w:proofErr w:type="spellStart"/>
-                                    <w:r>
-                                      <w:rPr>
-                                        <w:rFonts w:ascii="Arial" w:eastAsia="Times New Roman" w:hAnsi="Arial" w:cs="Arial"/>
-                                        <w:color w:val="0070C0"/>
-                                        <w:sz w:val="28"/>
-                                        <w:szCs w:val="28"/>
-                                        <w:lang w:eastAsia="pt-BR"/>
-                                      </w:rPr>
-                                      <w:t>SpringBoot</w:t>
-                                    </w:r>
-                                    <w:proofErr w:type="spellEnd"/>
                                   </w:sdtContent>
                                 </w:sdt>
                               </w:p>
@@ -4314,20 +4334,8 @@
                                   <w:szCs w:val="28"/>
                                   <w:lang w:eastAsia="pt-BR"/>
                                 </w:rPr>
-                                <w:t xml:space="preserve">Desenvolvimento de Serviços com </w:t>
+                                <w:t>Desenvolvimento de Serviços com SpringBoot</w:t>
                               </w:r>
-                              <w:proofErr w:type="spellStart"/>
-                              <w:r>
-                                <w:rPr>
-                                  <w:rFonts w:ascii="Arial" w:eastAsia="Times New Roman" w:hAnsi="Arial" w:cs="Arial"/>
-                                  <w:color w:val="0070C0"/>
-                                  <w:sz w:val="28"/>
-                                  <w:szCs w:val="28"/>
-                                  <w:lang w:eastAsia="pt-BR"/>
-                                </w:rPr>
-                                <w:t>SpringBoot</w:t>
-                              </w:r>
-                              <w:proofErr w:type="spellEnd"/>
                             </w:sdtContent>
                           </w:sdt>
                         </w:p>
@@ -4520,11 +4528,3046 @@
       </w:r>
     </w:p>
     <w:p>
-      <w:pPr>
-        <w:rPr>
-          <w:u w:val="single"/>
-        </w:rPr>
-      </w:pPr>
+      <w:r>
+        <w:t>F</w:t>
+      </w:r>
+    </w:p>
+    <w:p>
+      <w:pPr>
+        <w:pStyle w:val="Ttulo1"/>
+      </w:pPr>
+      <w:r>
+        <w:t>Liste 4 tipos de requisições HTTP que o Spring Boot suporta. Detalhe o funcionamento de cada uma delas.</w:t>
+      </w:r>
+    </w:p>
+    <w:p>
+      <w:pPr>
+        <w:pStyle w:val="PargrafodaLista"/>
+        <w:numPr>
+          <w:ilvl w:val="0"/>
+          <w:numId w:val="12"/>
+        </w:numPr>
+      </w:pPr>
+      <w:r>
+        <w:t>GET</w:t>
+      </w:r>
+    </w:p>
+    <w:p>
+      <w:pPr>
+        <w:pStyle w:val="PargrafodaLista"/>
+      </w:pPr>
+      <w:r>
+        <w:t xml:space="preserve">Usado para </w:t>
+      </w:r>
+      <w:r>
+        <w:t>OBTER</w:t>
+      </w:r>
+      <w:r>
+        <w:t xml:space="preserve"> algum recurso hospedado no servido</w:t>
+      </w:r>
+      <w:r>
+        <w:t>r.</w:t>
+      </w:r>
+    </w:p>
+    <w:p>
+      <w:pPr>
+        <w:pStyle w:val="PargrafodaLista"/>
+      </w:pPr>
+      <w:r>
+        <w:t>Codigo:</w:t>
+      </w:r>
+    </w:p>
+    <w:p>
+      <w:pPr>
+        <w:shd w:val="clear" w:color="auto" w:fill="1E1F22"/>
+        <w:tabs>
+          <w:tab w:val="left" w:pos="916"/>
+          <w:tab w:val="left" w:pos="1832"/>
+          <w:tab w:val="left" w:pos="2748"/>
+          <w:tab w:val="left" w:pos="3664"/>
+          <w:tab w:val="left" w:pos="4580"/>
+          <w:tab w:val="left" w:pos="5496"/>
+          <w:tab w:val="left" w:pos="6412"/>
+          <w:tab w:val="left" w:pos="7328"/>
+          <w:tab w:val="left" w:pos="8244"/>
+          <w:tab w:val="left" w:pos="9160"/>
+          <w:tab w:val="left" w:pos="10076"/>
+          <w:tab w:val="left" w:pos="10992"/>
+          <w:tab w:val="left" w:pos="11908"/>
+          <w:tab w:val="left" w:pos="12824"/>
+          <w:tab w:val="left" w:pos="13740"/>
+          <w:tab w:val="left" w:pos="14656"/>
+        </w:tabs>
+        <w:spacing w:line="240" w:lineRule="auto"/>
+        <w:rPr>
+          <w:rFonts w:ascii="Courier New" w:eastAsia="Times New Roman" w:hAnsi="Courier New" w:cs="Courier New"/>
+          <w:color w:val="BCBEC4"/>
+          <w:sz w:val="20"/>
+          <w:szCs w:val="20"/>
+          <w:lang w:eastAsia="pt-BR"/>
+        </w:rPr>
+      </w:pPr>
+      <w:r>
+        <w:rPr>
+          <w:rFonts w:ascii="Courier New" w:eastAsia="Times New Roman" w:hAnsi="Courier New" w:cs="Courier New"/>
+          <w:color w:val="008400"/>
+          <w:sz w:val="20"/>
+          <w:szCs w:val="20"/>
+          <w:lang w:eastAsia="pt-BR"/>
+        </w:rPr>
+        <w:t>// GET - Obtém todos os Clientes</w:t>
+      </w:r>
+      <w:r>
+        <w:rPr>
+          <w:rFonts w:ascii="Courier New" w:eastAsia="Times New Roman" w:hAnsi="Courier New" w:cs="Courier New"/>
+          <w:color w:val="008400"/>
+          <w:sz w:val="20"/>
+          <w:szCs w:val="20"/>
+          <w:lang w:eastAsia="pt-BR"/>
+        </w:rPr>
+        <w:br/>
+      </w:r>
+      <w:r>
+        <w:rPr>
+          <w:rFonts w:ascii="Courier New" w:eastAsia="Times New Roman" w:hAnsi="Courier New" w:cs="Courier New"/>
+          <w:color w:val="B3AE60"/>
+          <w:sz w:val="20"/>
+          <w:szCs w:val="20"/>
+          <w:lang w:eastAsia="pt-BR"/>
+        </w:rPr>
+        <w:t>@GetMapping</w:t>
+      </w:r>
+      <w:r>
+        <w:rPr>
+          <w:rFonts w:ascii="Courier New" w:eastAsia="Times New Roman" w:hAnsi="Courier New" w:cs="Courier New"/>
+          <w:color w:val="B3AE60"/>
+          <w:sz w:val="20"/>
+          <w:szCs w:val="20"/>
+          <w:lang w:eastAsia="pt-BR"/>
+        </w:rPr>
+        <w:br/>
+      </w:r>
+      <w:r>
+        <w:rPr>
+          <w:rFonts w:ascii="Courier New" w:eastAsia="Times New Roman" w:hAnsi="Courier New" w:cs="Courier New"/>
+          <w:color w:val="CF8E6D"/>
+          <w:sz w:val="20"/>
+          <w:szCs w:val="20"/>
+          <w:lang w:eastAsia="pt-BR"/>
+        </w:rPr>
+        <w:t xml:space="preserve">public </w:t>
+      </w:r>
+      <w:r>
+        <w:rPr>
+          <w:rFonts w:ascii="Courier New" w:eastAsia="Times New Roman" w:hAnsi="Courier New" w:cs="Courier New"/>
+          <w:color w:val="BCBEC4"/>
+          <w:sz w:val="20"/>
+          <w:szCs w:val="20"/>
+          <w:lang w:eastAsia="pt-BR"/>
+        </w:rPr>
+        <w:t xml:space="preserve">ResponseEntity&lt;List&lt;Cliente&gt;&gt; </w:t>
+      </w:r>
+      <w:r>
+        <w:rPr>
+          <w:rFonts w:ascii="Courier New" w:eastAsia="Times New Roman" w:hAnsi="Courier New" w:cs="Courier New"/>
+          <w:color w:val="56A8F5"/>
+          <w:sz w:val="20"/>
+          <w:szCs w:val="20"/>
+          <w:lang w:eastAsia="pt-BR"/>
+        </w:rPr>
+        <w:t>getAll</w:t>
+      </w:r>
+      <w:r>
+        <w:rPr>
+          <w:rFonts w:ascii="Courier New" w:eastAsia="Times New Roman" w:hAnsi="Courier New" w:cs="Courier New"/>
+          <w:color w:val="BCBEC4"/>
+          <w:sz w:val="20"/>
+          <w:szCs w:val="20"/>
+          <w:lang w:eastAsia="pt-BR"/>
+        </w:rPr>
+        <w:t>() {</w:t>
+      </w:r>
+      <w:r>
+        <w:rPr>
+          <w:rFonts w:ascii="Courier New" w:eastAsia="Times New Roman" w:hAnsi="Courier New" w:cs="Courier New"/>
+          <w:color w:val="BCBEC4"/>
+          <w:sz w:val="20"/>
+          <w:szCs w:val="20"/>
+          <w:lang w:eastAsia="pt-BR"/>
+        </w:rPr>
+        <w:br/>
+        <w:t xml:space="preserve">    </w:t>
+      </w:r>
+      <w:r>
+        <w:rPr>
+          <w:rFonts w:ascii="Courier New" w:eastAsia="Times New Roman" w:hAnsi="Courier New" w:cs="Courier New"/>
+          <w:color w:val="CF8E6D"/>
+          <w:sz w:val="20"/>
+          <w:szCs w:val="20"/>
+          <w:lang w:eastAsia="pt-BR"/>
+        </w:rPr>
+        <w:t xml:space="preserve">return </w:t>
+      </w:r>
+      <w:r>
+        <w:rPr>
+          <w:rFonts w:ascii="Courier New" w:eastAsia="Times New Roman" w:hAnsi="Courier New" w:cs="Courier New"/>
+          <w:color w:val="BCBEC4"/>
+          <w:sz w:val="20"/>
+          <w:szCs w:val="20"/>
+          <w:lang w:eastAsia="pt-BR"/>
+        </w:rPr>
+        <w:t>ResponseEntity.</w:t>
+      </w:r>
+      <w:r>
+        <w:rPr>
+          <w:rFonts w:ascii="Courier New" w:eastAsia="Times New Roman" w:hAnsi="Courier New" w:cs="Courier New"/>
+          <w:i/>
+          <w:iCs/>
+          <w:color w:val="BCBEC4"/>
+          <w:sz w:val="20"/>
+          <w:szCs w:val="20"/>
+          <w:lang w:eastAsia="pt-BR"/>
+        </w:rPr>
+        <w:t>ok</w:t>
+      </w:r>
+      <w:r>
+        <w:rPr>
+          <w:rFonts w:ascii="Courier New" w:eastAsia="Times New Roman" w:hAnsi="Courier New" w:cs="Courier New"/>
+          <w:color w:val="BCBEC4"/>
+          <w:sz w:val="20"/>
+          <w:szCs w:val="20"/>
+          <w:lang w:eastAsia="pt-BR"/>
+        </w:rPr>
+        <w:t>().body(</w:t>
+      </w:r>
+      <w:r>
+        <w:rPr>
+          <w:rFonts w:ascii="Courier New" w:eastAsia="Times New Roman" w:hAnsi="Courier New" w:cs="Courier New"/>
+          <w:color w:val="C77DBB"/>
+          <w:sz w:val="20"/>
+          <w:szCs w:val="20"/>
+          <w:lang w:eastAsia="pt-BR"/>
+        </w:rPr>
+        <w:t>service</w:t>
+      </w:r>
+      <w:r>
+        <w:rPr>
+          <w:rFonts w:ascii="Courier New" w:eastAsia="Times New Roman" w:hAnsi="Courier New" w:cs="Courier New"/>
+          <w:color w:val="BCBEC4"/>
+          <w:sz w:val="20"/>
+          <w:szCs w:val="20"/>
+          <w:lang w:eastAsia="pt-BR"/>
+        </w:rPr>
+        <w:t>.getAll());</w:t>
+      </w:r>
+      <w:r>
+        <w:rPr>
+          <w:rFonts w:ascii="Courier New" w:eastAsia="Times New Roman" w:hAnsi="Courier New" w:cs="Courier New"/>
+          <w:color w:val="BCBEC4"/>
+          <w:sz w:val="20"/>
+          <w:szCs w:val="20"/>
+          <w:lang w:eastAsia="pt-BR"/>
+        </w:rPr>
+        <w:br/>
+        <w:t>}</w:t>
+      </w:r>
+    </w:p>
+    <w:p/>
+    <w:p>
+      <w:pPr>
+        <w:rPr>
+          <w:b/>
+          <w:bCs/>
+        </w:rPr>
+      </w:pPr>
+      <w:r>
+        <w:rPr>
+          <w:b/>
+          <w:bCs/>
+        </w:rPr>
+        <w:t>POSTMAN</w:t>
+      </w:r>
+    </w:p>
+    <w:p>
+      <w:r>
+        <w:drawing>
+          <wp:inline distT="0" distB="0" distL="0" distR="0" wp14:anchorId="115A47B5" wp14:editId="24C2A1D5">
+            <wp:extent cx="6479540" cy="5695315"/>
+            <wp:effectExtent l="0" t="0" r="0" b="635"/>
+            <wp:docPr id="33" name="Imagem 33"/>
+            <wp:cNvGraphicFramePr>
+              <a:graphicFrameLocks xmlns:a="http://schemas.openxmlformats.org/drawingml/2006/main" noChangeAspect="1"/>
+            </wp:cNvGraphicFramePr>
+            <a:graphic xmlns:a="http://schemas.openxmlformats.org/drawingml/2006/main">
+              <a:graphicData uri="http://schemas.openxmlformats.org/drawingml/2006/picture">
+                <pic:pic xmlns:pic="http://schemas.openxmlformats.org/drawingml/2006/picture">
+                  <pic:nvPicPr>
+                    <pic:cNvPr id="1" name=""/>
+                    <pic:cNvPicPr/>
+                  </pic:nvPicPr>
+                  <pic:blipFill>
+                    <a:blip r:embed="rId7"/>
+                    <a:stretch>
+                      <a:fillRect/>
+                    </a:stretch>
+                  </pic:blipFill>
+                  <pic:spPr>
+                    <a:xfrm>
+                      <a:off x="0" y="0"/>
+                      <a:ext cx="6479540" cy="5695315"/>
+                    </a:xfrm>
+                    <a:prstGeom prst="rect">
+                      <a:avLst/>
+                    </a:prstGeom>
+                  </pic:spPr>
+                </pic:pic>
+              </a:graphicData>
+            </a:graphic>
+          </wp:inline>
+        </w:drawing>
+      </w:r>
+    </w:p>
+    <w:p/>
+    <w:p>
+      <w:pPr>
+        <w:sectPr>
+          <w:pgSz w:w="11906" w:h="16838"/>
+          <w:pgMar w:top="851" w:right="851" w:bottom="851" w:left="851" w:header="709" w:footer="709" w:gutter="0"/>
+          <w:pgNumType w:start="0"/>
+          <w:cols w:space="708"/>
+          <w:titlePg/>
+          <w:docGrid w:linePitch="360"/>
+        </w:sectPr>
+      </w:pPr>
+    </w:p>
+    <w:p>
+      <w:pPr>
+        <w:spacing w:after="160"/>
+      </w:pPr>
+      <w:r>
+        <w:br w:type="page"/>
+      </w:r>
+    </w:p>
+    <w:p>
+      <w:pPr>
+        <w:pStyle w:val="PargrafodaLista"/>
+        <w:numPr>
+          <w:ilvl w:val="0"/>
+          <w:numId w:val="12"/>
+        </w:numPr>
+      </w:pPr>
+      <w:r>
+        <w:lastRenderedPageBreak/>
+        <w:t>POST</w:t>
+      </w:r>
+    </w:p>
+    <w:p>
+      <w:pPr>
+        <w:pStyle w:val="PargrafodaLista"/>
+      </w:pPr>
+      <w:r>
+        <w:t xml:space="preserve">Usado para </w:t>
+      </w:r>
+      <w:r>
+        <w:t>ENVIAR</w:t>
+      </w:r>
+      <w:r>
+        <w:t xml:space="preserve"> dados para o servidor</w:t>
+      </w:r>
+      <w:r>
+        <w:t>.</w:t>
+      </w:r>
+    </w:p>
+    <w:p>
+      <w:pPr>
+        <w:shd w:val="clear" w:color="auto" w:fill="1E1F22"/>
+        <w:tabs>
+          <w:tab w:val="left" w:pos="916"/>
+          <w:tab w:val="left" w:pos="1832"/>
+          <w:tab w:val="left" w:pos="2748"/>
+          <w:tab w:val="left" w:pos="3664"/>
+          <w:tab w:val="left" w:pos="4580"/>
+          <w:tab w:val="left" w:pos="5496"/>
+          <w:tab w:val="left" w:pos="6412"/>
+          <w:tab w:val="left" w:pos="7328"/>
+          <w:tab w:val="left" w:pos="8244"/>
+          <w:tab w:val="left" w:pos="9160"/>
+          <w:tab w:val="left" w:pos="10076"/>
+          <w:tab w:val="left" w:pos="10992"/>
+          <w:tab w:val="left" w:pos="11908"/>
+          <w:tab w:val="left" w:pos="12824"/>
+          <w:tab w:val="left" w:pos="13740"/>
+          <w:tab w:val="left" w:pos="14656"/>
+        </w:tabs>
+        <w:spacing w:line="240" w:lineRule="auto"/>
+        <w:rPr>
+          <w:rFonts w:ascii="Courier New" w:eastAsia="Times New Roman" w:hAnsi="Courier New" w:cs="Courier New"/>
+          <w:color w:val="BCBEC4"/>
+          <w:sz w:val="20"/>
+          <w:szCs w:val="20"/>
+          <w:lang w:eastAsia="pt-BR"/>
+        </w:rPr>
+      </w:pPr>
+      <w:r>
+        <w:rPr>
+          <w:rFonts w:ascii="Courier New" w:eastAsia="Times New Roman" w:hAnsi="Courier New" w:cs="Courier New"/>
+          <w:color w:val="008400"/>
+          <w:sz w:val="20"/>
+          <w:szCs w:val="20"/>
+          <w:lang w:eastAsia="pt-BR"/>
+        </w:rPr>
+        <w:t>// POST - Criação de Cliente</w:t>
+      </w:r>
+      <w:r>
+        <w:rPr>
+          <w:rFonts w:ascii="Courier New" w:eastAsia="Times New Roman" w:hAnsi="Courier New" w:cs="Courier New"/>
+          <w:color w:val="008400"/>
+          <w:sz w:val="20"/>
+          <w:szCs w:val="20"/>
+          <w:lang w:eastAsia="pt-BR"/>
+        </w:rPr>
+        <w:br/>
+      </w:r>
+      <w:r>
+        <w:rPr>
+          <w:rFonts w:ascii="Courier New" w:eastAsia="Times New Roman" w:hAnsi="Courier New" w:cs="Courier New"/>
+          <w:color w:val="B3AE60"/>
+          <w:sz w:val="20"/>
+          <w:szCs w:val="20"/>
+          <w:lang w:eastAsia="pt-BR"/>
+        </w:rPr>
+        <w:t>@PostMapping</w:t>
+      </w:r>
+      <w:r>
+        <w:rPr>
+          <w:rFonts w:ascii="Courier New" w:eastAsia="Times New Roman" w:hAnsi="Courier New" w:cs="Courier New"/>
+          <w:color w:val="B3AE60"/>
+          <w:sz w:val="20"/>
+          <w:szCs w:val="20"/>
+          <w:lang w:eastAsia="pt-BR"/>
+        </w:rPr>
+        <w:br/>
+      </w:r>
+      <w:r>
+        <w:rPr>
+          <w:rFonts w:ascii="Courier New" w:eastAsia="Times New Roman" w:hAnsi="Courier New" w:cs="Courier New"/>
+          <w:color w:val="CF8E6D"/>
+          <w:sz w:val="20"/>
+          <w:szCs w:val="20"/>
+          <w:lang w:eastAsia="pt-BR"/>
+        </w:rPr>
+        <w:t xml:space="preserve">public </w:t>
+      </w:r>
+      <w:r>
+        <w:rPr>
+          <w:rFonts w:ascii="Courier New" w:eastAsia="Times New Roman" w:hAnsi="Courier New" w:cs="Courier New"/>
+          <w:color w:val="BCBEC4"/>
+          <w:sz w:val="20"/>
+          <w:szCs w:val="20"/>
+          <w:lang w:eastAsia="pt-BR"/>
+        </w:rPr>
+        <w:t xml:space="preserve">ResponseEntity&lt;Cliente&gt; </w:t>
+      </w:r>
+      <w:r>
+        <w:rPr>
+          <w:rFonts w:ascii="Courier New" w:eastAsia="Times New Roman" w:hAnsi="Courier New" w:cs="Courier New"/>
+          <w:color w:val="56A8F5"/>
+          <w:sz w:val="20"/>
+          <w:szCs w:val="20"/>
+          <w:lang w:eastAsia="pt-BR"/>
+        </w:rPr>
+        <w:t>create</w:t>
+      </w:r>
+      <w:r>
+        <w:rPr>
+          <w:rFonts w:ascii="Courier New" w:eastAsia="Times New Roman" w:hAnsi="Courier New" w:cs="Courier New"/>
+          <w:color w:val="BCBEC4"/>
+          <w:sz w:val="20"/>
+          <w:szCs w:val="20"/>
+          <w:lang w:eastAsia="pt-BR"/>
+        </w:rPr>
+        <w:t>(</w:t>
+      </w:r>
+      <w:r>
+        <w:rPr>
+          <w:rFonts w:ascii="Courier New" w:eastAsia="Times New Roman" w:hAnsi="Courier New" w:cs="Courier New"/>
+          <w:color w:val="B3AE60"/>
+          <w:sz w:val="20"/>
+          <w:szCs w:val="20"/>
+          <w:lang w:eastAsia="pt-BR"/>
+        </w:rPr>
+        <w:t xml:space="preserve">@RequestBody </w:t>
+      </w:r>
+      <w:r>
+        <w:rPr>
+          <w:rFonts w:ascii="Courier New" w:eastAsia="Times New Roman" w:hAnsi="Courier New" w:cs="Courier New"/>
+          <w:color w:val="BCBEC4"/>
+          <w:sz w:val="20"/>
+          <w:szCs w:val="20"/>
+          <w:lang w:eastAsia="pt-BR"/>
+        </w:rPr>
+        <w:t>Cliente obj) {</w:t>
+      </w:r>
+      <w:r>
+        <w:rPr>
+          <w:rFonts w:ascii="Courier New" w:eastAsia="Times New Roman" w:hAnsi="Courier New" w:cs="Courier New"/>
+          <w:color w:val="BCBEC4"/>
+          <w:sz w:val="20"/>
+          <w:szCs w:val="20"/>
+          <w:lang w:eastAsia="pt-BR"/>
+        </w:rPr>
+        <w:br/>
+        <w:t xml:space="preserve">    </w:t>
+      </w:r>
+      <w:r>
+        <w:rPr>
+          <w:rFonts w:ascii="Courier New" w:eastAsia="Times New Roman" w:hAnsi="Courier New" w:cs="Courier New"/>
+          <w:color w:val="CF8E6D"/>
+          <w:sz w:val="20"/>
+          <w:szCs w:val="20"/>
+          <w:lang w:eastAsia="pt-BR"/>
+        </w:rPr>
+        <w:t xml:space="preserve">return </w:t>
+      </w:r>
+      <w:r>
+        <w:rPr>
+          <w:rFonts w:ascii="Courier New" w:eastAsia="Times New Roman" w:hAnsi="Courier New" w:cs="Courier New"/>
+          <w:color w:val="BCBEC4"/>
+          <w:sz w:val="20"/>
+          <w:szCs w:val="20"/>
+          <w:lang w:eastAsia="pt-BR"/>
+        </w:rPr>
+        <w:t>ResponseEntity.</w:t>
+      </w:r>
+      <w:r>
+        <w:rPr>
+          <w:rFonts w:ascii="Courier New" w:eastAsia="Times New Roman" w:hAnsi="Courier New" w:cs="Courier New"/>
+          <w:i/>
+          <w:iCs/>
+          <w:color w:val="BCBEC4"/>
+          <w:sz w:val="20"/>
+          <w:szCs w:val="20"/>
+          <w:lang w:eastAsia="pt-BR"/>
+        </w:rPr>
+        <w:t>status</w:t>
+      </w:r>
+      <w:r>
+        <w:rPr>
+          <w:rFonts w:ascii="Courier New" w:eastAsia="Times New Roman" w:hAnsi="Courier New" w:cs="Courier New"/>
+          <w:color w:val="BCBEC4"/>
+          <w:sz w:val="20"/>
+          <w:szCs w:val="20"/>
+          <w:lang w:eastAsia="pt-BR"/>
+        </w:rPr>
+        <w:t>(HttpStatus.</w:t>
+      </w:r>
+      <w:r>
+        <w:rPr>
+          <w:rFonts w:ascii="Courier New" w:eastAsia="Times New Roman" w:hAnsi="Courier New" w:cs="Courier New"/>
+          <w:i/>
+          <w:iCs/>
+          <w:color w:val="C77DBB"/>
+          <w:sz w:val="20"/>
+          <w:szCs w:val="20"/>
+          <w:lang w:eastAsia="pt-BR"/>
+        </w:rPr>
+        <w:t>CREATED</w:t>
+      </w:r>
+      <w:r>
+        <w:rPr>
+          <w:rFonts w:ascii="Courier New" w:eastAsia="Times New Roman" w:hAnsi="Courier New" w:cs="Courier New"/>
+          <w:color w:val="BCBEC4"/>
+          <w:sz w:val="20"/>
+          <w:szCs w:val="20"/>
+          <w:lang w:eastAsia="pt-BR"/>
+        </w:rPr>
+        <w:t>).body(</w:t>
+      </w:r>
+      <w:r>
+        <w:rPr>
+          <w:rFonts w:ascii="Courier New" w:eastAsia="Times New Roman" w:hAnsi="Courier New" w:cs="Courier New"/>
+          <w:color w:val="C77DBB"/>
+          <w:sz w:val="20"/>
+          <w:szCs w:val="20"/>
+          <w:lang w:eastAsia="pt-BR"/>
+        </w:rPr>
+        <w:t>service</w:t>
+      </w:r>
+      <w:r>
+        <w:rPr>
+          <w:rFonts w:ascii="Courier New" w:eastAsia="Times New Roman" w:hAnsi="Courier New" w:cs="Courier New"/>
+          <w:color w:val="BCBEC4"/>
+          <w:sz w:val="20"/>
+          <w:szCs w:val="20"/>
+          <w:lang w:eastAsia="pt-BR"/>
+        </w:rPr>
+        <w:t>.create(obj));</w:t>
+      </w:r>
+      <w:r>
+        <w:rPr>
+          <w:rFonts w:ascii="Courier New" w:eastAsia="Times New Roman" w:hAnsi="Courier New" w:cs="Courier New"/>
+          <w:color w:val="BCBEC4"/>
+          <w:sz w:val="20"/>
+          <w:szCs w:val="20"/>
+          <w:lang w:eastAsia="pt-BR"/>
+        </w:rPr>
+        <w:br/>
+        <w:t>}</w:t>
+      </w:r>
+    </w:p>
+    <w:p/>
+    <w:p>
+      <w:pPr>
+        <w:rPr>
+          <w:b/>
+          <w:bCs/>
+        </w:rPr>
+      </w:pPr>
+      <w:r>
+        <w:rPr>
+          <w:b/>
+          <w:bCs/>
+        </w:rPr>
+        <w:t>POSTMAN</w:t>
+      </w:r>
+    </w:p>
+    <w:p>
+      <w:pPr>
+        <w:pStyle w:val="Imagem"/>
+      </w:pPr>
+      <w:r>
+        <w:drawing>
+          <wp:inline distT="0" distB="0" distL="0" distR="0" wp14:anchorId="23FF9878" wp14:editId="2EFFEE03">
+            <wp:extent cx="4511615" cy="3062716"/>
+            <wp:effectExtent l="0" t="0" r="3810" b="4445"/>
+            <wp:docPr id="34" name="Imagem 34"/>
+            <wp:cNvGraphicFramePr>
+              <a:graphicFrameLocks xmlns:a="http://schemas.openxmlformats.org/drawingml/2006/main" noChangeAspect="1"/>
+            </wp:cNvGraphicFramePr>
+            <a:graphic xmlns:a="http://schemas.openxmlformats.org/drawingml/2006/main">
+              <a:graphicData uri="http://schemas.openxmlformats.org/drawingml/2006/picture">
+                <pic:pic xmlns:pic="http://schemas.openxmlformats.org/drawingml/2006/picture">
+                  <pic:nvPicPr>
+                    <pic:cNvPr id="1" name=""/>
+                    <pic:cNvPicPr/>
+                  </pic:nvPicPr>
+                  <pic:blipFill>
+                    <a:blip r:embed="rId8"/>
+                    <a:stretch>
+                      <a:fillRect/>
+                    </a:stretch>
+                  </pic:blipFill>
+                  <pic:spPr>
+                    <a:xfrm>
+                      <a:off x="0" y="0"/>
+                      <a:ext cx="4520651" cy="3068850"/>
+                    </a:xfrm>
+                    <a:prstGeom prst="rect">
+                      <a:avLst/>
+                    </a:prstGeom>
+                  </pic:spPr>
+                </pic:pic>
+              </a:graphicData>
+            </a:graphic>
+          </wp:inline>
+        </w:drawing>
+      </w:r>
+    </w:p>
+    <w:p>
+      <w:pPr>
+        <w:pStyle w:val="PargrafodaLista"/>
+        <w:numPr>
+          <w:ilvl w:val="0"/>
+          <w:numId w:val="12"/>
+        </w:numPr>
+      </w:pPr>
+      <w:r>
+        <w:t>PUT</w:t>
+      </w:r>
+    </w:p>
+    <w:p>
+      <w:pPr>
+        <w:pStyle w:val="PargrafodaLista"/>
+      </w:pPr>
+      <w:r>
+        <w:t>Usado para ATUALIZAR dados de um recurso no servidor, geralmente através de um ID</w:t>
+      </w:r>
+      <w:r>
+        <w:t>.</w:t>
+      </w:r>
+    </w:p>
+    <w:p>
+      <w:pPr>
+        <w:shd w:val="clear" w:color="auto" w:fill="1E1F22"/>
+        <w:tabs>
+          <w:tab w:val="left" w:pos="916"/>
+          <w:tab w:val="left" w:pos="1832"/>
+          <w:tab w:val="left" w:pos="2748"/>
+          <w:tab w:val="left" w:pos="3664"/>
+          <w:tab w:val="left" w:pos="4580"/>
+          <w:tab w:val="left" w:pos="5496"/>
+          <w:tab w:val="left" w:pos="6412"/>
+          <w:tab w:val="left" w:pos="7328"/>
+          <w:tab w:val="left" w:pos="8244"/>
+          <w:tab w:val="left" w:pos="9160"/>
+          <w:tab w:val="left" w:pos="10076"/>
+          <w:tab w:val="left" w:pos="10992"/>
+          <w:tab w:val="left" w:pos="11908"/>
+          <w:tab w:val="left" w:pos="12824"/>
+          <w:tab w:val="left" w:pos="13740"/>
+          <w:tab w:val="left" w:pos="14656"/>
+        </w:tabs>
+        <w:spacing w:line="240" w:lineRule="auto"/>
+        <w:rPr>
+          <w:rFonts w:ascii="Courier New" w:eastAsia="Times New Roman" w:hAnsi="Courier New" w:cs="Courier New"/>
+          <w:color w:val="BCBEC4"/>
+          <w:sz w:val="20"/>
+          <w:szCs w:val="20"/>
+          <w:lang w:eastAsia="pt-BR"/>
+        </w:rPr>
+      </w:pPr>
+      <w:r>
+        <w:rPr>
+          <w:rFonts w:ascii="Courier New" w:eastAsia="Times New Roman" w:hAnsi="Courier New" w:cs="Courier New"/>
+          <w:color w:val="008400"/>
+          <w:sz w:val="20"/>
+          <w:szCs w:val="20"/>
+          <w:lang w:eastAsia="pt-BR"/>
+        </w:rPr>
+        <w:t>// PUT - Atualiza um Cliente através do id</w:t>
+      </w:r>
+      <w:r>
+        <w:rPr>
+          <w:rFonts w:ascii="Courier New" w:eastAsia="Times New Roman" w:hAnsi="Courier New" w:cs="Courier New"/>
+          <w:color w:val="008400"/>
+          <w:sz w:val="20"/>
+          <w:szCs w:val="20"/>
+          <w:lang w:eastAsia="pt-BR"/>
+        </w:rPr>
+        <w:br/>
+      </w:r>
+      <w:r>
+        <w:rPr>
+          <w:rFonts w:ascii="Courier New" w:eastAsia="Times New Roman" w:hAnsi="Courier New" w:cs="Courier New"/>
+          <w:color w:val="B3AE60"/>
+          <w:sz w:val="20"/>
+          <w:szCs w:val="20"/>
+          <w:lang w:eastAsia="pt-BR"/>
+        </w:rPr>
+        <w:t>@PutMapping</w:t>
+      </w:r>
+      <w:r>
+        <w:rPr>
+          <w:rFonts w:ascii="Courier New" w:eastAsia="Times New Roman" w:hAnsi="Courier New" w:cs="Courier New"/>
+          <w:color w:val="BCBEC4"/>
+          <w:sz w:val="20"/>
+          <w:szCs w:val="20"/>
+          <w:lang w:eastAsia="pt-BR"/>
+        </w:rPr>
+        <w:t xml:space="preserve">(value = </w:t>
+      </w:r>
+      <w:r>
+        <w:rPr>
+          <w:rFonts w:ascii="Courier New" w:eastAsia="Times New Roman" w:hAnsi="Courier New" w:cs="Courier New"/>
+          <w:color w:val="6AAB73"/>
+          <w:sz w:val="20"/>
+          <w:szCs w:val="20"/>
+          <w:lang w:eastAsia="pt-BR"/>
+        </w:rPr>
+        <w:t>"/{id}"</w:t>
+      </w:r>
+      <w:r>
+        <w:rPr>
+          <w:rFonts w:ascii="Courier New" w:eastAsia="Times New Roman" w:hAnsi="Courier New" w:cs="Courier New"/>
+          <w:color w:val="BCBEC4"/>
+          <w:sz w:val="20"/>
+          <w:szCs w:val="20"/>
+          <w:lang w:eastAsia="pt-BR"/>
+        </w:rPr>
+        <w:t>)</w:t>
+      </w:r>
+      <w:r>
+        <w:rPr>
+          <w:rFonts w:ascii="Courier New" w:eastAsia="Times New Roman" w:hAnsi="Courier New" w:cs="Courier New"/>
+          <w:color w:val="BCBEC4"/>
+          <w:sz w:val="20"/>
+          <w:szCs w:val="20"/>
+          <w:lang w:eastAsia="pt-BR"/>
+        </w:rPr>
+        <w:br/>
+      </w:r>
+      <w:r>
+        <w:rPr>
+          <w:rFonts w:ascii="Courier New" w:eastAsia="Times New Roman" w:hAnsi="Courier New" w:cs="Courier New"/>
+          <w:color w:val="CF8E6D"/>
+          <w:sz w:val="20"/>
+          <w:szCs w:val="20"/>
+          <w:lang w:eastAsia="pt-BR"/>
+        </w:rPr>
+        <w:t xml:space="preserve">public </w:t>
+      </w:r>
+      <w:r>
+        <w:rPr>
+          <w:rFonts w:ascii="Courier New" w:eastAsia="Times New Roman" w:hAnsi="Courier New" w:cs="Courier New"/>
+          <w:color w:val="BCBEC4"/>
+          <w:sz w:val="20"/>
+          <w:szCs w:val="20"/>
+          <w:lang w:eastAsia="pt-BR"/>
+        </w:rPr>
+        <w:t xml:space="preserve">ResponseEntity&lt;Cliente&gt; </w:t>
+      </w:r>
+      <w:r>
+        <w:rPr>
+          <w:rFonts w:ascii="Courier New" w:eastAsia="Times New Roman" w:hAnsi="Courier New" w:cs="Courier New"/>
+          <w:color w:val="56A8F5"/>
+          <w:sz w:val="20"/>
+          <w:szCs w:val="20"/>
+          <w:lang w:eastAsia="pt-BR"/>
+        </w:rPr>
+        <w:t>update</w:t>
+      </w:r>
+      <w:r>
+        <w:rPr>
+          <w:rFonts w:ascii="Courier New" w:eastAsia="Times New Roman" w:hAnsi="Courier New" w:cs="Courier New"/>
+          <w:color w:val="BCBEC4"/>
+          <w:sz w:val="20"/>
+          <w:szCs w:val="20"/>
+          <w:lang w:eastAsia="pt-BR"/>
+        </w:rPr>
+        <w:t>(</w:t>
+      </w:r>
+      <w:r>
+        <w:rPr>
+          <w:rFonts w:ascii="Courier New" w:eastAsia="Times New Roman" w:hAnsi="Courier New" w:cs="Courier New"/>
+          <w:color w:val="B3AE60"/>
+          <w:sz w:val="20"/>
+          <w:szCs w:val="20"/>
+          <w:lang w:eastAsia="pt-BR"/>
+        </w:rPr>
+        <w:t xml:space="preserve">@PathVariable </w:t>
+      </w:r>
+      <w:r>
+        <w:rPr>
+          <w:rFonts w:ascii="Courier New" w:eastAsia="Times New Roman" w:hAnsi="Courier New" w:cs="Courier New"/>
+          <w:color w:val="BCBEC4"/>
+          <w:sz w:val="20"/>
+          <w:szCs w:val="20"/>
+          <w:lang w:eastAsia="pt-BR"/>
+        </w:rPr>
+        <w:t xml:space="preserve">Long id, </w:t>
+      </w:r>
+      <w:r>
+        <w:rPr>
+          <w:rFonts w:ascii="Courier New" w:eastAsia="Times New Roman" w:hAnsi="Courier New" w:cs="Courier New"/>
+          <w:color w:val="B3AE60"/>
+          <w:sz w:val="20"/>
+          <w:szCs w:val="20"/>
+          <w:lang w:eastAsia="pt-BR"/>
+        </w:rPr>
+        <w:t xml:space="preserve">@RequestBody </w:t>
+      </w:r>
+      <w:r>
+        <w:rPr>
+          <w:rFonts w:ascii="Courier New" w:eastAsia="Times New Roman" w:hAnsi="Courier New" w:cs="Courier New"/>
+          <w:color w:val="BCBEC4"/>
+          <w:sz w:val="20"/>
+          <w:szCs w:val="20"/>
+          <w:lang w:eastAsia="pt-BR"/>
+        </w:rPr>
+        <w:t>Cliente obj) {</w:t>
+      </w:r>
+      <w:r>
+        <w:rPr>
+          <w:rFonts w:ascii="Courier New" w:eastAsia="Times New Roman" w:hAnsi="Courier New" w:cs="Courier New"/>
+          <w:color w:val="BCBEC4"/>
+          <w:sz w:val="20"/>
+          <w:szCs w:val="20"/>
+          <w:lang w:eastAsia="pt-BR"/>
+        </w:rPr>
+        <w:br/>
+        <w:t xml:space="preserve">    obj.setId(id);</w:t>
+      </w:r>
+      <w:r>
+        <w:rPr>
+          <w:rFonts w:ascii="Courier New" w:eastAsia="Times New Roman" w:hAnsi="Courier New" w:cs="Courier New"/>
+          <w:color w:val="BCBEC4"/>
+          <w:sz w:val="20"/>
+          <w:szCs w:val="20"/>
+          <w:lang w:eastAsia="pt-BR"/>
+        </w:rPr>
+        <w:br/>
+        <w:t xml:space="preserve">    </w:t>
+      </w:r>
+      <w:r>
+        <w:rPr>
+          <w:rFonts w:ascii="Courier New" w:eastAsia="Times New Roman" w:hAnsi="Courier New" w:cs="Courier New"/>
+          <w:color w:val="CF8E6D"/>
+          <w:sz w:val="20"/>
+          <w:szCs w:val="20"/>
+          <w:lang w:eastAsia="pt-BR"/>
+        </w:rPr>
+        <w:t xml:space="preserve">return </w:t>
+      </w:r>
+      <w:r>
+        <w:rPr>
+          <w:rFonts w:ascii="Courier New" w:eastAsia="Times New Roman" w:hAnsi="Courier New" w:cs="Courier New"/>
+          <w:color w:val="BCBEC4"/>
+          <w:sz w:val="20"/>
+          <w:szCs w:val="20"/>
+          <w:lang w:eastAsia="pt-BR"/>
+        </w:rPr>
+        <w:t>ResponseEntity.</w:t>
+      </w:r>
+      <w:r>
+        <w:rPr>
+          <w:rFonts w:ascii="Courier New" w:eastAsia="Times New Roman" w:hAnsi="Courier New" w:cs="Courier New"/>
+          <w:i/>
+          <w:iCs/>
+          <w:color w:val="BCBEC4"/>
+          <w:sz w:val="20"/>
+          <w:szCs w:val="20"/>
+          <w:lang w:eastAsia="pt-BR"/>
+        </w:rPr>
+        <w:t>ok</w:t>
+      </w:r>
+      <w:r>
+        <w:rPr>
+          <w:rFonts w:ascii="Courier New" w:eastAsia="Times New Roman" w:hAnsi="Courier New" w:cs="Courier New"/>
+          <w:color w:val="BCBEC4"/>
+          <w:sz w:val="20"/>
+          <w:szCs w:val="20"/>
+          <w:lang w:eastAsia="pt-BR"/>
+        </w:rPr>
+        <w:t>().body(</w:t>
+      </w:r>
+      <w:r>
+        <w:rPr>
+          <w:rFonts w:ascii="Courier New" w:eastAsia="Times New Roman" w:hAnsi="Courier New" w:cs="Courier New"/>
+          <w:color w:val="C77DBB"/>
+          <w:sz w:val="20"/>
+          <w:szCs w:val="20"/>
+          <w:lang w:eastAsia="pt-BR"/>
+        </w:rPr>
+        <w:t>service</w:t>
+      </w:r>
+      <w:r>
+        <w:rPr>
+          <w:rFonts w:ascii="Courier New" w:eastAsia="Times New Roman" w:hAnsi="Courier New" w:cs="Courier New"/>
+          <w:color w:val="BCBEC4"/>
+          <w:sz w:val="20"/>
+          <w:szCs w:val="20"/>
+          <w:lang w:eastAsia="pt-BR"/>
+        </w:rPr>
+        <w:t>.update(obj));</w:t>
+      </w:r>
+      <w:r>
+        <w:rPr>
+          <w:rFonts w:ascii="Courier New" w:eastAsia="Times New Roman" w:hAnsi="Courier New" w:cs="Courier New"/>
+          <w:color w:val="BCBEC4"/>
+          <w:sz w:val="20"/>
+          <w:szCs w:val="20"/>
+          <w:lang w:eastAsia="pt-BR"/>
+        </w:rPr>
+        <w:br/>
+        <w:t>}</w:t>
+      </w:r>
+    </w:p>
+    <w:p/>
+    <w:p>
+      <w:pPr>
+        <w:rPr>
+          <w:b/>
+          <w:bCs/>
+        </w:rPr>
+      </w:pPr>
+      <w:r>
+        <w:rPr>
+          <w:b/>
+          <w:bCs/>
+        </w:rPr>
+        <w:t>POSTMAN</w:t>
+      </w:r>
+    </w:p>
+    <w:p>
+      <w:pPr>
+        <w:pStyle w:val="Imagem"/>
+      </w:pPr>
+      <w:r>
+        <w:drawing>
+          <wp:inline distT="0" distB="0" distL="0" distR="0" wp14:anchorId="12FA93BD" wp14:editId="49FF94D4">
+            <wp:extent cx="4623758" cy="2947624"/>
+            <wp:effectExtent l="0" t="0" r="5715" b="5715"/>
+            <wp:docPr id="35" name="Imagem 35"/>
+            <wp:cNvGraphicFramePr>
+              <a:graphicFrameLocks xmlns:a="http://schemas.openxmlformats.org/drawingml/2006/main" noChangeAspect="1"/>
+            </wp:cNvGraphicFramePr>
+            <a:graphic xmlns:a="http://schemas.openxmlformats.org/drawingml/2006/main">
+              <a:graphicData uri="http://schemas.openxmlformats.org/drawingml/2006/picture">
+                <pic:pic xmlns:pic="http://schemas.openxmlformats.org/drawingml/2006/picture">
+                  <pic:nvPicPr>
+                    <pic:cNvPr id="1" name=""/>
+                    <pic:cNvPicPr/>
+                  </pic:nvPicPr>
+                  <pic:blipFill>
+                    <a:blip r:embed="rId9"/>
+                    <a:stretch>
+                      <a:fillRect/>
+                    </a:stretch>
+                  </pic:blipFill>
+                  <pic:spPr>
+                    <a:xfrm>
+                      <a:off x="0" y="0"/>
+                      <a:ext cx="4638191" cy="2956825"/>
+                    </a:xfrm>
+                    <a:prstGeom prst="rect">
+                      <a:avLst/>
+                    </a:prstGeom>
+                  </pic:spPr>
+                </pic:pic>
+              </a:graphicData>
+            </a:graphic>
+          </wp:inline>
+        </w:drawing>
+      </w:r>
+    </w:p>
+    <w:p>
+      <w:pPr>
+        <w:pStyle w:val="PargrafodaLista"/>
+        <w:numPr>
+          <w:ilvl w:val="0"/>
+          <w:numId w:val="12"/>
+        </w:numPr>
+      </w:pPr>
+      <w:r>
+        <w:lastRenderedPageBreak/>
+        <w:t>DELETE</w:t>
+      </w:r>
+    </w:p>
+    <w:p>
+      <w:pPr>
+        <w:pStyle w:val="PargrafodaLista"/>
+      </w:pPr>
+      <w:r>
+        <w:t>Usado para DELETAR um recurso no servidor, geralmente através de um ID</w:t>
+      </w:r>
+      <w:r>
+        <w:t>.</w:t>
+      </w:r>
+    </w:p>
+    <w:p>
+      <w:pPr>
+        <w:shd w:val="clear" w:color="auto" w:fill="1E1F22"/>
+        <w:tabs>
+          <w:tab w:val="left" w:pos="916"/>
+          <w:tab w:val="left" w:pos="1832"/>
+          <w:tab w:val="left" w:pos="2748"/>
+          <w:tab w:val="left" w:pos="3664"/>
+          <w:tab w:val="left" w:pos="4580"/>
+          <w:tab w:val="left" w:pos="5496"/>
+          <w:tab w:val="left" w:pos="6412"/>
+          <w:tab w:val="left" w:pos="7328"/>
+          <w:tab w:val="left" w:pos="8244"/>
+          <w:tab w:val="left" w:pos="9160"/>
+          <w:tab w:val="left" w:pos="10076"/>
+          <w:tab w:val="left" w:pos="10992"/>
+          <w:tab w:val="left" w:pos="11908"/>
+          <w:tab w:val="left" w:pos="12824"/>
+          <w:tab w:val="left" w:pos="13740"/>
+          <w:tab w:val="left" w:pos="14656"/>
+        </w:tabs>
+        <w:spacing w:line="240" w:lineRule="auto"/>
+        <w:rPr>
+          <w:rFonts w:ascii="Courier New" w:eastAsia="Times New Roman" w:hAnsi="Courier New" w:cs="Courier New"/>
+          <w:color w:val="BCBEC4"/>
+          <w:sz w:val="20"/>
+          <w:szCs w:val="20"/>
+          <w:lang w:eastAsia="pt-BR"/>
+        </w:rPr>
+      </w:pPr>
+      <w:r>
+        <w:rPr>
+          <w:rFonts w:ascii="Courier New" w:eastAsia="Times New Roman" w:hAnsi="Courier New" w:cs="Courier New"/>
+          <w:color w:val="008400"/>
+          <w:sz w:val="20"/>
+          <w:szCs w:val="20"/>
+          <w:lang w:eastAsia="pt-BR"/>
+        </w:rPr>
+        <w:t>// DELETE - Deleta um Cliente através do id</w:t>
+      </w:r>
+      <w:r>
+        <w:rPr>
+          <w:rFonts w:ascii="Courier New" w:eastAsia="Times New Roman" w:hAnsi="Courier New" w:cs="Courier New"/>
+          <w:color w:val="008400"/>
+          <w:sz w:val="20"/>
+          <w:szCs w:val="20"/>
+          <w:lang w:eastAsia="pt-BR"/>
+        </w:rPr>
+        <w:br/>
+      </w:r>
+      <w:r>
+        <w:rPr>
+          <w:rFonts w:ascii="Courier New" w:eastAsia="Times New Roman" w:hAnsi="Courier New" w:cs="Courier New"/>
+          <w:color w:val="B3AE60"/>
+          <w:sz w:val="20"/>
+          <w:szCs w:val="20"/>
+          <w:lang w:eastAsia="pt-BR"/>
+        </w:rPr>
+        <w:t>@DeleteMapping</w:t>
+      </w:r>
+      <w:r>
+        <w:rPr>
+          <w:rFonts w:ascii="Courier New" w:eastAsia="Times New Roman" w:hAnsi="Courier New" w:cs="Courier New"/>
+          <w:color w:val="BCBEC4"/>
+          <w:sz w:val="20"/>
+          <w:szCs w:val="20"/>
+          <w:lang w:eastAsia="pt-BR"/>
+        </w:rPr>
+        <w:t xml:space="preserve">(value = </w:t>
+      </w:r>
+      <w:r>
+        <w:rPr>
+          <w:rFonts w:ascii="Courier New" w:eastAsia="Times New Roman" w:hAnsi="Courier New" w:cs="Courier New"/>
+          <w:color w:val="6AAB73"/>
+          <w:sz w:val="20"/>
+          <w:szCs w:val="20"/>
+          <w:lang w:eastAsia="pt-BR"/>
+        </w:rPr>
+        <w:t>"/{id}"</w:t>
+      </w:r>
+      <w:r>
+        <w:rPr>
+          <w:rFonts w:ascii="Courier New" w:eastAsia="Times New Roman" w:hAnsi="Courier New" w:cs="Courier New"/>
+          <w:color w:val="BCBEC4"/>
+          <w:sz w:val="20"/>
+          <w:szCs w:val="20"/>
+          <w:lang w:eastAsia="pt-BR"/>
+        </w:rPr>
+        <w:t>)</w:t>
+      </w:r>
+      <w:r>
+        <w:rPr>
+          <w:rFonts w:ascii="Courier New" w:eastAsia="Times New Roman" w:hAnsi="Courier New" w:cs="Courier New"/>
+          <w:color w:val="BCBEC4"/>
+          <w:sz w:val="20"/>
+          <w:szCs w:val="20"/>
+          <w:lang w:eastAsia="pt-BR"/>
+        </w:rPr>
+        <w:br/>
+      </w:r>
+      <w:r>
+        <w:rPr>
+          <w:rFonts w:ascii="Courier New" w:eastAsia="Times New Roman" w:hAnsi="Courier New" w:cs="Courier New"/>
+          <w:color w:val="CF8E6D"/>
+          <w:sz w:val="20"/>
+          <w:szCs w:val="20"/>
+          <w:lang w:eastAsia="pt-BR"/>
+        </w:rPr>
+        <w:t xml:space="preserve">public </w:t>
+      </w:r>
+      <w:r>
+        <w:rPr>
+          <w:rFonts w:ascii="Courier New" w:eastAsia="Times New Roman" w:hAnsi="Courier New" w:cs="Courier New"/>
+          <w:color w:val="BCBEC4"/>
+          <w:sz w:val="20"/>
+          <w:szCs w:val="20"/>
+          <w:lang w:eastAsia="pt-BR"/>
+        </w:rPr>
+        <w:t xml:space="preserve">ResponseEntity&lt;Void&gt; </w:t>
+      </w:r>
+      <w:r>
+        <w:rPr>
+          <w:rFonts w:ascii="Courier New" w:eastAsia="Times New Roman" w:hAnsi="Courier New" w:cs="Courier New"/>
+          <w:color w:val="56A8F5"/>
+          <w:sz w:val="20"/>
+          <w:szCs w:val="20"/>
+          <w:lang w:eastAsia="pt-BR"/>
+        </w:rPr>
+        <w:t>delete</w:t>
+      </w:r>
+      <w:r>
+        <w:rPr>
+          <w:rFonts w:ascii="Courier New" w:eastAsia="Times New Roman" w:hAnsi="Courier New" w:cs="Courier New"/>
+          <w:color w:val="BCBEC4"/>
+          <w:sz w:val="20"/>
+          <w:szCs w:val="20"/>
+          <w:lang w:eastAsia="pt-BR"/>
+        </w:rPr>
+        <w:t>(</w:t>
+      </w:r>
+      <w:r>
+        <w:rPr>
+          <w:rFonts w:ascii="Courier New" w:eastAsia="Times New Roman" w:hAnsi="Courier New" w:cs="Courier New"/>
+          <w:color w:val="B3AE60"/>
+          <w:sz w:val="20"/>
+          <w:szCs w:val="20"/>
+          <w:lang w:eastAsia="pt-BR"/>
+        </w:rPr>
+        <w:t xml:space="preserve">@PathVariable </w:t>
+      </w:r>
+      <w:r>
+        <w:rPr>
+          <w:rFonts w:ascii="Courier New" w:eastAsia="Times New Roman" w:hAnsi="Courier New" w:cs="Courier New"/>
+          <w:color w:val="BCBEC4"/>
+          <w:sz w:val="20"/>
+          <w:szCs w:val="20"/>
+          <w:lang w:eastAsia="pt-BR"/>
+        </w:rPr>
+        <w:t>Long id) {</w:t>
+      </w:r>
+      <w:r>
+        <w:rPr>
+          <w:rFonts w:ascii="Courier New" w:eastAsia="Times New Roman" w:hAnsi="Courier New" w:cs="Courier New"/>
+          <w:color w:val="BCBEC4"/>
+          <w:sz w:val="20"/>
+          <w:szCs w:val="20"/>
+          <w:lang w:eastAsia="pt-BR"/>
+        </w:rPr>
+        <w:br/>
+        <w:t xml:space="preserve">    </w:t>
+      </w:r>
+      <w:r>
+        <w:rPr>
+          <w:rFonts w:ascii="Courier New" w:eastAsia="Times New Roman" w:hAnsi="Courier New" w:cs="Courier New"/>
+          <w:color w:val="C77DBB"/>
+          <w:sz w:val="20"/>
+          <w:szCs w:val="20"/>
+          <w:lang w:eastAsia="pt-BR"/>
+        </w:rPr>
+        <w:t>service</w:t>
+      </w:r>
+      <w:r>
+        <w:rPr>
+          <w:rFonts w:ascii="Courier New" w:eastAsia="Times New Roman" w:hAnsi="Courier New" w:cs="Courier New"/>
+          <w:color w:val="BCBEC4"/>
+          <w:sz w:val="20"/>
+          <w:szCs w:val="20"/>
+          <w:lang w:eastAsia="pt-BR"/>
+        </w:rPr>
+        <w:t>.delete(id);</w:t>
+      </w:r>
+      <w:r>
+        <w:rPr>
+          <w:rFonts w:ascii="Courier New" w:eastAsia="Times New Roman" w:hAnsi="Courier New" w:cs="Courier New"/>
+          <w:color w:val="BCBEC4"/>
+          <w:sz w:val="20"/>
+          <w:szCs w:val="20"/>
+          <w:lang w:eastAsia="pt-BR"/>
+        </w:rPr>
+        <w:br/>
+        <w:t xml:space="preserve">    </w:t>
+      </w:r>
+      <w:r>
+        <w:rPr>
+          <w:rFonts w:ascii="Courier New" w:eastAsia="Times New Roman" w:hAnsi="Courier New" w:cs="Courier New"/>
+          <w:color w:val="CF8E6D"/>
+          <w:sz w:val="20"/>
+          <w:szCs w:val="20"/>
+          <w:lang w:eastAsia="pt-BR"/>
+        </w:rPr>
+        <w:t xml:space="preserve">return </w:t>
+      </w:r>
+      <w:r>
+        <w:rPr>
+          <w:rFonts w:ascii="Courier New" w:eastAsia="Times New Roman" w:hAnsi="Courier New" w:cs="Courier New"/>
+          <w:color w:val="BCBEC4"/>
+          <w:sz w:val="20"/>
+          <w:szCs w:val="20"/>
+          <w:lang w:eastAsia="pt-BR"/>
+        </w:rPr>
+        <w:t>ResponseEntity.</w:t>
+      </w:r>
+      <w:r>
+        <w:rPr>
+          <w:rFonts w:ascii="Courier New" w:eastAsia="Times New Roman" w:hAnsi="Courier New" w:cs="Courier New"/>
+          <w:i/>
+          <w:iCs/>
+          <w:color w:val="BCBEC4"/>
+          <w:sz w:val="20"/>
+          <w:szCs w:val="20"/>
+          <w:lang w:eastAsia="pt-BR"/>
+        </w:rPr>
+        <w:t>noContent</w:t>
+      </w:r>
+      <w:r>
+        <w:rPr>
+          <w:rFonts w:ascii="Courier New" w:eastAsia="Times New Roman" w:hAnsi="Courier New" w:cs="Courier New"/>
+          <w:color w:val="BCBEC4"/>
+          <w:sz w:val="20"/>
+          <w:szCs w:val="20"/>
+          <w:lang w:eastAsia="pt-BR"/>
+        </w:rPr>
+        <w:t>().build();</w:t>
+      </w:r>
+      <w:r>
+        <w:rPr>
+          <w:rFonts w:ascii="Courier New" w:eastAsia="Times New Roman" w:hAnsi="Courier New" w:cs="Courier New"/>
+          <w:color w:val="BCBEC4"/>
+          <w:sz w:val="20"/>
+          <w:szCs w:val="20"/>
+          <w:lang w:eastAsia="pt-BR"/>
+        </w:rPr>
+        <w:br/>
+        <w:t>}</w:t>
+      </w:r>
+    </w:p>
+    <w:p/>
+    <w:p>
+      <w:pPr>
+        <w:rPr>
+          <w:b/>
+          <w:bCs/>
+        </w:rPr>
+      </w:pPr>
+      <w:r>
+        <w:rPr>
+          <w:b/>
+          <w:bCs/>
+        </w:rPr>
+        <w:t>POSTMAN</w:t>
+      </w:r>
+    </w:p>
+    <w:p>
+      <w:r>
+        <w:drawing>
+          <wp:inline distT="0" distB="0" distL="0" distR="0" wp14:anchorId="10F9E5F4" wp14:editId="0626EE19">
+            <wp:extent cx="6479540" cy="5032375"/>
+            <wp:effectExtent l="0" t="0" r="0" b="0"/>
+            <wp:docPr id="36" name="Imagem 36"/>
+            <wp:cNvGraphicFramePr>
+              <a:graphicFrameLocks xmlns:a="http://schemas.openxmlformats.org/drawingml/2006/main" noChangeAspect="1"/>
+            </wp:cNvGraphicFramePr>
+            <a:graphic xmlns:a="http://schemas.openxmlformats.org/drawingml/2006/main">
+              <a:graphicData uri="http://schemas.openxmlformats.org/drawingml/2006/picture">
+                <pic:pic xmlns:pic="http://schemas.openxmlformats.org/drawingml/2006/picture">
+                  <pic:nvPicPr>
+                    <pic:cNvPr id="1" name=""/>
+                    <pic:cNvPicPr/>
+                  </pic:nvPicPr>
+                  <pic:blipFill>
+                    <a:blip r:embed="rId10"/>
+                    <a:stretch>
+                      <a:fillRect/>
+                    </a:stretch>
+                  </pic:blipFill>
+                  <pic:spPr>
+                    <a:xfrm>
+                      <a:off x="0" y="0"/>
+                      <a:ext cx="6479540" cy="5032375"/>
+                    </a:xfrm>
+                    <a:prstGeom prst="rect">
+                      <a:avLst/>
+                    </a:prstGeom>
+                  </pic:spPr>
+                </pic:pic>
+              </a:graphicData>
+            </a:graphic>
+          </wp:inline>
+        </w:drawing>
+      </w:r>
+    </w:p>
+    <w:p>
+      <w:pPr>
+        <w:pStyle w:val="Ttulo1"/>
+      </w:pPr>
+      <w:r>
+        <w:t>Quais as principais semelhanças entre os bancos de dados Redis e MongoDB?</w:t>
+      </w:r>
+    </w:p>
+    <w:p>
+      <w:r>
+        <w:t>Redis e MongoDB são NoSQL, flexíveis, escaláveis, de alta performance, replicáveis e bem integrados a ecossistemas modernos, embora cada um seja otimizado para um caso de uso diferente</w:t>
+      </w:r>
+      <w:r>
+        <w:t xml:space="preserve"> (</w:t>
+      </w:r>
+      <w:r>
+        <w:t>Redis</w:t>
+      </w:r>
+      <w:r>
+        <w:t xml:space="preserve">: </w:t>
+      </w:r>
+      <w:r>
+        <w:t xml:space="preserve"> mais voltado para cache e dados temporários</w:t>
+      </w:r>
+      <w:r>
+        <w:t xml:space="preserve"> e </w:t>
+      </w:r>
+      <w:r>
+        <w:t>MongoDB mais para armazenamento persistente de documentos</w:t>
+      </w:r>
+      <w:r>
+        <w:t>).</w:t>
+      </w:r>
+    </w:p>
+    <w:p>
+      <w:pPr>
+        <w:pStyle w:val="PargrafodaLista"/>
+        <w:numPr>
+          <w:ilvl w:val="0"/>
+          <w:numId w:val="12"/>
+        </w:numPr>
+        <w:rPr>
+          <w:b/>
+          <w:bCs/>
+        </w:rPr>
+      </w:pPr>
+      <w:r>
+        <w:rPr>
+          <w:b/>
+          <w:bCs/>
+        </w:rPr>
+        <w:t>NoSQL</w:t>
+      </w:r>
+    </w:p>
+    <w:p>
+      <w:r>
+        <w:t>Ambos são classificados como bancos de dados NoSQL, ou seja, não seguem rigidamente o modelo relacional tradicional (tabelas, linhas, colunas).</w:t>
+      </w:r>
+    </w:p>
+    <w:p>
+      <w:pPr>
+        <w:pStyle w:val="PargrafodaLista"/>
+        <w:numPr>
+          <w:ilvl w:val="0"/>
+          <w:numId w:val="12"/>
+        </w:numPr>
+        <w:rPr>
+          <w:b/>
+          <w:bCs/>
+        </w:rPr>
+      </w:pPr>
+      <w:r>
+        <w:rPr>
+          <w:b/>
+          <w:bCs/>
+        </w:rPr>
+        <w:t>Alta performance</w:t>
+      </w:r>
+    </w:p>
+    <w:p>
+      <w:r>
+        <w:t>Foram projetados para alta velocidade em operações de leitura e escrita</w:t>
+      </w:r>
+      <w:r>
+        <w:t xml:space="preserve">, </w:t>
+      </w:r>
+      <w:r>
+        <w:t>Redis principalmente em memória</w:t>
+      </w:r>
+      <w:r>
+        <w:t xml:space="preserve"> e </w:t>
+      </w:r>
+    </w:p>
+    <w:p>
+      <w:r>
+        <w:t xml:space="preserve">MongoDB </w:t>
+      </w:r>
+      <w:r>
+        <w:t xml:space="preserve">com grandes volumes de </w:t>
+      </w:r>
+      <w:r>
+        <w:t>documentos</w:t>
+      </w:r>
+      <w:r>
+        <w:t xml:space="preserve"> principalmente</w:t>
+      </w:r>
+      <w:r>
+        <w:t>.</w:t>
+      </w:r>
+    </w:p>
+    <w:p>
+      <w:pPr>
+        <w:pStyle w:val="PargrafodaLista"/>
+        <w:numPr>
+          <w:ilvl w:val="0"/>
+          <w:numId w:val="12"/>
+        </w:numPr>
+        <w:rPr>
+          <w:b/>
+          <w:bCs/>
+        </w:rPr>
+      </w:pPr>
+      <w:r>
+        <w:rPr>
+          <w:b/>
+          <w:bCs/>
+        </w:rPr>
+        <w:t>Escalabilidade horizontal</w:t>
+      </w:r>
+    </w:p>
+    <w:p>
+      <w:r>
+        <w:lastRenderedPageBreak/>
+        <w:t>Tanto Redis quanto MongoDB oferecem mecanismos de sharding (particionamento de dados) e replicação, permitindo escalar para lidar com grandes quantidades de dados e múltiplos usuários simultâneos.</w:t>
+      </w:r>
+    </w:p>
+    <w:p>
+      <w:pPr>
+        <w:pStyle w:val="PargrafodaLista"/>
+        <w:numPr>
+          <w:ilvl w:val="0"/>
+          <w:numId w:val="12"/>
+        </w:numPr>
+        <w:rPr>
+          <w:b/>
+          <w:bCs/>
+        </w:rPr>
+      </w:pPr>
+      <w:r>
+        <w:rPr>
+          <w:b/>
+          <w:bCs/>
+        </w:rPr>
+        <w:t>Suporte a dados flexíveis</w:t>
+      </w:r>
+    </w:p>
+    <w:p>
+      <w:r>
+        <w:t>A</w:t>
+      </w:r>
+      <w:r>
+        <w:t>mbos permitem maior flexibilidade do que bancos SQL rígidos</w:t>
+      </w:r>
+      <w:r>
+        <w:t xml:space="preserve"> trabalhando com: </w:t>
+      </w:r>
+    </w:p>
+    <w:p>
+      <w:pPr>
+        <w:pStyle w:val="PargrafodaLista"/>
+        <w:numPr>
+          <w:ilvl w:val="0"/>
+          <w:numId w:val="12"/>
+        </w:numPr>
+        <w:rPr>
+          <w:b/>
+          <w:bCs/>
+        </w:rPr>
+      </w:pPr>
+      <w:r>
+        <w:rPr>
+          <w:b/>
+          <w:bCs/>
+        </w:rPr>
+        <w:t>Open Source e grande comunidade</w:t>
+      </w:r>
+    </w:p>
+    <w:p>
+      <w:r>
+        <w:t>Ambos têm versões open source e versões enterprise, além de ampla documentação e suporte em comunidades.</w:t>
+      </w:r>
+    </w:p>
+    <w:p>
+      <w:pPr>
+        <w:pStyle w:val="PargrafodaLista"/>
+        <w:numPr>
+          <w:ilvl w:val="0"/>
+          <w:numId w:val="12"/>
+        </w:numPr>
+        <w:rPr>
+          <w:b/>
+          <w:bCs/>
+        </w:rPr>
+      </w:pPr>
+      <w:r>
+        <w:rPr>
+          <w:b/>
+          <w:bCs/>
+        </w:rPr>
+        <w:t>Integração com aplicações modernas</w:t>
+      </w:r>
+    </w:p>
+    <w:p>
+      <w:r>
+        <w:t>Muito usados em arquiteturas de microserviços, aplicações web e mobile.</w:t>
+      </w:r>
+    </w:p>
+    <w:p>
+      <w:r>
+        <w:t>Possuem bibliotecas para diversas linguagens (Java, Python, C#, Node.js, etc.).</w:t>
+      </w:r>
+    </w:p>
+    <w:p>
+      <w:pPr>
+        <w:pStyle w:val="PargrafodaLista"/>
+        <w:numPr>
+          <w:ilvl w:val="0"/>
+          <w:numId w:val="12"/>
+        </w:numPr>
+        <w:rPr>
+          <w:b/>
+          <w:bCs/>
+        </w:rPr>
+      </w:pPr>
+      <w:r>
+        <w:rPr>
+          <w:b/>
+          <w:bCs/>
+        </w:rPr>
+        <w:t>Replicação e tolerância a falhas</w:t>
+      </w:r>
+    </w:p>
+    <w:p>
+      <w:r>
+        <w:t>Redis e MongoDB oferecem mecanismos de replicação de dados para garantir alta disponibilidade e recuperação em caso de falha.</w:t>
+      </w:r>
+    </w:p>
+    <w:p>
+      <w:pPr>
+        <w:pStyle w:val="Ttulo1"/>
+      </w:pPr>
+      <w:r>
+        <w:t>Quais as principais diferenças entre os bancos de dados Redis e MongoDB?</w:t>
+      </w:r>
+    </w:p>
+    <w:tbl>
+      <w:tblPr>
+        <w:tblStyle w:val="Tabelacomgrade"/>
+        <w:tblW w:w="0" w:type="auto"/>
+        <w:tblLook w:val="04A0" w:firstRow="1" w:lastRow="0" w:firstColumn="1" w:lastColumn="0" w:noHBand="0" w:noVBand="1"/>
+      </w:tblPr>
+      <w:tblGrid>
+        <w:gridCol w:w="2160"/>
+        <w:gridCol w:w="3889"/>
+        <w:gridCol w:w="4145"/>
+      </w:tblGrid>
+      <w:tr>
+        <w:trPr>
+          <w:trHeight w:val="600"/>
+        </w:trPr>
+        <w:tc>
+          <w:tcPr>
+            <w:tcW w:w="2160" w:type="dxa"/>
+            <w:hideMark/>
+          </w:tcPr>
+          <w:p>
+            <w:pPr>
+              <w:rPr>
+                <w:b/>
+                <w:bCs/>
+              </w:rPr>
+            </w:pPr>
+            <w:r>
+              <w:rPr>
+                <w:b/>
+                <w:bCs/>
+              </w:rPr>
+              <w:t>Modelo de dados</w:t>
+            </w:r>
+          </w:p>
+        </w:tc>
+        <w:tc>
+          <w:tcPr>
+            <w:tcW w:w="3889" w:type="dxa"/>
+            <w:hideMark/>
+          </w:tcPr>
+          <w:p>
+            <w:r>
+              <w:t xml:space="preserve">Banco </w:t>
+            </w:r>
+            <w:r>
+              <w:t>chave-valor</w:t>
+            </w:r>
+            <w:r>
+              <w:t>.</w:t>
+            </w:r>
+          </w:p>
+        </w:tc>
+        <w:tc>
+          <w:tcPr>
+            <w:tcW w:w="4145" w:type="dxa"/>
+            <w:hideMark/>
+          </w:tcPr>
+          <w:p>
+            <w:r>
+              <w:t>Banco orientado a documentos, baseado em JSON/BSON.</w:t>
+            </w:r>
+          </w:p>
+        </w:tc>
+      </w:tr>
+      <w:tr>
+        <w:trPr>
+          <w:trHeight w:val="600"/>
+        </w:trPr>
+        <w:tc>
+          <w:tcPr>
+            <w:tcW w:w="2160" w:type="dxa"/>
+            <w:hideMark/>
+          </w:tcPr>
+          <w:p>
+            <w:pPr>
+              <w:rPr>
+                <w:b/>
+                <w:bCs/>
+              </w:rPr>
+            </w:pPr>
+            <w:r>
+              <w:rPr>
+                <w:b/>
+                <w:bCs/>
+              </w:rPr>
+              <w:t>Armazenamento principal</w:t>
+            </w:r>
+          </w:p>
+        </w:tc>
+        <w:tc>
+          <w:tcPr>
+            <w:tcW w:w="3889" w:type="dxa"/>
+            <w:hideMark/>
+          </w:tcPr>
+          <w:p>
+            <w:pPr>
+              <w:rPr>
+                <w:b/>
+                <w:bCs/>
+              </w:rPr>
+            </w:pPr>
+            <w:r>
+              <w:rPr>
+                <w:b/>
+                <w:bCs/>
+              </w:rPr>
+              <w:t>In-memory</w:t>
+            </w:r>
+            <w:r>
+              <w:t xml:space="preserve"> (dados ficam na memória RAM, podendo persistir opcionalmente em disco).</w:t>
+            </w:r>
+          </w:p>
+        </w:tc>
+        <w:tc>
+          <w:tcPr>
+            <w:tcW w:w="4145" w:type="dxa"/>
+            <w:hideMark/>
+          </w:tcPr>
+          <w:p>
+            <w:r>
+              <w:t>Persistente em disco</w:t>
+            </w:r>
+          </w:p>
+        </w:tc>
+      </w:tr>
+      <w:tr>
+        <w:trPr>
+          <w:trHeight w:val="600"/>
+        </w:trPr>
+        <w:tc>
+          <w:tcPr>
+            <w:tcW w:w="2160" w:type="dxa"/>
+            <w:hideMark/>
+          </w:tcPr>
+          <w:p>
+            <w:pPr>
+              <w:rPr>
+                <w:b/>
+                <w:bCs/>
+              </w:rPr>
+            </w:pPr>
+            <w:r>
+              <w:rPr>
+                <w:b/>
+                <w:bCs/>
+              </w:rPr>
+              <w:t>Velocidade</w:t>
+            </w:r>
+          </w:p>
+        </w:tc>
+        <w:tc>
+          <w:tcPr>
+            <w:tcW w:w="3889" w:type="dxa"/>
+            <w:hideMark/>
+          </w:tcPr>
+          <w:p>
+            <w:r>
+              <w:t xml:space="preserve">Usado </w:t>
+            </w:r>
+            <w:r>
+              <w:t>para cache</w:t>
+            </w:r>
+            <w:r>
+              <w:t xml:space="preserve"> e dados temporários.</w:t>
+            </w:r>
+          </w:p>
+        </w:tc>
+        <w:tc>
+          <w:tcPr>
+            <w:tcW w:w="4145" w:type="dxa"/>
+            <w:hideMark/>
+          </w:tcPr>
+          <w:p>
+            <w:r>
+              <w:t>A</w:t>
+            </w:r>
+            <w:r>
+              <w:t xml:space="preserve">rmazenamento permanente e grandes </w:t>
+            </w:r>
+            <w:r>
+              <w:t>volumes de dados.</w:t>
+            </w:r>
+          </w:p>
+        </w:tc>
+      </w:tr>
+      <w:tr>
+        <w:trPr>
+          <w:trHeight w:val="600"/>
+        </w:trPr>
+        <w:tc>
+          <w:tcPr>
+            <w:tcW w:w="2160" w:type="dxa"/>
+            <w:hideMark/>
+          </w:tcPr>
+          <w:p>
+            <w:pPr>
+              <w:rPr>
+                <w:b/>
+                <w:bCs/>
+              </w:rPr>
+            </w:pPr>
+            <w:r>
+              <w:rPr>
+                <w:b/>
+                <w:bCs/>
+              </w:rPr>
+              <w:t>Persistência</w:t>
+            </w:r>
+          </w:p>
+        </w:tc>
+        <w:tc>
+          <w:tcPr>
+            <w:tcW w:w="3889" w:type="dxa"/>
+            <w:hideMark/>
+          </w:tcPr>
+          <w:p>
+            <w:r>
+              <w:t>Opcional.</w:t>
+            </w:r>
+          </w:p>
+        </w:tc>
+        <w:tc>
+          <w:tcPr>
+            <w:tcW w:w="4145" w:type="dxa"/>
+            <w:hideMark/>
+          </w:tcPr>
+          <w:p>
+            <w:r>
+              <w:t>Persistente por padrão.</w:t>
+            </w:r>
+          </w:p>
+        </w:tc>
+      </w:tr>
+      <w:tr>
+        <w:trPr>
+          <w:trHeight w:val="600"/>
+        </w:trPr>
+        <w:tc>
+          <w:tcPr>
+            <w:tcW w:w="2160" w:type="dxa"/>
+            <w:hideMark/>
+          </w:tcPr>
+          <w:p>
+            <w:pPr>
+              <w:rPr>
+                <w:b/>
+                <w:bCs/>
+              </w:rPr>
+            </w:pPr>
+            <w:r>
+              <w:rPr>
+                <w:b/>
+                <w:bCs/>
+              </w:rPr>
+              <w:t>Consultas</w:t>
+            </w:r>
+          </w:p>
+        </w:tc>
+        <w:tc>
+          <w:tcPr>
+            <w:tcW w:w="3889" w:type="dxa"/>
+            <w:hideMark/>
+          </w:tcPr>
+          <w:p>
+            <w:r>
+              <w:t>Operações simples por chave ou estruturas de dados</w:t>
+            </w:r>
+            <w:r>
+              <w:t>.</w:t>
+            </w:r>
+          </w:p>
+        </w:tc>
+        <w:tc>
+          <w:tcPr>
+            <w:tcW w:w="4145" w:type="dxa"/>
+            <w:hideMark/>
+          </w:tcPr>
+          <w:p>
+            <w:r>
+              <w:t xml:space="preserve">Possui linguagem de consultas avançada </w:t>
+            </w:r>
+            <w:r>
+              <w:t>(filtros, agregações, buscas textuais, geoespaciais, etc.).</w:t>
+            </w:r>
+          </w:p>
+        </w:tc>
+      </w:tr>
+      <w:tr>
+        <w:trPr>
+          <w:trHeight w:val="600"/>
+        </w:trPr>
+        <w:tc>
+          <w:tcPr>
+            <w:tcW w:w="2160" w:type="dxa"/>
+            <w:hideMark/>
+          </w:tcPr>
+          <w:p>
+            <w:pPr>
+              <w:rPr>
+                <w:b/>
+                <w:bCs/>
+              </w:rPr>
+            </w:pPr>
+            <w:r>
+              <w:rPr>
+                <w:b/>
+                <w:bCs/>
+              </w:rPr>
+              <w:t>Escalabilidade</w:t>
+            </w:r>
+          </w:p>
+        </w:tc>
+        <w:tc>
+          <w:tcPr>
+            <w:tcW w:w="3889" w:type="dxa"/>
+            <w:hideMark/>
+          </w:tcPr>
+          <w:p>
+            <w:r>
+              <w:t>Suporta replicação e sharding</w:t>
+            </w:r>
+            <w:r>
+              <w:t xml:space="preserve">, </w:t>
+            </w:r>
+            <w:r>
+              <w:t>g</w:t>
+            </w:r>
+            <w:r>
+              <w:t>eralmente usado em clusters menores ou como complemento a outro banco.</w:t>
+            </w:r>
+          </w:p>
+        </w:tc>
+        <w:tc>
+          <w:tcPr>
+            <w:tcW w:w="4145" w:type="dxa"/>
+            <w:hideMark/>
+          </w:tcPr>
+          <w:p>
+            <w:r>
+              <w:t>S</w:t>
+            </w:r>
+            <w:r>
+              <w:t xml:space="preserve">harding massivo, suportando grandes </w:t>
+            </w:r>
+            <w:r>
+              <w:t>bancos distribuídos globalmente.</w:t>
+            </w:r>
+          </w:p>
+        </w:tc>
+      </w:tr>
+      <w:tr>
+        <w:trPr>
+          <w:trHeight w:val="600"/>
+        </w:trPr>
+        <w:tc>
+          <w:tcPr>
+            <w:tcW w:w="2160" w:type="dxa"/>
+            <w:hideMark/>
+          </w:tcPr>
+          <w:p>
+            <w:pPr>
+              <w:rPr>
+                <w:b/>
+                <w:bCs/>
+              </w:rPr>
+            </w:pPr>
+            <w:r>
+              <w:rPr>
+                <w:b/>
+                <w:bCs/>
+              </w:rPr>
+              <w:t>Complexidade de dados</w:t>
+            </w:r>
+          </w:p>
+        </w:tc>
+        <w:tc>
+          <w:tcPr>
+            <w:tcW w:w="3889" w:type="dxa"/>
+            <w:hideMark/>
+          </w:tcPr>
+          <w:p>
+            <w:r>
+              <w:t xml:space="preserve">Ótimo para dados pequenos e rápidos. </w:t>
+            </w:r>
+          </w:p>
+        </w:tc>
+        <w:tc>
+          <w:tcPr>
+            <w:tcW w:w="4145" w:type="dxa"/>
+            <w:hideMark/>
+          </w:tcPr>
+          <w:p>
+            <w:r>
+              <w:t>D</w:t>
+            </w:r>
+            <w:r>
+              <w:t xml:space="preserve">ocumentos grandes, aninhados, coleções massivas e relacionamentos via </w:t>
+            </w:r>
+            <w:r>
+              <w:rPr>
+                <w:i/>
+                <w:iCs/>
+              </w:rPr>
+              <w:t>embeds</w:t>
+            </w:r>
+            <w:r>
+              <w:t xml:space="preserve"> ou </w:t>
+            </w:r>
+            <w:r>
+              <w:rPr>
+                <w:i/>
+                <w:iCs/>
+              </w:rPr>
+              <w:t>references</w:t>
+            </w:r>
+            <w:r>
+              <w:t>.</w:t>
+            </w:r>
+          </w:p>
+        </w:tc>
+      </w:tr>
+      <w:tr>
+        <w:trPr>
+          <w:trHeight w:val="600"/>
+        </w:trPr>
+        <w:tc>
+          <w:tcPr>
+            <w:tcW w:w="2160" w:type="dxa"/>
+            <w:hideMark/>
+          </w:tcPr>
+          <w:p>
+            <w:pPr>
+              <w:rPr>
+                <w:b/>
+                <w:bCs/>
+              </w:rPr>
+            </w:pPr>
+            <w:r>
+              <w:rPr>
+                <w:b/>
+                <w:bCs/>
+              </w:rPr>
+              <w:t>Uso de memória</w:t>
+            </w:r>
+          </w:p>
+        </w:tc>
+        <w:tc>
+          <w:tcPr>
+            <w:tcW w:w="3889" w:type="dxa"/>
+            <w:hideMark/>
+          </w:tcPr>
+          <w:p>
+            <w:r>
+              <w:t>Mais intensivo, pois os dados vivem na RAM.</w:t>
+            </w:r>
+          </w:p>
+        </w:tc>
+        <w:tc>
+          <w:tcPr>
+            <w:tcW w:w="4145" w:type="dxa"/>
+            <w:hideMark/>
+          </w:tcPr>
+          <w:p>
+            <w:r>
+              <w:t>Mais econômico, pois os dados ficam em disco e usam RAM como cache secundário.</w:t>
+            </w:r>
+          </w:p>
+        </w:tc>
+      </w:tr>
+      <w:tr>
+        <w:trPr>
+          <w:trHeight w:val="300"/>
+        </w:trPr>
+        <w:tc>
+          <w:tcPr>
+            <w:tcW w:w="2160" w:type="dxa"/>
+            <w:hideMark/>
+          </w:tcPr>
+          <w:p>
+            <w:pPr>
+              <w:rPr>
+                <w:b/>
+                <w:bCs/>
+              </w:rPr>
+            </w:pPr>
+            <w:r>
+              <w:rPr>
+                <w:b/>
+                <w:bCs/>
+              </w:rPr>
+              <w:t>Comunicação</w:t>
+            </w:r>
+          </w:p>
+        </w:tc>
+        <w:tc>
+          <w:tcPr>
+            <w:tcW w:w="3889" w:type="dxa"/>
+            <w:hideMark/>
+          </w:tcPr>
+          <w:p>
+            <w:r>
+              <w:t>Protocolos binários otimizados, baixa latência.</w:t>
+            </w:r>
+          </w:p>
+        </w:tc>
+        <w:tc>
+          <w:tcPr>
+            <w:tcW w:w="4145" w:type="dxa"/>
+            <w:hideMark/>
+          </w:tcPr>
+          <w:p>
+            <w:r>
+              <w:t>Interface baseada em JSON/BSON, mais “pesada”</w:t>
+            </w:r>
+            <w:r>
+              <w:t>.</w:t>
+            </w:r>
+          </w:p>
+        </w:tc>
+      </w:tr>
+    </w:tbl>
+    <w:p>
+      <w:pPr>
+        <w:pStyle w:val="Ttulo1"/>
+        <w:sectPr>
+          <w:type w:val="continuous"/>
+          <w:pgSz w:w="11906" w:h="16838"/>
+          <w:pgMar w:top="851" w:right="851" w:bottom="851" w:left="851" w:header="709" w:footer="709" w:gutter="0"/>
+          <w:pgNumType w:start="0"/>
+          <w:cols w:space="708"/>
+          <w:titlePg/>
+          <w:docGrid w:linePitch="360"/>
+        </w:sectPr>
+      </w:pPr>
+    </w:p>
+    <w:p>
+      <w:pPr>
+        <w:pStyle w:val="Ttulo1"/>
+      </w:pPr>
+      <w:r>
+        <w:lastRenderedPageBreak/>
+        <w:t>Qual Framework para automação de testes o Spring Boot usa para tratar os testes unitários? Descreva seu funcionamento.</w:t>
+      </w:r>
+    </w:p>
+    <w:p>
+      <w:r>
+        <w:t>JUnit 5</w:t>
+      </w:r>
+      <w:r>
+        <w:t xml:space="preserve"> </w:t>
+      </w:r>
+      <w:r>
+        <w:t>o framework padrão de testes unitários em Java.</w:t>
+      </w:r>
+    </w:p>
+    <w:p>
+      <w:r>
+        <w:t>Funcionamento:</w:t>
+      </w:r>
+    </w:p>
+    <w:p>
+      <w:pPr>
+        <w:shd w:val="clear" w:color="auto" w:fill="1E1F22"/>
+        <w:tabs>
+          <w:tab w:val="left" w:pos="916"/>
+          <w:tab w:val="left" w:pos="1832"/>
+          <w:tab w:val="left" w:pos="2748"/>
+          <w:tab w:val="left" w:pos="3664"/>
+          <w:tab w:val="left" w:pos="4580"/>
+          <w:tab w:val="left" w:pos="5496"/>
+          <w:tab w:val="left" w:pos="6412"/>
+          <w:tab w:val="left" w:pos="7328"/>
+          <w:tab w:val="left" w:pos="8244"/>
+          <w:tab w:val="left" w:pos="9160"/>
+          <w:tab w:val="left" w:pos="10076"/>
+          <w:tab w:val="left" w:pos="10992"/>
+          <w:tab w:val="left" w:pos="11908"/>
+          <w:tab w:val="left" w:pos="12824"/>
+          <w:tab w:val="left" w:pos="13740"/>
+          <w:tab w:val="left" w:pos="14656"/>
+        </w:tabs>
+        <w:spacing w:line="240" w:lineRule="auto"/>
+        <w:rPr>
+          <w:rFonts w:ascii="Courier New" w:eastAsia="Times New Roman" w:hAnsi="Courier New" w:cs="Courier New"/>
+          <w:color w:val="BCBEC4"/>
+          <w:sz w:val="20"/>
+          <w:szCs w:val="20"/>
+          <w:lang w:eastAsia="pt-BR"/>
+        </w:rPr>
+      </w:pPr>
+      <w:r>
+        <w:rPr>
+          <w:rFonts w:ascii="Courier New" w:eastAsia="Times New Roman" w:hAnsi="Courier New" w:cs="Courier New"/>
+          <w:color w:val="B3AE60"/>
+          <w:sz w:val="20"/>
+          <w:szCs w:val="20"/>
+          <w:lang w:eastAsia="pt-BR"/>
+        </w:rPr>
+        <w:t>@Test</w:t>
+      </w:r>
+      <w:r>
+        <w:rPr>
+          <w:rFonts w:ascii="Courier New" w:eastAsia="Times New Roman" w:hAnsi="Courier New" w:cs="Courier New"/>
+          <w:color w:val="B3AE60"/>
+          <w:sz w:val="20"/>
+          <w:szCs w:val="20"/>
+          <w:lang w:eastAsia="pt-BR"/>
+        </w:rPr>
+        <w:br/>
+      </w:r>
+      <w:r>
+        <w:rPr>
+          <w:rFonts w:ascii="Courier New" w:eastAsia="Times New Roman" w:hAnsi="Courier New" w:cs="Courier New"/>
+          <w:color w:val="CF8E6D"/>
+          <w:sz w:val="20"/>
+          <w:szCs w:val="20"/>
+          <w:lang w:eastAsia="pt-BR"/>
+        </w:rPr>
+        <w:t xml:space="preserve">void </w:t>
+      </w:r>
+      <w:r>
+        <w:rPr>
+          <w:rFonts w:ascii="Courier New" w:eastAsia="Times New Roman" w:hAnsi="Courier New" w:cs="Courier New"/>
+          <w:color w:val="56A8F5"/>
+          <w:sz w:val="20"/>
+          <w:szCs w:val="20"/>
+          <w:lang w:eastAsia="pt-BR"/>
+        </w:rPr>
+        <w:t>testCreateCliente</w:t>
+      </w:r>
+      <w:r>
+        <w:rPr>
+          <w:rFonts w:ascii="Courier New" w:eastAsia="Times New Roman" w:hAnsi="Courier New" w:cs="Courier New"/>
+          <w:color w:val="BCBEC4"/>
+          <w:sz w:val="20"/>
+          <w:szCs w:val="20"/>
+          <w:lang w:eastAsia="pt-BR"/>
+        </w:rPr>
+        <w:t xml:space="preserve">() </w:t>
+      </w:r>
+      <w:r>
+        <w:rPr>
+          <w:rFonts w:ascii="Courier New" w:eastAsia="Times New Roman" w:hAnsi="Courier New" w:cs="Courier New"/>
+          <w:color w:val="CF8E6D"/>
+          <w:sz w:val="20"/>
+          <w:szCs w:val="20"/>
+          <w:lang w:eastAsia="pt-BR"/>
+        </w:rPr>
+        <w:t xml:space="preserve">throws </w:t>
+      </w:r>
+      <w:r>
+        <w:rPr>
+          <w:rFonts w:ascii="Courier New" w:eastAsia="Times New Roman" w:hAnsi="Courier New" w:cs="Courier New"/>
+          <w:color w:val="BCBEC4"/>
+          <w:sz w:val="20"/>
+          <w:szCs w:val="20"/>
+          <w:lang w:eastAsia="pt-BR"/>
+        </w:rPr>
+        <w:t>Exception {</w:t>
+      </w:r>
+      <w:r>
+        <w:rPr>
+          <w:rFonts w:ascii="Courier New" w:eastAsia="Times New Roman" w:hAnsi="Courier New" w:cs="Courier New"/>
+          <w:color w:val="BCBEC4"/>
+          <w:sz w:val="20"/>
+          <w:szCs w:val="20"/>
+          <w:lang w:eastAsia="pt-BR"/>
+        </w:rPr>
+        <w:br/>
+        <w:t xml:space="preserve">    </w:t>
+      </w:r>
+      <w:r>
+        <w:rPr>
+          <w:rFonts w:ascii="Courier New" w:eastAsia="Times New Roman" w:hAnsi="Courier New" w:cs="Courier New"/>
+          <w:i/>
+          <w:iCs/>
+          <w:color w:val="BCBEC4"/>
+          <w:sz w:val="20"/>
+          <w:szCs w:val="20"/>
+          <w:lang w:eastAsia="pt-BR"/>
+        </w:rPr>
+        <w:t>when</w:t>
+      </w:r>
+      <w:r>
+        <w:rPr>
+          <w:rFonts w:ascii="Courier New" w:eastAsia="Times New Roman" w:hAnsi="Courier New" w:cs="Courier New"/>
+          <w:color w:val="BCBEC4"/>
+          <w:sz w:val="20"/>
+          <w:szCs w:val="20"/>
+          <w:lang w:eastAsia="pt-BR"/>
+        </w:rPr>
+        <w:t>(</w:t>
+      </w:r>
+      <w:r>
+        <w:rPr>
+          <w:rFonts w:ascii="Courier New" w:eastAsia="Times New Roman" w:hAnsi="Courier New" w:cs="Courier New"/>
+          <w:color w:val="C77DBB"/>
+          <w:sz w:val="20"/>
+          <w:szCs w:val="20"/>
+          <w:lang w:eastAsia="pt-BR"/>
+        </w:rPr>
+        <w:t>service</w:t>
+      </w:r>
+      <w:r>
+        <w:rPr>
+          <w:rFonts w:ascii="Courier New" w:eastAsia="Times New Roman" w:hAnsi="Courier New" w:cs="Courier New"/>
+          <w:color w:val="BCBEC4"/>
+          <w:sz w:val="20"/>
+          <w:szCs w:val="20"/>
+          <w:lang w:eastAsia="pt-BR"/>
+        </w:rPr>
+        <w:t>.create(</w:t>
+      </w:r>
+      <w:r>
+        <w:rPr>
+          <w:rFonts w:ascii="Courier New" w:eastAsia="Times New Roman" w:hAnsi="Courier New" w:cs="Courier New"/>
+          <w:i/>
+          <w:iCs/>
+          <w:color w:val="BCBEC4"/>
+          <w:sz w:val="20"/>
+          <w:szCs w:val="20"/>
+          <w:lang w:eastAsia="pt-BR"/>
+        </w:rPr>
+        <w:t>any</w:t>
+      </w:r>
+      <w:r>
+        <w:rPr>
+          <w:rFonts w:ascii="Courier New" w:eastAsia="Times New Roman" w:hAnsi="Courier New" w:cs="Courier New"/>
+          <w:color w:val="BCBEC4"/>
+          <w:sz w:val="20"/>
+          <w:szCs w:val="20"/>
+          <w:lang w:eastAsia="pt-BR"/>
+        </w:rPr>
+        <w:t>(Cliente.</w:t>
+      </w:r>
+      <w:r>
+        <w:rPr>
+          <w:rFonts w:ascii="Courier New" w:eastAsia="Times New Roman" w:hAnsi="Courier New" w:cs="Courier New"/>
+          <w:color w:val="CF8E6D"/>
+          <w:sz w:val="20"/>
+          <w:szCs w:val="20"/>
+          <w:lang w:eastAsia="pt-BR"/>
+        </w:rPr>
+        <w:t>class</w:t>
+      </w:r>
+      <w:r>
+        <w:rPr>
+          <w:rFonts w:ascii="Courier New" w:eastAsia="Times New Roman" w:hAnsi="Courier New" w:cs="Courier New"/>
+          <w:color w:val="BCBEC4"/>
+          <w:sz w:val="20"/>
+          <w:szCs w:val="20"/>
+          <w:lang w:eastAsia="pt-BR"/>
+        </w:rPr>
+        <w:t>))).thenReturn(</w:t>
+      </w:r>
+      <w:r>
+        <w:rPr>
+          <w:rFonts w:ascii="Courier New" w:eastAsia="Times New Roman" w:hAnsi="Courier New" w:cs="Courier New"/>
+          <w:color w:val="C77DBB"/>
+          <w:sz w:val="20"/>
+          <w:szCs w:val="20"/>
+          <w:lang w:eastAsia="pt-BR"/>
+        </w:rPr>
+        <w:t>cliente1</w:t>
+      </w:r>
+      <w:r>
+        <w:rPr>
+          <w:rFonts w:ascii="Courier New" w:eastAsia="Times New Roman" w:hAnsi="Courier New" w:cs="Courier New"/>
+          <w:color w:val="BCBEC4"/>
+          <w:sz w:val="20"/>
+          <w:szCs w:val="20"/>
+          <w:lang w:eastAsia="pt-BR"/>
+        </w:rPr>
+        <w:t>);</w:t>
+      </w:r>
+      <w:r>
+        <w:rPr>
+          <w:rFonts w:ascii="Courier New" w:eastAsia="Times New Roman" w:hAnsi="Courier New" w:cs="Courier New"/>
+          <w:color w:val="BCBEC4"/>
+          <w:sz w:val="20"/>
+          <w:szCs w:val="20"/>
+          <w:lang w:eastAsia="pt-BR"/>
+        </w:rPr>
+        <w:br/>
+      </w:r>
+      <w:r>
+        <w:rPr>
+          <w:rFonts w:ascii="Courier New" w:eastAsia="Times New Roman" w:hAnsi="Courier New" w:cs="Courier New"/>
+          <w:color w:val="BCBEC4"/>
+          <w:sz w:val="20"/>
+          <w:szCs w:val="20"/>
+          <w:lang w:eastAsia="pt-BR"/>
+        </w:rPr>
+        <w:br/>
+        <w:t xml:space="preserve">    </w:t>
+      </w:r>
+      <w:r>
+        <w:rPr>
+          <w:rFonts w:ascii="Courier New" w:eastAsia="Times New Roman" w:hAnsi="Courier New" w:cs="Courier New"/>
+          <w:color w:val="C77DBB"/>
+          <w:sz w:val="20"/>
+          <w:szCs w:val="20"/>
+          <w:lang w:eastAsia="pt-BR"/>
+        </w:rPr>
+        <w:t>mockMvc</w:t>
+      </w:r>
+      <w:r>
+        <w:rPr>
+          <w:rFonts w:ascii="Courier New" w:eastAsia="Times New Roman" w:hAnsi="Courier New" w:cs="Courier New"/>
+          <w:color w:val="BCBEC4"/>
+          <w:sz w:val="20"/>
+          <w:szCs w:val="20"/>
+          <w:lang w:eastAsia="pt-BR"/>
+        </w:rPr>
+        <w:t>.perform(</w:t>
+      </w:r>
+      <w:r>
+        <w:rPr>
+          <w:rFonts w:ascii="Courier New" w:eastAsia="Times New Roman" w:hAnsi="Courier New" w:cs="Courier New"/>
+          <w:i/>
+          <w:iCs/>
+          <w:color w:val="BCBEC4"/>
+          <w:sz w:val="20"/>
+          <w:szCs w:val="20"/>
+          <w:lang w:eastAsia="pt-BR"/>
+        </w:rPr>
+        <w:t>post</w:t>
+      </w:r>
+      <w:r>
+        <w:rPr>
+          <w:rFonts w:ascii="Courier New" w:eastAsia="Times New Roman" w:hAnsi="Courier New" w:cs="Courier New"/>
+          <w:color w:val="BCBEC4"/>
+          <w:sz w:val="20"/>
+          <w:szCs w:val="20"/>
+          <w:lang w:eastAsia="pt-BR"/>
+        </w:rPr>
+        <w:t>(</w:t>
+      </w:r>
+      <w:r>
+        <w:rPr>
+          <w:rFonts w:ascii="Courier New" w:eastAsia="Times New Roman" w:hAnsi="Courier New" w:cs="Courier New"/>
+          <w:color w:val="6AAB73"/>
+          <w:sz w:val="20"/>
+          <w:szCs w:val="20"/>
+          <w:lang w:eastAsia="pt-BR"/>
+        </w:rPr>
+        <w:t>"/clientes"</w:t>
+      </w:r>
+      <w:r>
+        <w:rPr>
+          <w:rFonts w:ascii="Courier New" w:eastAsia="Times New Roman" w:hAnsi="Courier New" w:cs="Courier New"/>
+          <w:color w:val="BCBEC4"/>
+          <w:sz w:val="20"/>
+          <w:szCs w:val="20"/>
+          <w:lang w:eastAsia="pt-BR"/>
+        </w:rPr>
+        <w:t>)</w:t>
+      </w:r>
+      <w:r>
+        <w:rPr>
+          <w:rFonts w:ascii="Courier New" w:eastAsia="Times New Roman" w:hAnsi="Courier New" w:cs="Courier New"/>
+          <w:color w:val="BCBEC4"/>
+          <w:sz w:val="20"/>
+          <w:szCs w:val="20"/>
+          <w:lang w:eastAsia="pt-BR"/>
+        </w:rPr>
+        <w:br/>
+        <w:t xml:space="preserve">                    .contentType(MediaType.</w:t>
+      </w:r>
+      <w:r>
+        <w:rPr>
+          <w:rFonts w:ascii="Courier New" w:eastAsia="Times New Roman" w:hAnsi="Courier New" w:cs="Courier New"/>
+          <w:i/>
+          <w:iCs/>
+          <w:color w:val="C77DBB"/>
+          <w:sz w:val="20"/>
+          <w:szCs w:val="20"/>
+          <w:lang w:eastAsia="pt-BR"/>
+        </w:rPr>
+        <w:t>APPLICATION_JSON</w:t>
+      </w:r>
+      <w:r>
+        <w:rPr>
+          <w:rFonts w:ascii="Courier New" w:eastAsia="Times New Roman" w:hAnsi="Courier New" w:cs="Courier New"/>
+          <w:color w:val="BCBEC4"/>
+          <w:sz w:val="20"/>
+          <w:szCs w:val="20"/>
+          <w:lang w:eastAsia="pt-BR"/>
+        </w:rPr>
+        <w:t>)</w:t>
+      </w:r>
+      <w:r>
+        <w:rPr>
+          <w:rFonts w:ascii="Courier New" w:eastAsia="Times New Roman" w:hAnsi="Courier New" w:cs="Courier New"/>
+          <w:color w:val="BCBEC4"/>
+          <w:sz w:val="20"/>
+          <w:szCs w:val="20"/>
+          <w:lang w:eastAsia="pt-BR"/>
+        </w:rPr>
+        <w:br/>
+        <w:t xml:space="preserve">                    .content(</w:t>
+      </w:r>
+      <w:r>
+        <w:rPr>
+          <w:rFonts w:ascii="Courier New" w:eastAsia="Times New Roman" w:hAnsi="Courier New" w:cs="Courier New"/>
+          <w:color w:val="C77DBB"/>
+          <w:sz w:val="20"/>
+          <w:szCs w:val="20"/>
+          <w:lang w:eastAsia="pt-BR"/>
+        </w:rPr>
+        <w:t>objectMapper</w:t>
+      </w:r>
+      <w:r>
+        <w:rPr>
+          <w:rFonts w:ascii="Courier New" w:eastAsia="Times New Roman" w:hAnsi="Courier New" w:cs="Courier New"/>
+          <w:color w:val="BCBEC4"/>
+          <w:sz w:val="20"/>
+          <w:szCs w:val="20"/>
+          <w:lang w:eastAsia="pt-BR"/>
+        </w:rPr>
+        <w:t>.writeValueAsString(</w:t>
+      </w:r>
+      <w:r>
+        <w:rPr>
+          <w:rFonts w:ascii="Courier New" w:eastAsia="Times New Roman" w:hAnsi="Courier New" w:cs="Courier New"/>
+          <w:color w:val="C77DBB"/>
+          <w:sz w:val="20"/>
+          <w:szCs w:val="20"/>
+          <w:lang w:eastAsia="pt-BR"/>
+        </w:rPr>
+        <w:t>cliente1</w:t>
+      </w:r>
+      <w:r>
+        <w:rPr>
+          <w:rFonts w:ascii="Courier New" w:eastAsia="Times New Roman" w:hAnsi="Courier New" w:cs="Courier New"/>
+          <w:color w:val="BCBEC4"/>
+          <w:sz w:val="20"/>
+          <w:szCs w:val="20"/>
+          <w:lang w:eastAsia="pt-BR"/>
+        </w:rPr>
+        <w:t>)))</w:t>
+      </w:r>
+      <w:r>
+        <w:rPr>
+          <w:rFonts w:ascii="Courier New" w:eastAsia="Times New Roman" w:hAnsi="Courier New" w:cs="Courier New"/>
+          <w:color w:val="BCBEC4"/>
+          <w:sz w:val="20"/>
+          <w:szCs w:val="20"/>
+          <w:lang w:eastAsia="pt-BR"/>
+        </w:rPr>
+        <w:br/>
+        <w:t xml:space="preserve">            .andExpect(</w:t>
+      </w:r>
+      <w:r>
+        <w:rPr>
+          <w:rFonts w:ascii="Courier New" w:eastAsia="Times New Roman" w:hAnsi="Courier New" w:cs="Courier New"/>
+          <w:i/>
+          <w:iCs/>
+          <w:color w:val="BCBEC4"/>
+          <w:sz w:val="20"/>
+          <w:szCs w:val="20"/>
+          <w:lang w:eastAsia="pt-BR"/>
+        </w:rPr>
+        <w:t>status</w:t>
+      </w:r>
+      <w:r>
+        <w:rPr>
+          <w:rFonts w:ascii="Courier New" w:eastAsia="Times New Roman" w:hAnsi="Courier New" w:cs="Courier New"/>
+          <w:color w:val="BCBEC4"/>
+          <w:sz w:val="20"/>
+          <w:szCs w:val="20"/>
+          <w:lang w:eastAsia="pt-BR"/>
+        </w:rPr>
+        <w:t>().isCreated())</w:t>
+      </w:r>
+      <w:r>
+        <w:rPr>
+          <w:rFonts w:ascii="Courier New" w:eastAsia="Times New Roman" w:hAnsi="Courier New" w:cs="Courier New"/>
+          <w:color w:val="BCBEC4"/>
+          <w:sz w:val="20"/>
+          <w:szCs w:val="20"/>
+          <w:lang w:eastAsia="pt-BR"/>
+        </w:rPr>
+        <w:br/>
+        <w:t xml:space="preserve">            .andExpect(</w:t>
+      </w:r>
+      <w:r>
+        <w:rPr>
+          <w:rFonts w:ascii="Courier New" w:eastAsia="Times New Roman" w:hAnsi="Courier New" w:cs="Courier New"/>
+          <w:i/>
+          <w:iCs/>
+          <w:color w:val="BCBEC4"/>
+          <w:sz w:val="20"/>
+          <w:szCs w:val="20"/>
+          <w:lang w:eastAsia="pt-BR"/>
+        </w:rPr>
+        <w:t>jsonPath</w:t>
+      </w:r>
+      <w:r>
+        <w:rPr>
+          <w:rFonts w:ascii="Courier New" w:eastAsia="Times New Roman" w:hAnsi="Courier New" w:cs="Courier New"/>
+          <w:color w:val="BCBEC4"/>
+          <w:sz w:val="20"/>
+          <w:szCs w:val="20"/>
+          <w:lang w:eastAsia="pt-BR"/>
+        </w:rPr>
+        <w:t>(</w:t>
+      </w:r>
+      <w:r>
+        <w:rPr>
+          <w:rFonts w:ascii="Courier New" w:eastAsia="Times New Roman" w:hAnsi="Courier New" w:cs="Courier New"/>
+          <w:color w:val="6AAB73"/>
+          <w:sz w:val="20"/>
+          <w:szCs w:val="20"/>
+          <w:lang w:eastAsia="pt-BR"/>
+        </w:rPr>
+        <w:t>"</w:t>
+      </w:r>
+      <w:r>
+        <w:rPr>
+          <w:rFonts w:ascii="Courier New" w:eastAsia="Times New Roman" w:hAnsi="Courier New" w:cs="Courier New"/>
+          <w:color w:val="6AAB73"/>
+          <w:sz w:val="20"/>
+          <w:szCs w:val="20"/>
+          <w:shd w:val="clear" w:color="auto" w:fill="293C40"/>
+          <w:lang w:eastAsia="pt-BR"/>
+        </w:rPr>
+        <w:t>$.nome</w:t>
+      </w:r>
+      <w:r>
+        <w:rPr>
+          <w:rFonts w:ascii="Courier New" w:eastAsia="Times New Roman" w:hAnsi="Courier New" w:cs="Courier New"/>
+          <w:color w:val="6AAB73"/>
+          <w:sz w:val="20"/>
+          <w:szCs w:val="20"/>
+          <w:lang w:eastAsia="pt-BR"/>
+        </w:rPr>
+        <w:t>"</w:t>
+      </w:r>
+      <w:r>
+        <w:rPr>
+          <w:rFonts w:ascii="Courier New" w:eastAsia="Times New Roman" w:hAnsi="Courier New" w:cs="Courier New"/>
+          <w:color w:val="BCBEC4"/>
+          <w:sz w:val="20"/>
+          <w:szCs w:val="20"/>
+          <w:lang w:eastAsia="pt-BR"/>
+        </w:rPr>
+        <w:t>).value(</w:t>
+      </w:r>
+      <w:r>
+        <w:rPr>
+          <w:rFonts w:ascii="Courier New" w:eastAsia="Times New Roman" w:hAnsi="Courier New" w:cs="Courier New"/>
+          <w:color w:val="6AAB73"/>
+          <w:sz w:val="20"/>
+          <w:szCs w:val="20"/>
+          <w:lang w:eastAsia="pt-BR"/>
+        </w:rPr>
+        <w:t>"João da Silva"</w:t>
+      </w:r>
+      <w:r>
+        <w:rPr>
+          <w:rFonts w:ascii="Courier New" w:eastAsia="Times New Roman" w:hAnsi="Courier New" w:cs="Courier New"/>
+          <w:color w:val="BCBEC4"/>
+          <w:sz w:val="20"/>
+          <w:szCs w:val="20"/>
+          <w:lang w:eastAsia="pt-BR"/>
+        </w:rPr>
+        <w:t>));</w:t>
+      </w:r>
+      <w:r>
+        <w:rPr>
+          <w:rFonts w:ascii="Courier New" w:eastAsia="Times New Roman" w:hAnsi="Courier New" w:cs="Courier New"/>
+          <w:color w:val="BCBEC4"/>
+          <w:sz w:val="20"/>
+          <w:szCs w:val="20"/>
+          <w:lang w:eastAsia="pt-BR"/>
+        </w:rPr>
+        <w:br/>
+      </w:r>
+      <w:r>
+        <w:rPr>
+          <w:rFonts w:ascii="Courier New" w:eastAsia="Times New Roman" w:hAnsi="Courier New" w:cs="Courier New"/>
+          <w:color w:val="BCBEC4"/>
+          <w:sz w:val="20"/>
+          <w:szCs w:val="20"/>
+          <w:lang w:eastAsia="pt-BR"/>
+        </w:rPr>
+        <w:br/>
+        <w:t xml:space="preserve">    </w:t>
+      </w:r>
+      <w:r>
+        <w:rPr>
+          <w:rFonts w:ascii="Courier New" w:eastAsia="Times New Roman" w:hAnsi="Courier New" w:cs="Courier New"/>
+          <w:i/>
+          <w:iCs/>
+          <w:color w:val="BCBEC4"/>
+          <w:sz w:val="20"/>
+          <w:szCs w:val="20"/>
+          <w:lang w:eastAsia="pt-BR"/>
+        </w:rPr>
+        <w:t>verify</w:t>
+      </w:r>
+      <w:r>
+        <w:rPr>
+          <w:rFonts w:ascii="Courier New" w:eastAsia="Times New Roman" w:hAnsi="Courier New" w:cs="Courier New"/>
+          <w:color w:val="BCBEC4"/>
+          <w:sz w:val="20"/>
+          <w:szCs w:val="20"/>
+          <w:lang w:eastAsia="pt-BR"/>
+        </w:rPr>
+        <w:t>(</w:t>
+      </w:r>
+      <w:r>
+        <w:rPr>
+          <w:rFonts w:ascii="Courier New" w:eastAsia="Times New Roman" w:hAnsi="Courier New" w:cs="Courier New"/>
+          <w:color w:val="C77DBB"/>
+          <w:sz w:val="20"/>
+          <w:szCs w:val="20"/>
+          <w:lang w:eastAsia="pt-BR"/>
+        </w:rPr>
+        <w:t>service</w:t>
+      </w:r>
+      <w:r>
+        <w:rPr>
+          <w:rFonts w:ascii="Courier New" w:eastAsia="Times New Roman" w:hAnsi="Courier New" w:cs="Courier New"/>
+          <w:color w:val="BCBEC4"/>
+          <w:sz w:val="20"/>
+          <w:szCs w:val="20"/>
+          <w:lang w:eastAsia="pt-BR"/>
+        </w:rPr>
+        <w:t xml:space="preserve">, </w:t>
+      </w:r>
+      <w:r>
+        <w:rPr>
+          <w:rFonts w:ascii="Courier New" w:eastAsia="Times New Roman" w:hAnsi="Courier New" w:cs="Courier New"/>
+          <w:i/>
+          <w:iCs/>
+          <w:color w:val="BCBEC4"/>
+          <w:sz w:val="20"/>
+          <w:szCs w:val="20"/>
+          <w:lang w:eastAsia="pt-BR"/>
+        </w:rPr>
+        <w:t>times</w:t>
+      </w:r>
+      <w:r>
+        <w:rPr>
+          <w:rFonts w:ascii="Courier New" w:eastAsia="Times New Roman" w:hAnsi="Courier New" w:cs="Courier New"/>
+          <w:color w:val="BCBEC4"/>
+          <w:sz w:val="20"/>
+          <w:szCs w:val="20"/>
+          <w:lang w:eastAsia="pt-BR"/>
+        </w:rPr>
+        <w:t>(</w:t>
+      </w:r>
+      <w:r>
+        <w:rPr>
+          <w:rFonts w:ascii="Courier New" w:eastAsia="Times New Roman" w:hAnsi="Courier New" w:cs="Courier New"/>
+          <w:color w:val="2AACB8"/>
+          <w:sz w:val="20"/>
+          <w:szCs w:val="20"/>
+          <w:lang w:eastAsia="pt-BR"/>
+        </w:rPr>
+        <w:t>1</w:t>
+      </w:r>
+      <w:r>
+        <w:rPr>
+          <w:rFonts w:ascii="Courier New" w:eastAsia="Times New Roman" w:hAnsi="Courier New" w:cs="Courier New"/>
+          <w:color w:val="BCBEC4"/>
+          <w:sz w:val="20"/>
+          <w:szCs w:val="20"/>
+          <w:lang w:eastAsia="pt-BR"/>
+        </w:rPr>
+        <w:t>)).create(</w:t>
+      </w:r>
+      <w:r>
+        <w:rPr>
+          <w:rFonts w:ascii="Courier New" w:eastAsia="Times New Roman" w:hAnsi="Courier New" w:cs="Courier New"/>
+          <w:i/>
+          <w:iCs/>
+          <w:color w:val="BCBEC4"/>
+          <w:sz w:val="20"/>
+          <w:szCs w:val="20"/>
+          <w:lang w:eastAsia="pt-BR"/>
+        </w:rPr>
+        <w:t>any</w:t>
+      </w:r>
+      <w:r>
+        <w:rPr>
+          <w:rFonts w:ascii="Courier New" w:eastAsia="Times New Roman" w:hAnsi="Courier New" w:cs="Courier New"/>
+          <w:color w:val="BCBEC4"/>
+          <w:sz w:val="20"/>
+          <w:szCs w:val="20"/>
+          <w:lang w:eastAsia="pt-BR"/>
+        </w:rPr>
+        <w:t>(Cliente.</w:t>
+      </w:r>
+      <w:r>
+        <w:rPr>
+          <w:rFonts w:ascii="Courier New" w:eastAsia="Times New Roman" w:hAnsi="Courier New" w:cs="Courier New"/>
+          <w:color w:val="CF8E6D"/>
+          <w:sz w:val="20"/>
+          <w:szCs w:val="20"/>
+          <w:lang w:eastAsia="pt-BR"/>
+        </w:rPr>
+        <w:t>class</w:t>
+      </w:r>
+      <w:r>
+        <w:rPr>
+          <w:rFonts w:ascii="Courier New" w:eastAsia="Times New Roman" w:hAnsi="Courier New" w:cs="Courier New"/>
+          <w:color w:val="BCBEC4"/>
+          <w:sz w:val="20"/>
+          <w:szCs w:val="20"/>
+          <w:lang w:eastAsia="pt-BR"/>
+        </w:rPr>
+        <w:t>));</w:t>
+      </w:r>
+      <w:r>
+        <w:rPr>
+          <w:rFonts w:ascii="Courier New" w:eastAsia="Times New Roman" w:hAnsi="Courier New" w:cs="Courier New"/>
+          <w:color w:val="BCBEC4"/>
+          <w:sz w:val="20"/>
+          <w:szCs w:val="20"/>
+          <w:lang w:eastAsia="pt-BR"/>
+        </w:rPr>
+        <w:br/>
+        <w:t>}</w:t>
+      </w:r>
+    </w:p>
+    <w:p/>
+    <w:p>
+      <w:pPr>
+        <w:pStyle w:val="PargrafodaLista"/>
+        <w:numPr>
+          <w:ilvl w:val="0"/>
+          <w:numId w:val="12"/>
+        </w:numPr>
+        <w:rPr>
+          <w:b/>
+          <w:bCs/>
+        </w:rPr>
+      </w:pPr>
+      <w:r>
+        <w:rPr>
+          <w:b/>
+          <w:bCs/>
+        </w:rPr>
+        <w:t>when(service.create(any(Cliente.class))).thenReturn(cliente1);</w:t>
+      </w:r>
+    </w:p>
+    <w:p>
+      <w:r>
+        <w:t>Q</w:t>
+      </w:r>
+      <w:r>
+        <w:t>uando o mock service receber uma chamada create(...) com qualquer instância de Cliente (any(Cliente.class)), deve retornar o objeto cliente1 (pré-criado no teste).</w:t>
+      </w:r>
+    </w:p>
+    <w:p/>
+    <w:p>
+      <w:pPr>
+        <w:pStyle w:val="PargrafodaLista"/>
+        <w:numPr>
+          <w:ilvl w:val="0"/>
+          <w:numId w:val="12"/>
+        </w:numPr>
+        <w:rPr>
+          <w:b/>
+          <w:bCs/>
+        </w:rPr>
+      </w:pPr>
+      <w:r>
+        <w:rPr>
+          <w:b/>
+          <w:bCs/>
+        </w:rPr>
+        <w:t>mockMvc.perform(post("/clientes")</w:t>
+      </w:r>
+    </w:p>
+    <w:p>
+      <w:r>
+        <w:t>Inicia a simulação de uma requisição HTTP do tipo POST para o endpoint /clientes. mockMvc simula o dispatcher do Spring MVC sem subir servidor HTTP real.</w:t>
+      </w:r>
+    </w:p>
+    <w:p/>
+    <w:p>
+      <w:pPr>
+        <w:pStyle w:val="PargrafodaLista"/>
+        <w:numPr>
+          <w:ilvl w:val="0"/>
+          <w:numId w:val="12"/>
+        </w:numPr>
+        <w:rPr>
+          <w:b/>
+          <w:bCs/>
+        </w:rPr>
+      </w:pPr>
+      <w:r>
+        <w:rPr>
+          <w:b/>
+          <w:bCs/>
+        </w:rPr>
+        <w:t>.contentType(MediaType.APPLICATION_JSON)</w:t>
+      </w:r>
+    </w:p>
+    <w:p>
+      <w:r>
+        <w:t>Define o header Content-Type: application/json. Importante porque o controller provavelmente espera JSON e usa @RequestBody para desserializar.</w:t>
+      </w:r>
+    </w:p>
+    <w:p/>
+    <w:p>
+      <w:pPr>
+        <w:pStyle w:val="PargrafodaLista"/>
+        <w:numPr>
+          <w:ilvl w:val="0"/>
+          <w:numId w:val="12"/>
+        </w:numPr>
+        <w:rPr>
+          <w:b/>
+          <w:bCs/>
+        </w:rPr>
+      </w:pPr>
+      <w:r>
+        <w:rPr>
+          <w:b/>
+          <w:bCs/>
+        </w:rPr>
+        <w:t>.content(objectMapper.writeValueAsString(cliente1)))</w:t>
+      </w:r>
+    </w:p>
+    <w:p>
+      <w:r>
+        <w:t>O corpo da requisição é o JSON gerado a partir de cliente1 (pela ObjectMapper do Jackson). Assim o controller receberá um JSON igual ao objeto cliente1.</w:t>
+      </w:r>
+    </w:p>
+    <w:p/>
+    <w:p>
+      <w:pPr>
+        <w:pStyle w:val="PargrafodaLista"/>
+        <w:numPr>
+          <w:ilvl w:val="0"/>
+          <w:numId w:val="12"/>
+        </w:numPr>
+        <w:rPr>
+          <w:b/>
+          <w:bCs/>
+        </w:rPr>
+      </w:pPr>
+      <w:r>
+        <w:rPr>
+          <w:b/>
+          <w:bCs/>
+        </w:rPr>
+        <w:t>.andExpect(status().isCreated())</w:t>
+      </w:r>
+    </w:p>
+    <w:p>
+      <w:r>
+        <w:t xml:space="preserve">Verifica que a resposta HTTP do controller foi 201 Created. </w:t>
+      </w:r>
+      <w:r>
+        <w:t>I</w:t>
+      </w:r>
+      <w:r>
+        <w:t xml:space="preserve">ndica que </w:t>
+      </w:r>
+      <w:r>
+        <w:t>o recurso foi criado com sucesso</w:t>
+      </w:r>
+      <w:r>
+        <w:t>.</w:t>
+      </w:r>
+    </w:p>
+    <w:p/>
+    <w:p>
+      <w:pPr>
+        <w:pStyle w:val="PargrafodaLista"/>
+        <w:numPr>
+          <w:ilvl w:val="0"/>
+          <w:numId w:val="12"/>
+        </w:numPr>
+        <w:rPr>
+          <w:b/>
+          <w:bCs/>
+        </w:rPr>
+      </w:pPr>
+      <w:r>
+        <w:rPr>
+          <w:b/>
+          <w:bCs/>
+        </w:rPr>
+        <w:t>.andExpect(jsonPath("$.nome").value("João da Silva"));</w:t>
+      </w:r>
+    </w:p>
+    <w:p>
+      <w:r>
+        <w:t>Verifica o corpo da resposta (JSON) com JSONPath: $.nome pega o campo nome da raiz do objeto JSON e exige que seu valor seja "João da Silva".</w:t>
+      </w:r>
+    </w:p>
+    <w:p/>
+    <w:p>
+      <w:pPr>
+        <w:pStyle w:val="PargrafodaLista"/>
+        <w:numPr>
+          <w:ilvl w:val="0"/>
+          <w:numId w:val="12"/>
+        </w:numPr>
+        <w:rPr>
+          <w:b/>
+          <w:bCs/>
+        </w:rPr>
+      </w:pPr>
+      <w:r>
+        <w:rPr>
+          <w:b/>
+          <w:bCs/>
+        </w:rPr>
+        <w:t>verify(service, times(1)).create(any(Cliente.class));</w:t>
+      </w:r>
+    </w:p>
+    <w:p>
+      <w:r>
+        <w:t xml:space="preserve">Verificação de interação: confirma que service.create(...) foi chamado </w:t>
+      </w:r>
+      <w:r>
+        <w:t xml:space="preserve">apenas </w:t>
+      </w:r>
+      <w:r>
+        <w:t xml:space="preserve">uma vez durante a execução do controller. </w:t>
+      </w:r>
+    </w:p>
+    <w:p>
+      <w:pPr>
+        <w:pStyle w:val="Ttulo1"/>
+      </w:pPr>
+      <w:r>
+        <w:t>No Assessment, iremos implementar um serviço com as seguintes funcionalidades:</w:t>
+      </w:r>
+    </w:p>
+    <w:p/>
+    <w:p>
+      <w:pPr>
+        <w:pStyle w:val="Ttulo1"/>
+      </w:pPr>
+      <w:r>
+        <w:t>Faça o deploy do serviço/aplicação desenvolvido.</w:t>
+      </w:r>
     </w:p>
     <w:sectPr>
       <w:pgSz w:w="11906" w:h="16838"/>
@@ -4627,95 +7670,9 @@
     </w:lvl>
   </w:abstractNum>
   <w:abstractNum w:abstractNumId="1" w15:restartNumberingAfterBreak="0">
-    <w:nsid w:val="28D52205"/>
+    <w:nsid w:val="25782FBF"/>
     <w:multiLevelType w:val="hybridMultilevel"/>
-    <w:tmpl w:val="9C2492EC"/>
-    <w:lvl w:ilvl="0" w:tplc="04160011">
-      <w:start w:val="1"/>
-      <w:numFmt w:val="decimal"/>
-      <w:lvlText w:val="%1)"/>
-      <w:lvlJc w:val="left"/>
-      <w:pPr>
-        <w:ind w:left="720" w:hanging="360"/>
-      </w:pPr>
-    </w:lvl>
-    <w:lvl w:ilvl="1" w:tplc="04160019" w:tentative="1">
-      <w:start w:val="1"/>
-      <w:numFmt w:val="lowerLetter"/>
-      <w:lvlText w:val="%2."/>
-      <w:lvlJc w:val="left"/>
-      <w:pPr>
-        <w:ind w:left="1440" w:hanging="360"/>
-      </w:pPr>
-    </w:lvl>
-    <w:lvl w:ilvl="2" w:tplc="0416001B" w:tentative="1">
-      <w:start w:val="1"/>
-      <w:numFmt w:val="lowerRoman"/>
-      <w:lvlText w:val="%3."/>
-      <w:lvlJc w:val="right"/>
-      <w:pPr>
-        <w:ind w:left="2160" w:hanging="180"/>
-      </w:pPr>
-    </w:lvl>
-    <w:lvl w:ilvl="3" w:tplc="0416000F" w:tentative="1">
-      <w:start w:val="1"/>
-      <w:numFmt w:val="decimal"/>
-      <w:lvlText w:val="%4."/>
-      <w:lvlJc w:val="left"/>
-      <w:pPr>
-        <w:ind w:left="2880" w:hanging="360"/>
-      </w:pPr>
-    </w:lvl>
-    <w:lvl w:ilvl="4" w:tplc="04160019" w:tentative="1">
-      <w:start w:val="1"/>
-      <w:numFmt w:val="lowerLetter"/>
-      <w:lvlText w:val="%5."/>
-      <w:lvlJc w:val="left"/>
-      <w:pPr>
-        <w:ind w:left="3600" w:hanging="360"/>
-      </w:pPr>
-    </w:lvl>
-    <w:lvl w:ilvl="5" w:tplc="0416001B" w:tentative="1">
-      <w:start w:val="1"/>
-      <w:numFmt w:val="lowerRoman"/>
-      <w:lvlText w:val="%6."/>
-      <w:lvlJc w:val="right"/>
-      <w:pPr>
-        <w:ind w:left="4320" w:hanging="180"/>
-      </w:pPr>
-    </w:lvl>
-    <w:lvl w:ilvl="6" w:tplc="0416000F" w:tentative="1">
-      <w:start w:val="1"/>
-      <w:numFmt w:val="decimal"/>
-      <w:lvlText w:val="%7."/>
-      <w:lvlJc w:val="left"/>
-      <w:pPr>
-        <w:ind w:left="5040" w:hanging="360"/>
-      </w:pPr>
-    </w:lvl>
-    <w:lvl w:ilvl="7" w:tplc="04160019" w:tentative="1">
-      <w:start w:val="1"/>
-      <w:numFmt w:val="lowerLetter"/>
-      <w:lvlText w:val="%8."/>
-      <w:lvlJc w:val="left"/>
-      <w:pPr>
-        <w:ind w:left="5760" w:hanging="360"/>
-      </w:pPr>
-    </w:lvl>
-    <w:lvl w:ilvl="8" w:tplc="0416001B" w:tentative="1">
-      <w:start w:val="1"/>
-      <w:numFmt w:val="lowerRoman"/>
-      <w:lvlText w:val="%9."/>
-      <w:lvlJc w:val="right"/>
-      <w:pPr>
-        <w:ind w:left="6480" w:hanging="180"/>
-      </w:pPr>
-    </w:lvl>
-  </w:abstractNum>
-  <w:abstractNum w:abstractNumId="2" w15:restartNumberingAfterBreak="0">
-    <w:nsid w:val="34584E63"/>
-    <w:multiLevelType w:val="hybridMultilevel"/>
-    <w:tmpl w:val="DA64AA84"/>
+    <w:tmpl w:val="2E8E87EA"/>
     <w:lvl w:ilvl="0" w:tplc="04160001">
       <w:start w:val="1"/>
       <w:numFmt w:val="bullet"/>
@@ -4825,11 +7782,210 @@
       </w:rPr>
     </w:lvl>
   </w:abstractNum>
+  <w:abstractNum w:abstractNumId="2" w15:restartNumberingAfterBreak="0">
+    <w:nsid w:val="28D52205"/>
+    <w:multiLevelType w:val="hybridMultilevel"/>
+    <w:tmpl w:val="9C2492EC"/>
+    <w:lvl w:ilvl="0" w:tplc="04160011">
+      <w:start w:val="1"/>
+      <w:numFmt w:val="decimal"/>
+      <w:lvlText w:val="%1)"/>
+      <w:lvlJc w:val="left"/>
+      <w:pPr>
+        <w:ind w:left="720" w:hanging="360"/>
+      </w:pPr>
+    </w:lvl>
+    <w:lvl w:ilvl="1" w:tplc="04160019" w:tentative="1">
+      <w:start w:val="1"/>
+      <w:numFmt w:val="lowerLetter"/>
+      <w:lvlText w:val="%2."/>
+      <w:lvlJc w:val="left"/>
+      <w:pPr>
+        <w:ind w:left="1440" w:hanging="360"/>
+      </w:pPr>
+    </w:lvl>
+    <w:lvl w:ilvl="2" w:tplc="0416001B" w:tentative="1">
+      <w:start w:val="1"/>
+      <w:numFmt w:val="lowerRoman"/>
+      <w:lvlText w:val="%3."/>
+      <w:lvlJc w:val="right"/>
+      <w:pPr>
+        <w:ind w:left="2160" w:hanging="180"/>
+      </w:pPr>
+    </w:lvl>
+    <w:lvl w:ilvl="3" w:tplc="0416000F" w:tentative="1">
+      <w:start w:val="1"/>
+      <w:numFmt w:val="decimal"/>
+      <w:lvlText w:val="%4."/>
+      <w:lvlJc w:val="left"/>
+      <w:pPr>
+        <w:ind w:left="2880" w:hanging="360"/>
+      </w:pPr>
+    </w:lvl>
+    <w:lvl w:ilvl="4" w:tplc="04160019" w:tentative="1">
+      <w:start w:val="1"/>
+      <w:numFmt w:val="lowerLetter"/>
+      <w:lvlText w:val="%5."/>
+      <w:lvlJc w:val="left"/>
+      <w:pPr>
+        <w:ind w:left="3600" w:hanging="360"/>
+      </w:pPr>
+    </w:lvl>
+    <w:lvl w:ilvl="5" w:tplc="0416001B" w:tentative="1">
+      <w:start w:val="1"/>
+      <w:numFmt w:val="lowerRoman"/>
+      <w:lvlText w:val="%6."/>
+      <w:lvlJc w:val="right"/>
+      <w:pPr>
+        <w:ind w:left="4320" w:hanging="180"/>
+      </w:pPr>
+    </w:lvl>
+    <w:lvl w:ilvl="6" w:tplc="0416000F" w:tentative="1">
+      <w:start w:val="1"/>
+      <w:numFmt w:val="decimal"/>
+      <w:lvlText w:val="%7."/>
+      <w:lvlJc w:val="left"/>
+      <w:pPr>
+        <w:ind w:left="5040" w:hanging="360"/>
+      </w:pPr>
+    </w:lvl>
+    <w:lvl w:ilvl="7" w:tplc="04160019" w:tentative="1">
+      <w:start w:val="1"/>
+      <w:numFmt w:val="lowerLetter"/>
+      <w:lvlText w:val="%8."/>
+      <w:lvlJc w:val="left"/>
+      <w:pPr>
+        <w:ind w:left="5760" w:hanging="360"/>
+      </w:pPr>
+    </w:lvl>
+    <w:lvl w:ilvl="8" w:tplc="0416001B" w:tentative="1">
+      <w:start w:val="1"/>
+      <w:numFmt w:val="lowerRoman"/>
+      <w:lvlText w:val="%9."/>
+      <w:lvlJc w:val="right"/>
+      <w:pPr>
+        <w:ind w:left="6480" w:hanging="180"/>
+      </w:pPr>
+    </w:lvl>
+  </w:abstractNum>
   <w:abstractNum w:abstractNumId="3" w15:restartNumberingAfterBreak="0">
+    <w:nsid w:val="34584E63"/>
+    <w:multiLevelType w:val="hybridMultilevel"/>
+    <w:tmpl w:val="DA64AA84"/>
+    <w:lvl w:ilvl="0" w:tplc="04160001">
+      <w:start w:val="1"/>
+      <w:numFmt w:val="bullet"/>
+      <w:lvlText w:val=""/>
+      <w:lvlJc w:val="left"/>
+      <w:pPr>
+        <w:ind w:left="720" w:hanging="360"/>
+      </w:pPr>
+      <w:rPr>
+        <w:rFonts w:ascii="Symbol" w:hAnsi="Symbol" w:hint="default"/>
+      </w:rPr>
+    </w:lvl>
+    <w:lvl w:ilvl="1" w:tplc="04160003" w:tentative="1">
+      <w:start w:val="1"/>
+      <w:numFmt w:val="bullet"/>
+      <w:lvlText w:val="o"/>
+      <w:lvlJc w:val="left"/>
+      <w:pPr>
+        <w:ind w:left="1440" w:hanging="360"/>
+      </w:pPr>
+      <w:rPr>
+        <w:rFonts w:ascii="Courier New" w:hAnsi="Courier New" w:cs="Courier New" w:hint="default"/>
+      </w:rPr>
+    </w:lvl>
+    <w:lvl w:ilvl="2" w:tplc="04160005" w:tentative="1">
+      <w:start w:val="1"/>
+      <w:numFmt w:val="bullet"/>
+      <w:lvlText w:val=""/>
+      <w:lvlJc w:val="left"/>
+      <w:pPr>
+        <w:ind w:left="2160" w:hanging="360"/>
+      </w:pPr>
+      <w:rPr>
+        <w:rFonts w:ascii="Wingdings" w:hAnsi="Wingdings" w:hint="default"/>
+      </w:rPr>
+    </w:lvl>
+    <w:lvl w:ilvl="3" w:tplc="04160001" w:tentative="1">
+      <w:start w:val="1"/>
+      <w:numFmt w:val="bullet"/>
+      <w:lvlText w:val=""/>
+      <w:lvlJc w:val="left"/>
+      <w:pPr>
+        <w:ind w:left="2880" w:hanging="360"/>
+      </w:pPr>
+      <w:rPr>
+        <w:rFonts w:ascii="Symbol" w:hAnsi="Symbol" w:hint="default"/>
+      </w:rPr>
+    </w:lvl>
+    <w:lvl w:ilvl="4" w:tplc="04160003" w:tentative="1">
+      <w:start w:val="1"/>
+      <w:numFmt w:val="bullet"/>
+      <w:lvlText w:val="o"/>
+      <w:lvlJc w:val="left"/>
+      <w:pPr>
+        <w:ind w:left="3600" w:hanging="360"/>
+      </w:pPr>
+      <w:rPr>
+        <w:rFonts w:ascii="Courier New" w:hAnsi="Courier New" w:cs="Courier New" w:hint="default"/>
+      </w:rPr>
+    </w:lvl>
+    <w:lvl w:ilvl="5" w:tplc="04160005" w:tentative="1">
+      <w:start w:val="1"/>
+      <w:numFmt w:val="bullet"/>
+      <w:lvlText w:val=""/>
+      <w:lvlJc w:val="left"/>
+      <w:pPr>
+        <w:ind w:left="4320" w:hanging="360"/>
+      </w:pPr>
+      <w:rPr>
+        <w:rFonts w:ascii="Wingdings" w:hAnsi="Wingdings" w:hint="default"/>
+      </w:rPr>
+    </w:lvl>
+    <w:lvl w:ilvl="6" w:tplc="04160001" w:tentative="1">
+      <w:start w:val="1"/>
+      <w:numFmt w:val="bullet"/>
+      <w:lvlText w:val=""/>
+      <w:lvlJc w:val="left"/>
+      <w:pPr>
+        <w:ind w:left="5040" w:hanging="360"/>
+      </w:pPr>
+      <w:rPr>
+        <w:rFonts w:ascii="Symbol" w:hAnsi="Symbol" w:hint="default"/>
+      </w:rPr>
+    </w:lvl>
+    <w:lvl w:ilvl="7" w:tplc="04160003" w:tentative="1">
+      <w:start w:val="1"/>
+      <w:numFmt w:val="bullet"/>
+      <w:lvlText w:val="o"/>
+      <w:lvlJc w:val="left"/>
+      <w:pPr>
+        <w:ind w:left="5760" w:hanging="360"/>
+      </w:pPr>
+      <w:rPr>
+        <w:rFonts w:ascii="Courier New" w:hAnsi="Courier New" w:cs="Courier New" w:hint="default"/>
+      </w:rPr>
+    </w:lvl>
+    <w:lvl w:ilvl="8" w:tplc="04160005" w:tentative="1">
+      <w:start w:val="1"/>
+      <w:numFmt w:val="bullet"/>
+      <w:lvlText w:val=""/>
+      <w:lvlJc w:val="left"/>
+      <w:pPr>
+        <w:ind w:left="6480" w:hanging="360"/>
+      </w:pPr>
+      <w:rPr>
+        <w:rFonts w:ascii="Wingdings" w:hAnsi="Wingdings" w:hint="default"/>
+      </w:rPr>
+    </w:lvl>
+  </w:abstractNum>
+  <w:abstractNum w:abstractNumId="4" w15:restartNumberingAfterBreak="0">
     <w:nsid w:val="60585075"/>
     <w:multiLevelType w:val="hybridMultilevel"/>
-    <w:tmpl w:val="A762C6C6"/>
-    <w:lvl w:ilvl="0" w:tplc="6E46FBCE">
+    <w:tmpl w:val="CF407560"/>
+    <w:lvl w:ilvl="0" w:tplc="5CB64292">
       <w:start w:val="1"/>
       <w:numFmt w:val="decimal"/>
       <w:pStyle w:val="Ttulo1"/>
@@ -4915,7 +8071,7 @@
       </w:pPr>
     </w:lvl>
   </w:abstractNum>
-  <w:abstractNum w:abstractNumId="4" w15:restartNumberingAfterBreak="0">
+  <w:abstractNum w:abstractNumId="5" w15:restartNumberingAfterBreak="0">
     <w:nsid w:val="6B8B12A8"/>
     <w:multiLevelType w:val="hybridMultilevel"/>
     <w:tmpl w:val="9C2492EC"/>
@@ -5001,7 +8157,7 @@
       </w:pPr>
     </w:lvl>
   </w:abstractNum>
-  <w:abstractNum w:abstractNumId="5" w15:restartNumberingAfterBreak="0">
+  <w:abstractNum w:abstractNumId="6" w15:restartNumberingAfterBreak="0">
     <w:nsid w:val="718A0047"/>
     <w:multiLevelType w:val="hybridMultilevel"/>
     <w:tmpl w:val="974E06F8"/>
@@ -5087,7 +8243,7 @@
       </w:pPr>
     </w:lvl>
   </w:abstractNum>
-  <w:abstractNum w:abstractNumId="6" w15:restartNumberingAfterBreak="0">
+  <w:abstractNum w:abstractNumId="7" w15:restartNumberingAfterBreak="0">
     <w:nsid w:val="7677085D"/>
     <w:multiLevelType w:val="hybridMultilevel"/>
     <w:tmpl w:val="1B90EBFC"/>
@@ -5200,7 +8356,7 @@
       </w:rPr>
     </w:lvl>
   </w:abstractNum>
-  <w:abstractNum w:abstractNumId="7" w15:restartNumberingAfterBreak="0">
+  <w:abstractNum w:abstractNumId="8" w15:restartNumberingAfterBreak="0">
     <w:nsid w:val="7A2D605C"/>
     <w:multiLevelType w:val="hybridMultilevel"/>
     <w:tmpl w:val="9C2492EC"/>
@@ -5287,40 +8443,43 @@
     </w:lvl>
   </w:abstractNum>
   <w:num w:numId="1">
-    <w:abstractNumId w:val="3"/>
+    <w:abstractNumId w:val="4"/>
   </w:num>
   <w:num w:numId="2">
-    <w:abstractNumId w:val="1"/>
+    <w:abstractNumId w:val="2"/>
   </w:num>
   <w:num w:numId="3">
-    <w:abstractNumId w:val="7"/>
+    <w:abstractNumId w:val="8"/>
   </w:num>
   <w:num w:numId="4">
-    <w:abstractNumId w:val="4"/>
+    <w:abstractNumId w:val="5"/>
   </w:num>
   <w:num w:numId="5">
     <w:abstractNumId w:val="0"/>
   </w:num>
   <w:num w:numId="6">
-    <w:abstractNumId w:val="5"/>
+    <w:abstractNumId w:val="6"/>
   </w:num>
   <w:num w:numId="7">
-    <w:abstractNumId w:val="3"/>
+    <w:abstractNumId w:val="4"/>
   </w:num>
   <w:num w:numId="8">
-    <w:abstractNumId w:val="6"/>
+    <w:abstractNumId w:val="7"/>
   </w:num>
   <w:num w:numId="9">
-    <w:abstractNumId w:val="3"/>
+    <w:abstractNumId w:val="4"/>
     <w:lvlOverride w:ilvl="0">
       <w:startOverride w:val="9"/>
     </w:lvlOverride>
   </w:num>
   <w:num w:numId="10">
-    <w:abstractNumId w:val="2"/>
+    <w:abstractNumId w:val="3"/>
   </w:num>
   <w:num w:numId="11">
-    <w:abstractNumId w:val="3"/>
+    <w:abstractNumId w:val="4"/>
+  </w:num>
+  <w:num w:numId="12">
+    <w:abstractNumId w:val="1"/>
   </w:num>
   <w:numIdMacAtCleanup w:val="4"/>
 </w:numbering>
@@ -5736,7 +8895,7 @@
     <w:link w:val="Ttulo1Char"/>
     <w:uiPriority w:val="9"/>
     <w:qFormat/>
-    <w:rsid w:val="008F7ADD"/>
+    <w:rsid w:val="0090118D"/>
     <w:pPr>
       <w:keepNext/>
       <w:keepLines/>
@@ -5744,6 +8903,7 @@
         <w:numId w:val="7"/>
       </w:numPr>
       <w:spacing w:before="240" w:after="240"/>
+      <w:ind w:left="426"/>
       <w:outlineLvl w:val="0"/>
     </w:pPr>
     <w:rPr>
@@ -5802,7 +8962,6 @@
   <w:style w:type="character" w:default="1" w:styleId="Fontepargpadro">
     <w:name w:val="Default Paragraph Font"/>
     <w:uiPriority w:val="1"/>
-    <w:semiHidden/>
     <w:unhideWhenUsed/>
   </w:style>
   <w:style w:type="table" w:default="1" w:styleId="Tabelanormal">
@@ -5893,7 +9052,7 @@
     <w:basedOn w:val="Fontepargpadro"/>
     <w:link w:val="Ttulo1"/>
     <w:uiPriority w:val="9"/>
-    <w:rsid w:val="008F7ADD"/>
+    <w:rsid w:val="0090118D"/>
     <w:rPr>
       <w:rFonts w:ascii="Arial" w:eastAsiaTheme="majorEastAsia" w:hAnsi="Arial" w:cstheme="majorBidi"/>
       <w:smallCaps/>
@@ -6390,7 +9549,7 @@
 
 <file path=customXml/item1.xml><?xml version="1.0" encoding="utf-8"?>
 <CoverPageProperties xmlns="http://schemas.microsoft.com/office/2006/coverPageProps">
-  <PublishDate>2025-09-23T00:00:00</PublishDate>
+  <PublishDate>2025-09-22T00:00:00</PublishDate>
   <Abstract/>
   <CompanyAddress/>
   <CompanyPhone/>

</xml_diff>

<commit_message>
feat: AT finalizado e salvo o relatório
</commit_message>
<xml_diff>
--- a/AT/documentos/samuel_hermany_DR3_AT.docx
+++ b/AT/documentos/samuel_hermany_DR3_AT.docx
@@ -276,7 +276,7 @@
                                     <w:tag w:val=""/>
                                     <w:id w:val="-650599894"/>
                                     <w:dataBinding w:prefixMappings="xmlns:ns0='http://schemas.microsoft.com/office/2006/coverPageProps' " w:xpath="/ns0:CoverPageProperties[1]/ns0:PublishDate[1]" w:storeItemID="{55AF091B-3C7A-41E3-B477-F2FDAA23CFDA}"/>
-                                    <w:date w:fullDate="2025-09-22T00:00:00Z">
+                                    <w:date w:fullDate="2025-09-25T00:00:00Z">
                                       <w:dateFormat w:val="d/M/yyyy"/>
                                       <w:lid w:val="pt-BR"/>
                                       <w:storeMappedDataAs w:val="dateTime"/>
@@ -309,7 +309,7 @@
                                           <w:sz w:val="28"/>
                                           <w:szCs w:val="28"/>
                                         </w:rPr>
-                                        <w:t>2</w:t>
+                                        <w:t>5</w:t>
                                       </w:r>
                                       <w:r>
                                         <w:rPr>
@@ -3605,7 +3605,7 @@
                               <w:tag w:val=""/>
                               <w:id w:val="-650599894"/>
                               <w:dataBinding w:prefixMappings="xmlns:ns0='http://schemas.microsoft.com/office/2006/coverPageProps' " w:xpath="/ns0:CoverPageProperties[1]/ns0:PublishDate[1]" w:storeItemID="{55AF091B-3C7A-41E3-B477-F2FDAA23CFDA}"/>
-                              <w:date w:fullDate="2025-09-22T00:00:00Z">
+                              <w:date w:fullDate="2025-09-25T00:00:00Z">
                                 <w:dateFormat w:val="d/M/yyyy"/>
                                 <w:lid w:val="pt-BR"/>
                                 <w:storeMappedDataAs w:val="dateTime"/>
@@ -3638,7 +3638,7 @@
                                     <w:sz w:val="28"/>
                                     <w:szCs w:val="28"/>
                                   </w:rPr>
-                                  <w:t>2</w:t>
+                                  <w:t>5</w:t>
                                 </w:r>
                                 <w:r>
                                   <w:rPr>
@@ -4217,8 +4217,20 @@
                                         <w:szCs w:val="28"/>
                                         <w:lang w:eastAsia="pt-BR"/>
                                       </w:rPr>
-                                      <w:t>Desenvolvimento de Serviços com SpringBoot</w:t>
+                                      <w:t xml:space="preserve">Desenvolvimento de Serviços com </w:t>
                                     </w:r>
+                                    <w:proofErr w:type="spellStart"/>
+                                    <w:r>
+                                      <w:rPr>
+                                        <w:rFonts w:ascii="Arial" w:eastAsia="Times New Roman" w:hAnsi="Arial" w:cs="Arial"/>
+                                        <w:color w:val="0070C0"/>
+                                        <w:sz w:val="28"/>
+                                        <w:szCs w:val="28"/>
+                                        <w:lang w:eastAsia="pt-BR"/>
+                                      </w:rPr>
+                                      <w:t>SpringBoot</w:t>
+                                    </w:r>
+                                    <w:proofErr w:type="spellEnd"/>
                                   </w:sdtContent>
                                 </w:sdt>
                               </w:p>
@@ -4334,8 +4346,20 @@
                                   <w:szCs w:val="28"/>
                                   <w:lang w:eastAsia="pt-BR"/>
                                 </w:rPr>
-                                <w:t>Desenvolvimento de Serviços com SpringBoot</w:t>
+                                <w:t xml:space="preserve">Desenvolvimento de Serviços com </w:t>
                               </w:r>
+                              <w:proofErr w:type="spellStart"/>
+                              <w:r>
+                                <w:rPr>
+                                  <w:rFonts w:ascii="Arial" w:eastAsia="Times New Roman" w:hAnsi="Arial" w:cs="Arial"/>
+                                  <w:color w:val="0070C0"/>
+                                  <w:sz w:val="28"/>
+                                  <w:szCs w:val="28"/>
+                                  <w:lang w:eastAsia="pt-BR"/>
+                                </w:rPr>
+                                <w:t>SpringBoot</w:t>
+                              </w:r>
+                              <w:proofErr w:type="spellEnd"/>
                             </w:sdtContent>
                           </w:sdt>
                         </w:p>
@@ -4647,6 +4671,7 @@
         </w:rPr>
         <w:br/>
       </w:r>
+      <w:proofErr w:type="spellStart"/>
       <w:r>
         <w:rPr>
           <w:rFonts w:ascii="Courier New" w:eastAsia="Times New Roman" w:hAnsi="Courier New" w:cs="Courier New"/>
@@ -4655,18 +4680,42 @@
           <w:szCs w:val="20"/>
           <w:lang w:eastAsia="pt-BR"/>
         </w:rPr>
-        <w:t xml:space="preserve">public </w:t>
-      </w:r>
-      <w:r>
-        <w:rPr>
-          <w:rFonts w:ascii="Courier New" w:eastAsia="Times New Roman" w:hAnsi="Courier New" w:cs="Courier New"/>
-          <w:color w:val="BCBEC4"/>
-          <w:sz w:val="20"/>
-          <w:szCs w:val="20"/>
-          <w:lang w:eastAsia="pt-BR"/>
-        </w:rPr>
-        <w:t xml:space="preserve">ResponseEntity&lt;List&lt;Cliente&gt;&gt; </w:t>
-      </w:r>
+        <w:t>public</w:t>
+      </w:r>
+      <w:proofErr w:type="spellEnd"/>
+      <w:r>
+        <w:rPr>
+          <w:rFonts w:ascii="Courier New" w:eastAsia="Times New Roman" w:hAnsi="Courier New" w:cs="Courier New"/>
+          <w:color w:val="CF8E6D"/>
+          <w:sz w:val="20"/>
+          <w:szCs w:val="20"/>
+          <w:lang w:eastAsia="pt-BR"/>
+        </w:rPr>
+        <w:t xml:space="preserve"> </w:t>
+      </w:r>
+      <w:proofErr w:type="spellStart"/>
+      <w:r>
+        <w:rPr>
+          <w:rFonts w:ascii="Courier New" w:eastAsia="Times New Roman" w:hAnsi="Courier New" w:cs="Courier New"/>
+          <w:color w:val="BCBEC4"/>
+          <w:sz w:val="20"/>
+          <w:szCs w:val="20"/>
+          <w:lang w:eastAsia="pt-BR"/>
+        </w:rPr>
+        <w:t>ResponseEntity</w:t>
+      </w:r>
+      <w:proofErr w:type="spellEnd"/>
+      <w:r>
+        <w:rPr>
+          <w:rFonts w:ascii="Courier New" w:eastAsia="Times New Roman" w:hAnsi="Courier New" w:cs="Courier New"/>
+          <w:color w:val="BCBEC4"/>
+          <w:sz w:val="20"/>
+          <w:szCs w:val="20"/>
+          <w:lang w:eastAsia="pt-BR"/>
+        </w:rPr>
+        <w:t xml:space="preserve">&lt;List&lt;Cliente&gt;&gt; </w:t>
+      </w:r>
+      <w:proofErr w:type="spellStart"/>
       <w:r>
         <w:rPr>
           <w:rFonts w:ascii="Courier New" w:eastAsia="Times New Roman" w:hAnsi="Courier New" w:cs="Courier New"/>
@@ -4677,6 +4726,7 @@
         </w:rPr>
         <w:t>getAll</w:t>
       </w:r>
+      <w:proofErr w:type="spellEnd"/>
       <w:r>
         <w:rPr>
           <w:rFonts w:ascii="Courier New" w:eastAsia="Times New Roman" w:hAnsi="Courier New" w:cs="Courier New"/>
@@ -4698,6 +4748,7 @@
         <w:br/>
         <w:t xml:space="preserve">    </w:t>
       </w:r>
+      <w:proofErr w:type="spellStart"/>
       <w:r>
         <w:rPr>
           <w:rFonts w:ascii="Courier New" w:eastAsia="Times New Roman" w:hAnsi="Courier New" w:cs="Courier New"/>
@@ -4706,8 +4757,20 @@
           <w:szCs w:val="20"/>
           <w:lang w:eastAsia="pt-BR"/>
         </w:rPr>
-        <w:t xml:space="preserve">return </w:t>
-      </w:r>
+        <w:t>return</w:t>
+      </w:r>
+      <w:proofErr w:type="spellEnd"/>
+      <w:r>
+        <w:rPr>
+          <w:rFonts w:ascii="Courier New" w:eastAsia="Times New Roman" w:hAnsi="Courier New" w:cs="Courier New"/>
+          <w:color w:val="CF8E6D"/>
+          <w:sz w:val="20"/>
+          <w:szCs w:val="20"/>
+          <w:lang w:eastAsia="pt-BR"/>
+        </w:rPr>
+        <w:t xml:space="preserve"> </w:t>
+      </w:r>
+      <w:proofErr w:type="spellStart"/>
       <w:r>
         <w:rPr>
           <w:rFonts w:ascii="Courier New" w:eastAsia="Times New Roman" w:hAnsi="Courier New" w:cs="Courier New"/>
@@ -4730,6 +4793,7 @@
         </w:rPr>
         <w:t>ok</w:t>
       </w:r>
+      <w:proofErr w:type="spellEnd"/>
       <w:r>
         <w:rPr>
           <w:rFonts w:ascii="Courier New" w:eastAsia="Times New Roman" w:hAnsi="Courier New" w:cs="Courier New"/>
@@ -4740,6 +4804,7 @@
         </w:rPr>
         <w:t>().body(</w:t>
       </w:r>
+      <w:proofErr w:type="spellStart"/>
       <w:r>
         <w:rPr>
           <w:rFonts w:ascii="Courier New" w:eastAsia="Times New Roman" w:hAnsi="Courier New" w:cs="Courier New"/>
@@ -4758,7 +4823,18 @@
           <w:szCs w:val="20"/>
           <w:lang w:eastAsia="pt-BR"/>
         </w:rPr>
-        <w:t>.getAll());</w:t>
+        <w:t>.getAll</w:t>
+      </w:r>
+      <w:proofErr w:type="spellEnd"/>
+      <w:r>
+        <w:rPr>
+          <w:rFonts w:ascii="Courier New" w:eastAsia="Times New Roman" w:hAnsi="Courier New" w:cs="Courier New"/>
+          <w:color w:val="BCBEC4"/>
+          <w:sz w:val="20"/>
+          <w:szCs w:val="20"/>
+          <w:lang w:eastAsia="pt-BR"/>
+        </w:rPr>
+        <w:t>());</w:t>
       </w:r>
       <w:r>
         <w:rPr>
@@ -4790,6 +4866,9 @@
     </w:p>
     <w:p>
       <w:r>
+        <w:rPr>
+          <w:noProof/>
+        </w:rPr>
         <w:drawing>
           <wp:inline distT="0" distB="0" distL="0" distR="0" wp14:anchorId="115A47B5" wp14:editId="24C2A1D5">
             <wp:extent cx="6479540" cy="5695315"/>
@@ -4948,6 +5027,7 @@
         </w:rPr>
         <w:br/>
       </w:r>
+      <w:proofErr w:type="spellStart"/>
       <w:r>
         <w:rPr>
           <w:rFonts w:ascii="Courier New" w:eastAsia="Times New Roman" w:hAnsi="Courier New" w:cs="Courier New"/>
@@ -4956,18 +5036,42 @@
           <w:szCs w:val="20"/>
           <w:lang w:eastAsia="pt-BR"/>
         </w:rPr>
-        <w:t xml:space="preserve">public </w:t>
-      </w:r>
-      <w:r>
-        <w:rPr>
-          <w:rFonts w:ascii="Courier New" w:eastAsia="Times New Roman" w:hAnsi="Courier New" w:cs="Courier New"/>
-          <w:color w:val="BCBEC4"/>
-          <w:sz w:val="20"/>
-          <w:szCs w:val="20"/>
-          <w:lang w:eastAsia="pt-BR"/>
-        </w:rPr>
-        <w:t xml:space="preserve">ResponseEntity&lt;Cliente&gt; </w:t>
-      </w:r>
+        <w:t>public</w:t>
+      </w:r>
+      <w:proofErr w:type="spellEnd"/>
+      <w:r>
+        <w:rPr>
+          <w:rFonts w:ascii="Courier New" w:eastAsia="Times New Roman" w:hAnsi="Courier New" w:cs="Courier New"/>
+          <w:color w:val="CF8E6D"/>
+          <w:sz w:val="20"/>
+          <w:szCs w:val="20"/>
+          <w:lang w:eastAsia="pt-BR"/>
+        </w:rPr>
+        <w:t xml:space="preserve"> </w:t>
+      </w:r>
+      <w:proofErr w:type="spellStart"/>
+      <w:r>
+        <w:rPr>
+          <w:rFonts w:ascii="Courier New" w:eastAsia="Times New Roman" w:hAnsi="Courier New" w:cs="Courier New"/>
+          <w:color w:val="BCBEC4"/>
+          <w:sz w:val="20"/>
+          <w:szCs w:val="20"/>
+          <w:lang w:eastAsia="pt-BR"/>
+        </w:rPr>
+        <w:t>ResponseEntity</w:t>
+      </w:r>
+      <w:proofErr w:type="spellEnd"/>
+      <w:r>
+        <w:rPr>
+          <w:rFonts w:ascii="Courier New" w:eastAsia="Times New Roman" w:hAnsi="Courier New" w:cs="Courier New"/>
+          <w:color w:val="BCBEC4"/>
+          <w:sz w:val="20"/>
+          <w:szCs w:val="20"/>
+          <w:lang w:eastAsia="pt-BR"/>
+        </w:rPr>
+        <w:t xml:space="preserve">&lt;Cliente&gt; </w:t>
+      </w:r>
+      <w:proofErr w:type="spellStart"/>
       <w:r>
         <w:rPr>
           <w:rFonts w:ascii="Courier New" w:eastAsia="Times New Roman" w:hAnsi="Courier New" w:cs="Courier New"/>
@@ -4978,6 +5082,7 @@
         </w:rPr>
         <w:t>create</w:t>
       </w:r>
+      <w:proofErr w:type="spellEnd"/>
       <w:r>
         <w:rPr>
           <w:rFonts w:ascii="Courier New" w:eastAsia="Times New Roman" w:hAnsi="Courier New" w:cs="Courier New"/>
@@ -5006,7 +5111,29 @@
           <w:szCs w:val="20"/>
           <w:lang w:eastAsia="pt-BR"/>
         </w:rPr>
-        <w:t>Cliente obj) {</w:t>
+        <w:t xml:space="preserve">Cliente </w:t>
+      </w:r>
+      <w:proofErr w:type="spellStart"/>
+      <w:r>
+        <w:rPr>
+          <w:rFonts w:ascii="Courier New" w:eastAsia="Times New Roman" w:hAnsi="Courier New" w:cs="Courier New"/>
+          <w:color w:val="BCBEC4"/>
+          <w:sz w:val="20"/>
+          <w:szCs w:val="20"/>
+          <w:lang w:eastAsia="pt-BR"/>
+        </w:rPr>
+        <w:t>obj</w:t>
+      </w:r>
+      <w:proofErr w:type="spellEnd"/>
+      <w:r>
+        <w:rPr>
+          <w:rFonts w:ascii="Courier New" w:eastAsia="Times New Roman" w:hAnsi="Courier New" w:cs="Courier New"/>
+          <w:color w:val="BCBEC4"/>
+          <w:sz w:val="20"/>
+          <w:szCs w:val="20"/>
+          <w:lang w:eastAsia="pt-BR"/>
+        </w:rPr>
+        <w:t>) {</w:t>
       </w:r>
       <w:r>
         <w:rPr>
@@ -5019,6 +5146,7 @@
         <w:br/>
         <w:t xml:space="preserve">    </w:t>
       </w:r>
+      <w:proofErr w:type="spellStart"/>
       <w:r>
         <w:rPr>
           <w:rFonts w:ascii="Courier New" w:eastAsia="Times New Roman" w:hAnsi="Courier New" w:cs="Courier New"/>
@@ -5027,7 +5155,18 @@
           <w:szCs w:val="20"/>
           <w:lang w:eastAsia="pt-BR"/>
         </w:rPr>
-        <w:t xml:space="preserve">return </w:t>
+        <w:t>return</w:t>
+      </w:r>
+      <w:proofErr w:type="spellEnd"/>
+      <w:r>
+        <w:rPr>
+          <w:rFonts w:ascii="Courier New" w:eastAsia="Times New Roman" w:hAnsi="Courier New" w:cs="Courier New"/>
+          <w:color w:val="CF8E6D"/>
+          <w:sz w:val="20"/>
+          <w:szCs w:val="20"/>
+          <w:lang w:eastAsia="pt-BR"/>
+        </w:rPr>
+        <w:t xml:space="preserve"> </w:t>
       </w:r>
       <w:r>
         <w:rPr>
@@ -5296,6 +5435,7 @@
         </w:rPr>
         <w:br/>
       </w:r>
+      <w:proofErr w:type="spellStart"/>
       <w:r>
         <w:rPr>
           <w:rFonts w:ascii="Courier New" w:eastAsia="Times New Roman" w:hAnsi="Courier New" w:cs="Courier New"/>
@@ -5304,17 +5444,40 @@
           <w:szCs w:val="20"/>
           <w:lang w:eastAsia="pt-BR"/>
         </w:rPr>
-        <w:t xml:space="preserve">public </w:t>
-      </w:r>
-      <w:r>
-        <w:rPr>
-          <w:rFonts w:ascii="Courier New" w:eastAsia="Times New Roman" w:hAnsi="Courier New" w:cs="Courier New"/>
-          <w:color w:val="BCBEC4"/>
-          <w:sz w:val="20"/>
-          <w:szCs w:val="20"/>
-          <w:lang w:eastAsia="pt-BR"/>
-        </w:rPr>
-        <w:t xml:space="preserve">ResponseEntity&lt;Cliente&gt; </w:t>
+        <w:t>public</w:t>
+      </w:r>
+      <w:proofErr w:type="spellEnd"/>
+      <w:r>
+        <w:rPr>
+          <w:rFonts w:ascii="Courier New" w:eastAsia="Times New Roman" w:hAnsi="Courier New" w:cs="Courier New"/>
+          <w:color w:val="CF8E6D"/>
+          <w:sz w:val="20"/>
+          <w:szCs w:val="20"/>
+          <w:lang w:eastAsia="pt-BR"/>
+        </w:rPr>
+        <w:t xml:space="preserve"> </w:t>
+      </w:r>
+      <w:proofErr w:type="spellStart"/>
+      <w:r>
+        <w:rPr>
+          <w:rFonts w:ascii="Courier New" w:eastAsia="Times New Roman" w:hAnsi="Courier New" w:cs="Courier New"/>
+          <w:color w:val="BCBEC4"/>
+          <w:sz w:val="20"/>
+          <w:szCs w:val="20"/>
+          <w:lang w:eastAsia="pt-BR"/>
+        </w:rPr>
+        <w:t>ResponseEntity</w:t>
+      </w:r>
+      <w:proofErr w:type="spellEnd"/>
+      <w:r>
+        <w:rPr>
+          <w:rFonts w:ascii="Courier New" w:eastAsia="Times New Roman" w:hAnsi="Courier New" w:cs="Courier New"/>
+          <w:color w:val="BCBEC4"/>
+          <w:sz w:val="20"/>
+          <w:szCs w:val="20"/>
+          <w:lang w:eastAsia="pt-BR"/>
+        </w:rPr>
+        <w:t xml:space="preserve">&lt;Cliente&gt; </w:t>
       </w:r>
       <w:r>
         <w:rPr>
@@ -5346,15 +5509,27 @@
         </w:rPr>
         <w:t xml:space="preserve">@PathVariable </w:t>
       </w:r>
-      <w:r>
-        <w:rPr>
-          <w:rFonts w:ascii="Courier New" w:eastAsia="Times New Roman" w:hAnsi="Courier New" w:cs="Courier New"/>
-          <w:color w:val="BCBEC4"/>
-          <w:sz w:val="20"/>
-          <w:szCs w:val="20"/>
-          <w:lang w:eastAsia="pt-BR"/>
-        </w:rPr>
-        <w:t xml:space="preserve">Long id, </w:t>
+      <w:proofErr w:type="spellStart"/>
+      <w:r>
+        <w:rPr>
+          <w:rFonts w:ascii="Courier New" w:eastAsia="Times New Roman" w:hAnsi="Courier New" w:cs="Courier New"/>
+          <w:color w:val="BCBEC4"/>
+          <w:sz w:val="20"/>
+          <w:szCs w:val="20"/>
+          <w:lang w:eastAsia="pt-BR"/>
+        </w:rPr>
+        <w:t>Long</w:t>
+      </w:r>
+      <w:proofErr w:type="spellEnd"/>
+      <w:r>
+        <w:rPr>
+          <w:rFonts w:ascii="Courier New" w:eastAsia="Times New Roman" w:hAnsi="Courier New" w:cs="Courier New"/>
+          <w:color w:val="BCBEC4"/>
+          <w:sz w:val="20"/>
+          <w:szCs w:val="20"/>
+          <w:lang w:eastAsia="pt-BR"/>
+        </w:rPr>
+        <w:t xml:space="preserve"> id, </w:t>
       </w:r>
       <w:r>
         <w:rPr>
@@ -5374,18 +5549,29 @@
           <w:szCs w:val="20"/>
           <w:lang w:eastAsia="pt-BR"/>
         </w:rPr>
-        <w:t>Cliente obj) {</w:t>
-      </w:r>
-      <w:r>
-        <w:rPr>
-          <w:rFonts w:ascii="Courier New" w:eastAsia="Times New Roman" w:hAnsi="Courier New" w:cs="Courier New"/>
-          <w:color w:val="BCBEC4"/>
-          <w:sz w:val="20"/>
-          <w:szCs w:val="20"/>
-          <w:lang w:eastAsia="pt-BR"/>
-        </w:rPr>
-        <w:br/>
-        <w:t xml:space="preserve">    obj.setId(id);</w:t>
+        <w:t xml:space="preserve">Cliente </w:t>
+      </w:r>
+      <w:proofErr w:type="spellStart"/>
+      <w:r>
+        <w:rPr>
+          <w:rFonts w:ascii="Courier New" w:eastAsia="Times New Roman" w:hAnsi="Courier New" w:cs="Courier New"/>
+          <w:color w:val="BCBEC4"/>
+          <w:sz w:val="20"/>
+          <w:szCs w:val="20"/>
+          <w:lang w:eastAsia="pt-BR"/>
+        </w:rPr>
+        <w:t>obj</w:t>
+      </w:r>
+      <w:proofErr w:type="spellEnd"/>
+      <w:r>
+        <w:rPr>
+          <w:rFonts w:ascii="Courier New" w:eastAsia="Times New Roman" w:hAnsi="Courier New" w:cs="Courier New"/>
+          <w:color w:val="BCBEC4"/>
+          <w:sz w:val="20"/>
+          <w:szCs w:val="20"/>
+          <w:lang w:eastAsia="pt-BR"/>
+        </w:rPr>
+        <w:t>) {</w:t>
       </w:r>
       <w:r>
         <w:rPr>
@@ -5398,6 +5584,40 @@
         <w:br/>
         <w:t xml:space="preserve">    </w:t>
       </w:r>
+      <w:proofErr w:type="spellStart"/>
+      <w:r>
+        <w:rPr>
+          <w:rFonts w:ascii="Courier New" w:eastAsia="Times New Roman" w:hAnsi="Courier New" w:cs="Courier New"/>
+          <w:color w:val="BCBEC4"/>
+          <w:sz w:val="20"/>
+          <w:szCs w:val="20"/>
+          <w:lang w:eastAsia="pt-BR"/>
+        </w:rPr>
+        <w:t>obj.setId</w:t>
+      </w:r>
+      <w:proofErr w:type="spellEnd"/>
+      <w:r>
+        <w:rPr>
+          <w:rFonts w:ascii="Courier New" w:eastAsia="Times New Roman" w:hAnsi="Courier New" w:cs="Courier New"/>
+          <w:color w:val="BCBEC4"/>
+          <w:sz w:val="20"/>
+          <w:szCs w:val="20"/>
+          <w:lang w:eastAsia="pt-BR"/>
+        </w:rPr>
+        <w:t>(id);</w:t>
+      </w:r>
+      <w:r>
+        <w:rPr>
+          <w:rFonts w:ascii="Courier New" w:eastAsia="Times New Roman" w:hAnsi="Courier New" w:cs="Courier New"/>
+          <w:color w:val="BCBEC4"/>
+          <w:sz w:val="20"/>
+          <w:szCs w:val="20"/>
+          <w:lang w:eastAsia="pt-BR"/>
+        </w:rPr>
+        <w:br/>
+        <w:t xml:space="preserve">    </w:t>
+      </w:r>
+      <w:proofErr w:type="spellStart"/>
       <w:r>
         <w:rPr>
           <w:rFonts w:ascii="Courier New" w:eastAsia="Times New Roman" w:hAnsi="Courier New" w:cs="Courier New"/>
@@ -5406,8 +5626,20 @@
           <w:szCs w:val="20"/>
           <w:lang w:eastAsia="pt-BR"/>
         </w:rPr>
-        <w:t xml:space="preserve">return </w:t>
-      </w:r>
+        <w:t>return</w:t>
+      </w:r>
+      <w:proofErr w:type="spellEnd"/>
+      <w:r>
+        <w:rPr>
+          <w:rFonts w:ascii="Courier New" w:eastAsia="Times New Roman" w:hAnsi="Courier New" w:cs="Courier New"/>
+          <w:color w:val="CF8E6D"/>
+          <w:sz w:val="20"/>
+          <w:szCs w:val="20"/>
+          <w:lang w:eastAsia="pt-BR"/>
+        </w:rPr>
+        <w:t xml:space="preserve"> </w:t>
+      </w:r>
+      <w:proofErr w:type="spellStart"/>
       <w:r>
         <w:rPr>
           <w:rFonts w:ascii="Courier New" w:eastAsia="Times New Roman" w:hAnsi="Courier New" w:cs="Courier New"/>
@@ -5430,6 +5662,7 @@
         </w:rPr>
         <w:t>ok</w:t>
       </w:r>
+      <w:proofErr w:type="spellEnd"/>
       <w:r>
         <w:rPr>
           <w:rFonts w:ascii="Courier New" w:eastAsia="Times New Roman" w:hAnsi="Courier New" w:cs="Courier New"/>
@@ -5440,6 +5673,7 @@
         </w:rPr>
         <w:t>().body(</w:t>
       </w:r>
+      <w:proofErr w:type="spellStart"/>
       <w:r>
         <w:rPr>
           <w:rFonts w:ascii="Courier New" w:eastAsia="Times New Roman" w:hAnsi="Courier New" w:cs="Courier New"/>
@@ -5458,7 +5692,40 @@
           <w:szCs w:val="20"/>
           <w:lang w:eastAsia="pt-BR"/>
         </w:rPr>
-        <w:t>.update(obj));</w:t>
+        <w:t>.update</w:t>
+      </w:r>
+      <w:proofErr w:type="spellEnd"/>
+      <w:r>
+        <w:rPr>
+          <w:rFonts w:ascii="Courier New" w:eastAsia="Times New Roman" w:hAnsi="Courier New" w:cs="Courier New"/>
+          <w:color w:val="BCBEC4"/>
+          <w:sz w:val="20"/>
+          <w:szCs w:val="20"/>
+          <w:lang w:eastAsia="pt-BR"/>
+        </w:rPr>
+        <w:t>(</w:t>
+      </w:r>
+      <w:proofErr w:type="spellStart"/>
+      <w:r>
+        <w:rPr>
+          <w:rFonts w:ascii="Courier New" w:eastAsia="Times New Roman" w:hAnsi="Courier New" w:cs="Courier New"/>
+          <w:color w:val="BCBEC4"/>
+          <w:sz w:val="20"/>
+          <w:szCs w:val="20"/>
+          <w:lang w:eastAsia="pt-BR"/>
+        </w:rPr>
+        <w:t>obj</w:t>
+      </w:r>
+      <w:proofErr w:type="spellEnd"/>
+      <w:r>
+        <w:rPr>
+          <w:rFonts w:ascii="Courier New" w:eastAsia="Times New Roman" w:hAnsi="Courier New" w:cs="Courier New"/>
+          <w:color w:val="BCBEC4"/>
+          <w:sz w:val="20"/>
+          <w:szCs w:val="20"/>
+          <w:lang w:eastAsia="pt-BR"/>
+        </w:rPr>
+        <w:t>));</w:t>
       </w:r>
       <w:r>
         <w:rPr>
@@ -5654,6 +5921,7 @@
         </w:rPr>
         <w:br/>
       </w:r>
+      <w:proofErr w:type="spellStart"/>
       <w:r>
         <w:rPr>
           <w:rFonts w:ascii="Courier New" w:eastAsia="Times New Roman" w:hAnsi="Courier New" w:cs="Courier New"/>
@@ -5662,17 +5930,40 @@
           <w:szCs w:val="20"/>
           <w:lang w:eastAsia="pt-BR"/>
         </w:rPr>
-        <w:t xml:space="preserve">public </w:t>
-      </w:r>
-      <w:r>
-        <w:rPr>
-          <w:rFonts w:ascii="Courier New" w:eastAsia="Times New Roman" w:hAnsi="Courier New" w:cs="Courier New"/>
-          <w:color w:val="BCBEC4"/>
-          <w:sz w:val="20"/>
-          <w:szCs w:val="20"/>
-          <w:lang w:eastAsia="pt-BR"/>
-        </w:rPr>
-        <w:t xml:space="preserve">ResponseEntity&lt;Void&gt; </w:t>
+        <w:t>public</w:t>
+      </w:r>
+      <w:proofErr w:type="spellEnd"/>
+      <w:r>
+        <w:rPr>
+          <w:rFonts w:ascii="Courier New" w:eastAsia="Times New Roman" w:hAnsi="Courier New" w:cs="Courier New"/>
+          <w:color w:val="CF8E6D"/>
+          <w:sz w:val="20"/>
+          <w:szCs w:val="20"/>
+          <w:lang w:eastAsia="pt-BR"/>
+        </w:rPr>
+        <w:t xml:space="preserve"> </w:t>
+      </w:r>
+      <w:proofErr w:type="spellStart"/>
+      <w:r>
+        <w:rPr>
+          <w:rFonts w:ascii="Courier New" w:eastAsia="Times New Roman" w:hAnsi="Courier New" w:cs="Courier New"/>
+          <w:color w:val="BCBEC4"/>
+          <w:sz w:val="20"/>
+          <w:szCs w:val="20"/>
+          <w:lang w:eastAsia="pt-BR"/>
+        </w:rPr>
+        <w:t>ResponseEntity</w:t>
+      </w:r>
+      <w:proofErr w:type="spellEnd"/>
+      <w:r>
+        <w:rPr>
+          <w:rFonts w:ascii="Courier New" w:eastAsia="Times New Roman" w:hAnsi="Courier New" w:cs="Courier New"/>
+          <w:color w:val="BCBEC4"/>
+          <w:sz w:val="20"/>
+          <w:szCs w:val="20"/>
+          <w:lang w:eastAsia="pt-BR"/>
+        </w:rPr>
+        <w:t xml:space="preserve">&lt;Void&gt; </w:t>
       </w:r>
       <w:r>
         <w:rPr>
@@ -5704,15 +5995,27 @@
         </w:rPr>
         <w:t xml:space="preserve">@PathVariable </w:t>
       </w:r>
-      <w:r>
-        <w:rPr>
-          <w:rFonts w:ascii="Courier New" w:eastAsia="Times New Roman" w:hAnsi="Courier New" w:cs="Courier New"/>
-          <w:color w:val="BCBEC4"/>
-          <w:sz w:val="20"/>
-          <w:szCs w:val="20"/>
-          <w:lang w:eastAsia="pt-BR"/>
-        </w:rPr>
-        <w:t>Long id) {</w:t>
+      <w:proofErr w:type="spellStart"/>
+      <w:r>
+        <w:rPr>
+          <w:rFonts w:ascii="Courier New" w:eastAsia="Times New Roman" w:hAnsi="Courier New" w:cs="Courier New"/>
+          <w:color w:val="BCBEC4"/>
+          <w:sz w:val="20"/>
+          <w:szCs w:val="20"/>
+          <w:lang w:eastAsia="pt-BR"/>
+        </w:rPr>
+        <w:t>Long</w:t>
+      </w:r>
+      <w:proofErr w:type="spellEnd"/>
+      <w:r>
+        <w:rPr>
+          <w:rFonts w:ascii="Courier New" w:eastAsia="Times New Roman" w:hAnsi="Courier New" w:cs="Courier New"/>
+          <w:color w:val="BCBEC4"/>
+          <w:sz w:val="20"/>
+          <w:szCs w:val="20"/>
+          <w:lang w:eastAsia="pt-BR"/>
+        </w:rPr>
+        <w:t xml:space="preserve"> id) {</w:t>
       </w:r>
       <w:r>
         <w:rPr>
@@ -5725,6 +6028,7 @@
         <w:br/>
         <w:t xml:space="preserve">    </w:t>
       </w:r>
+      <w:proofErr w:type="spellStart"/>
       <w:r>
         <w:rPr>
           <w:rFonts w:ascii="Courier New" w:eastAsia="Times New Roman" w:hAnsi="Courier New" w:cs="Courier New"/>
@@ -5743,7 +6047,18 @@
           <w:szCs w:val="20"/>
           <w:lang w:eastAsia="pt-BR"/>
         </w:rPr>
-        <w:t>.delete(id);</w:t>
+        <w:t>.delete</w:t>
+      </w:r>
+      <w:proofErr w:type="spellEnd"/>
+      <w:r>
+        <w:rPr>
+          <w:rFonts w:ascii="Courier New" w:eastAsia="Times New Roman" w:hAnsi="Courier New" w:cs="Courier New"/>
+          <w:color w:val="BCBEC4"/>
+          <w:sz w:val="20"/>
+          <w:szCs w:val="20"/>
+          <w:lang w:eastAsia="pt-BR"/>
+        </w:rPr>
+        <w:t>(id);</w:t>
       </w:r>
       <w:r>
         <w:rPr>
@@ -5756,6 +6071,7 @@
         <w:br/>
         <w:t xml:space="preserve">    </w:t>
       </w:r>
+      <w:proofErr w:type="spellStart"/>
       <w:r>
         <w:rPr>
           <w:rFonts w:ascii="Courier New" w:eastAsia="Times New Roman" w:hAnsi="Courier New" w:cs="Courier New"/>
@@ -5764,8 +6080,20 @@
           <w:szCs w:val="20"/>
           <w:lang w:eastAsia="pt-BR"/>
         </w:rPr>
-        <w:t xml:space="preserve">return </w:t>
-      </w:r>
+        <w:t>return</w:t>
+      </w:r>
+      <w:proofErr w:type="spellEnd"/>
+      <w:r>
+        <w:rPr>
+          <w:rFonts w:ascii="Courier New" w:eastAsia="Times New Roman" w:hAnsi="Courier New" w:cs="Courier New"/>
+          <w:color w:val="CF8E6D"/>
+          <w:sz w:val="20"/>
+          <w:szCs w:val="20"/>
+          <w:lang w:eastAsia="pt-BR"/>
+        </w:rPr>
+        <w:t xml:space="preserve"> </w:t>
+      </w:r>
+      <w:proofErr w:type="spellStart"/>
       <w:r>
         <w:rPr>
           <w:rFonts w:ascii="Courier New" w:eastAsia="Times New Roman" w:hAnsi="Courier New" w:cs="Courier New"/>
@@ -5788,6 +6116,7 @@
         </w:rPr>
         <w:t>noContent</w:t>
       </w:r>
+      <w:proofErr w:type="spellEnd"/>
       <w:r>
         <w:rPr>
           <w:rFonts w:ascii="Courier New" w:eastAsia="Times New Roman" w:hAnsi="Courier New" w:cs="Courier New"/>
@@ -5828,6 +6157,9 @@
     </w:p>
     <w:p>
       <w:r>
+        <w:rPr>
+          <w:noProof/>
+        </w:rPr>
         <w:drawing>
           <wp:inline distT="0" distB="0" distL="0" distR="0" wp14:anchorId="10F9E5F4" wp14:editId="0626EE19">
             <wp:extent cx="6479540" cy="5032375"/>
@@ -5870,12 +6202,36 @@
         <w:pStyle w:val="Ttulo1"/>
       </w:pPr>
       <w:r>
-        <w:t>Quais as principais semelhanças entre os bancos de dados Redis e MongoDB?</w:t>
-      </w:r>
-    </w:p>
-    <w:p>
-      <w:r>
-        <w:t>Redis e MongoDB são NoSQL, flexíveis, escaláveis, de alta performance, replicáveis e bem integrados a ecossistemas modernos, embora cada um seja otimizado para um caso de uso diferente</w:t>
+        <w:t xml:space="preserve">Quais as principais semelhanças entre os bancos de dados Redis e </w:t>
+      </w:r>
+      <w:proofErr w:type="spellStart"/>
+      <w:r>
+        <w:t>MongoDB</w:t>
+      </w:r>
+      <w:proofErr w:type="spellEnd"/>
+      <w:r>
+        <w:t>?</w:t>
+      </w:r>
+    </w:p>
+    <w:p>
+      <w:r>
+        <w:t xml:space="preserve">Redis e </w:t>
+      </w:r>
+      <w:proofErr w:type="spellStart"/>
+      <w:r>
+        <w:t>MongoDB</w:t>
+      </w:r>
+      <w:proofErr w:type="spellEnd"/>
+      <w:r>
+        <w:t xml:space="preserve"> são </w:t>
+      </w:r>
+      <w:proofErr w:type="spellStart"/>
+      <w:r>
+        <w:t>NoSQL</w:t>
+      </w:r>
+      <w:proofErr w:type="spellEnd"/>
+      <w:r>
+        <w:t>, flexíveis, escaláveis, de alta performance, replicáveis e bem integrados a ecossistemas modernos, embora cada um seja otimizado para um caso de uso diferente</w:t>
       </w:r>
       <w:r>
         <w:t xml:space="preserve"> (</w:t>
@@ -5892,8 +6248,13 @@
       <w:r>
         <w:t xml:space="preserve"> e </w:t>
       </w:r>
-      <w:r>
-        <w:t>MongoDB mais para armazenamento persistente de documentos</w:t>
+      <w:proofErr w:type="spellStart"/>
+      <w:r>
+        <w:t>MongoDB</w:t>
+      </w:r>
+      <w:proofErr w:type="spellEnd"/>
+      <w:r>
+        <w:t xml:space="preserve"> mais para armazenamento persistente de documentos</w:t>
       </w:r>
       <w:r>
         <w:t>).</w:t>
@@ -5911,6 +6272,7 @@
           <w:bCs/>
         </w:rPr>
       </w:pPr>
+      <w:proofErr w:type="spellStart"/>
       <w:r>
         <w:rPr>
           <w:b/>
@@ -5918,10 +6280,19 @@
         </w:rPr>
         <w:t>NoSQL</w:t>
       </w:r>
-    </w:p>
-    <w:p>
-      <w:r>
-        <w:t>Ambos são classificados como bancos de dados NoSQL, ou seja, não seguem rigidamente o modelo relacional tradicional (tabelas, linhas, colunas).</w:t>
+      <w:proofErr w:type="spellEnd"/>
+    </w:p>
+    <w:p>
+      <w:r>
+        <w:t xml:space="preserve">Ambos são classificados como bancos de dados </w:t>
+      </w:r>
+      <w:proofErr w:type="spellStart"/>
+      <w:r>
+        <w:t>NoSQL</w:t>
+      </w:r>
+      <w:proofErr w:type="spellEnd"/>
+      <w:r>
+        <w:t>, ou seja, não seguem rigidamente o modelo relacional tradicional (tabelas, linhas, colunas).</w:t>
       </w:r>
     </w:p>
     <w:p>
@@ -5959,8 +6330,13 @@
       </w:r>
     </w:p>
     <w:p>
-      <w:r>
-        <w:t xml:space="preserve">MongoDB </w:t>
+      <w:proofErr w:type="spellStart"/>
+      <w:r>
+        <w:t>MongoDB</w:t>
+      </w:r>
+      <w:proofErr w:type="spellEnd"/>
+      <w:r>
+        <w:t xml:space="preserve"> </w:t>
       </w:r>
       <w:r>
         <w:t xml:space="preserve">com grandes volumes de </w:t>
@@ -5998,7 +6374,23 @@
     <w:p>
       <w:r>
         <w:lastRenderedPageBreak/>
-        <w:t>Tanto Redis quanto MongoDB oferecem mecanismos de sharding (particionamento de dados) e replicação, permitindo escalar para lidar com grandes quantidades de dados e múltiplos usuários simultâneos.</w:t>
+        <w:t xml:space="preserve">Tanto Redis quanto </w:t>
+      </w:r>
+      <w:proofErr w:type="spellStart"/>
+      <w:r>
+        <w:t>MongoDB</w:t>
+      </w:r>
+      <w:proofErr w:type="spellEnd"/>
+      <w:r>
+        <w:t xml:space="preserve"> oferecem mecanismos de </w:t>
+      </w:r>
+      <w:proofErr w:type="spellStart"/>
+      <w:r>
+        <w:t>sharding</w:t>
+      </w:r>
+      <w:proofErr w:type="spellEnd"/>
+      <w:r>
+        <w:t xml:space="preserve"> (particionamento de dados) e replicação, permitindo escalar para lidar com grandes quantidades de dados e múltiplos usuários simultâneos.</w:t>
       </w:r>
     </w:p>
     <w:p>
@@ -6049,12 +6441,44 @@
           <w:b/>
           <w:bCs/>
         </w:rPr>
-        <w:t>Open Source e grande comunidade</w:t>
-      </w:r>
-    </w:p>
-    <w:p>
-      <w:r>
-        <w:t>Ambos têm versões open source e versões enterprise, além de ampla documentação e suporte em comunidades.</w:t>
+        <w:t xml:space="preserve">Open </w:t>
+      </w:r>
+      <w:proofErr w:type="spellStart"/>
+      <w:r>
+        <w:rPr>
+          <w:b/>
+          <w:bCs/>
+        </w:rPr>
+        <w:t>Source</w:t>
+      </w:r>
+      <w:proofErr w:type="spellEnd"/>
+      <w:r>
+        <w:rPr>
+          <w:b/>
+          <w:bCs/>
+        </w:rPr>
+        <w:t xml:space="preserve"> e grande comunidade</w:t>
+      </w:r>
+    </w:p>
+    <w:p>
+      <w:r>
+        <w:t xml:space="preserve">Ambos têm versões open </w:t>
+      </w:r>
+      <w:proofErr w:type="spellStart"/>
+      <w:r>
+        <w:t>source</w:t>
+      </w:r>
+      <w:proofErr w:type="spellEnd"/>
+      <w:r>
+        <w:t xml:space="preserve"> e versões </w:t>
+      </w:r>
+      <w:proofErr w:type="spellStart"/>
+      <w:r>
+        <w:t>enterprise</w:t>
+      </w:r>
+      <w:proofErr w:type="spellEnd"/>
+      <w:r>
+        <w:t>, além de ampla documentação e suporte em comunidades.</w:t>
       </w:r>
     </w:p>
     <w:p>
@@ -6079,7 +6503,15 @@
     </w:p>
     <w:p>
       <w:r>
-        <w:t>Muito usados em arquiteturas de microserviços, aplicações web e mobile.</w:t>
+        <w:t xml:space="preserve">Muito usados em arquiteturas de </w:t>
+      </w:r>
+      <w:proofErr w:type="spellStart"/>
+      <w:r>
+        <w:t>microserviços</w:t>
+      </w:r>
+      <w:proofErr w:type="spellEnd"/>
+      <w:r>
+        <w:t>, aplicações web e mobile.</w:t>
       </w:r>
     </w:p>
     <w:p>
@@ -6109,7 +6541,15 @@
     </w:p>
     <w:p>
       <w:r>
-        <w:t>Redis e MongoDB oferecem mecanismos de replicação de dados para garantir alta disponibilidade e recuperação em caso de falha.</w:t>
+        <w:t xml:space="preserve">Redis e </w:t>
+      </w:r>
+      <w:proofErr w:type="spellStart"/>
+      <w:r>
+        <w:t>MongoDB</w:t>
+      </w:r>
+      <w:proofErr w:type="spellEnd"/>
+      <w:r>
+        <w:t xml:space="preserve"> oferecem mecanismos de replicação de dados para garantir alta disponibilidade e recuperação em caso de falha.</w:t>
       </w:r>
     </w:p>
     <w:p>
@@ -6117,7 +6557,15 @@
         <w:pStyle w:val="Ttulo1"/>
       </w:pPr>
       <w:r>
-        <w:t>Quais as principais diferenças entre os bancos de dados Redis e MongoDB?</w:t>
+        <w:t xml:space="preserve">Quais as principais diferenças entre os bancos de dados Redis e </w:t>
+      </w:r>
+      <w:proofErr w:type="spellStart"/>
+      <w:r>
+        <w:t>MongoDB</w:t>
+      </w:r>
+      <w:proofErr w:type="spellEnd"/>
+      <w:r>
+        <w:t>?</w:t>
       </w:r>
     </w:p>
     <w:tbl>
@@ -6222,6 +6670,7 @@
                 <w:bCs/>
               </w:rPr>
             </w:pPr>
+            <w:proofErr w:type="spellStart"/>
             <w:r>
               <w:rPr>
                 <w:b/>
@@ -6229,6 +6678,7 @@
               </w:rPr>
               <w:t>In-memory</w:t>
             </w:r>
+            <w:proofErr w:type="spellEnd"/>
             <w:r>
               <w:t xml:space="preserve"> (dados ficam na memória RAM, podendo persistir opcionalmente em disco).</w:t>
             </w:r>
@@ -6403,7 +6853,15 @@
               <w:t xml:space="preserve">Possui linguagem de consultas avançada </w:t>
             </w:r>
             <w:r>
-              <w:t>(filtros, agregações, buscas textuais, geoespaciais, etc.).</w:t>
+              <w:t xml:space="preserve">(filtros, agregações, buscas textuais, </w:t>
+            </w:r>
+            <w:proofErr w:type="spellStart"/>
+            <w:r>
+              <w:t>geoespaciais</w:t>
+            </w:r>
+            <w:proofErr w:type="spellEnd"/>
+            <w:r>
+              <w:t>, etc.).</w:t>
             </w:r>
           </w:p>
         </w:tc>
@@ -6440,8 +6898,13 @@
           </w:tcPr>
           <w:p>
             <w:r>
-              <w:t>Suporta replicação e sharding</w:t>
+              <w:t xml:space="preserve">Suporta replicação e </w:t>
             </w:r>
+            <w:proofErr w:type="spellStart"/>
+            <w:r>
+              <w:t>sharding</w:t>
+            </w:r>
+            <w:proofErr w:type="spellEnd"/>
             <w:r>
               <w:t xml:space="preserve">, </w:t>
             </w:r>
@@ -6459,11 +6922,16 @@
             <w:hideMark/>
           </w:tcPr>
           <w:p>
+            <w:proofErr w:type="spellStart"/>
             <w:r>
               <w:t>S</w:t>
             </w:r>
             <w:r>
-              <w:t xml:space="preserve">harding massivo, suportando grandes </w:t>
+              <w:t>harding</w:t>
+            </w:r>
+            <w:proofErr w:type="spellEnd"/>
+            <w:r>
+              <w:t xml:space="preserve"> massivo, suportando grandes </w:t>
             </w:r>
             <w:r>
               <w:t>bancos distribuídos globalmente.</w:t>
@@ -6519,6 +6987,7 @@
             <w:r>
               <w:t xml:space="preserve">ocumentos grandes, aninhados, coleções massivas e relacionamentos via </w:t>
             </w:r>
+            <w:proofErr w:type="spellStart"/>
             <w:r>
               <w:rPr>
                 <w:i/>
@@ -6526,9 +6995,11 @@
               </w:rPr>
               <w:t>embeds</w:t>
             </w:r>
+            <w:proofErr w:type="spellEnd"/>
             <w:r>
               <w:t xml:space="preserve"> ou </w:t>
             </w:r>
+            <w:proofErr w:type="spellStart"/>
             <w:r>
               <w:rPr>
                 <w:i/>
@@ -6536,6 +7007,7 @@
               </w:rPr>
               <w:t>references</w:t>
             </w:r>
+            <w:proofErr w:type="spellEnd"/>
             <w:r>
               <w:t>.</w:t>
             </w:r>
@@ -6666,14 +7138,13 @@
       </w:r>
     </w:p>
     <w:p>
-      <w:r>
-        <w:t>JUnit 5</w:t>
-      </w:r>
-      <w:r>
-        <w:t xml:space="preserve"> </w:t>
-      </w:r>
-      <w:r>
-        <w:t>o framework padrão de testes unitários em Java.</w:t>
+      <w:proofErr w:type="spellStart"/>
+      <w:r>
+        <w:t>JUnit</w:t>
+      </w:r>
+      <w:proofErr w:type="spellEnd"/>
+      <w:r>
+        <w:t xml:space="preserve"> 5 o framework padrão de testes unitários em Java.</w:t>
       </w:r>
     </w:p>
     <w:p>
@@ -6741,6 +7212,7 @@
         </w:rPr>
         <w:t xml:space="preserve">void </w:t>
       </w:r>
+      <w:proofErr w:type="spellStart"/>
       <w:r>
         <w:rPr>
           <w:rFonts w:ascii="Courier New" w:eastAsia="Times New Roman" w:hAnsi="Courier New" w:cs="Courier New"/>
@@ -6751,6 +7223,7 @@
         </w:rPr>
         <w:t>testCreateCliente</w:t>
       </w:r>
+      <w:proofErr w:type="spellEnd"/>
       <w:r>
         <w:rPr>
           <w:rFonts w:ascii="Courier New" w:eastAsia="Times New Roman" w:hAnsi="Courier New" w:cs="Courier New"/>
@@ -6761,6 +7234,7 @@
         </w:rPr>
         <w:t xml:space="preserve">() </w:t>
       </w:r>
+      <w:proofErr w:type="spellStart"/>
       <w:r>
         <w:rPr>
           <w:rFonts w:ascii="Courier New" w:eastAsia="Times New Roman" w:hAnsi="Courier New" w:cs="Courier New"/>
@@ -6769,17 +7243,40 @@
           <w:szCs w:val="20"/>
           <w:lang w:eastAsia="pt-BR"/>
         </w:rPr>
-        <w:t xml:space="preserve">throws </w:t>
-      </w:r>
-      <w:r>
-        <w:rPr>
-          <w:rFonts w:ascii="Courier New" w:eastAsia="Times New Roman" w:hAnsi="Courier New" w:cs="Courier New"/>
-          <w:color w:val="BCBEC4"/>
-          <w:sz w:val="20"/>
-          <w:szCs w:val="20"/>
-          <w:lang w:eastAsia="pt-BR"/>
-        </w:rPr>
-        <w:t>Exception {</w:t>
+        <w:t>throws</w:t>
+      </w:r>
+      <w:proofErr w:type="spellEnd"/>
+      <w:r>
+        <w:rPr>
+          <w:rFonts w:ascii="Courier New" w:eastAsia="Times New Roman" w:hAnsi="Courier New" w:cs="Courier New"/>
+          <w:color w:val="CF8E6D"/>
+          <w:sz w:val="20"/>
+          <w:szCs w:val="20"/>
+          <w:lang w:eastAsia="pt-BR"/>
+        </w:rPr>
+        <w:t xml:space="preserve"> </w:t>
+      </w:r>
+      <w:proofErr w:type="spellStart"/>
+      <w:r>
+        <w:rPr>
+          <w:rFonts w:ascii="Courier New" w:eastAsia="Times New Roman" w:hAnsi="Courier New" w:cs="Courier New"/>
+          <w:color w:val="BCBEC4"/>
+          <w:sz w:val="20"/>
+          <w:szCs w:val="20"/>
+          <w:lang w:eastAsia="pt-BR"/>
+        </w:rPr>
+        <w:t>Exception</w:t>
+      </w:r>
+      <w:proofErr w:type="spellEnd"/>
+      <w:r>
+        <w:rPr>
+          <w:rFonts w:ascii="Courier New" w:eastAsia="Times New Roman" w:hAnsi="Courier New" w:cs="Courier New"/>
+          <w:color w:val="BCBEC4"/>
+          <w:sz w:val="20"/>
+          <w:szCs w:val="20"/>
+          <w:lang w:eastAsia="pt-BR"/>
+        </w:rPr>
+        <w:t xml:space="preserve"> {</w:t>
       </w:r>
       <w:r>
         <w:rPr>
@@ -6814,6 +7311,7 @@
         </w:rPr>
         <w:t>(</w:t>
       </w:r>
+      <w:proofErr w:type="spellStart"/>
       <w:r>
         <w:rPr>
           <w:rFonts w:ascii="Courier New" w:eastAsia="Times New Roman" w:hAnsi="Courier New" w:cs="Courier New"/>
@@ -6832,7 +7330,18 @@
           <w:szCs w:val="20"/>
           <w:lang w:eastAsia="pt-BR"/>
         </w:rPr>
-        <w:t>.create(</w:t>
+        <w:t>.create</w:t>
+      </w:r>
+      <w:proofErr w:type="spellEnd"/>
+      <w:r>
+        <w:rPr>
+          <w:rFonts w:ascii="Courier New" w:eastAsia="Times New Roman" w:hAnsi="Courier New" w:cs="Courier New"/>
+          <w:color w:val="BCBEC4"/>
+          <w:sz w:val="20"/>
+          <w:szCs w:val="20"/>
+          <w:lang w:eastAsia="pt-BR"/>
+        </w:rPr>
+        <w:t>(</w:t>
       </w:r>
       <w:r>
         <w:rPr>
@@ -6854,7 +7363,18 @@
           <w:szCs w:val="20"/>
           <w:lang w:eastAsia="pt-BR"/>
         </w:rPr>
-        <w:t>(Cliente.</w:t>
+        <w:t>(</w:t>
+      </w:r>
+      <w:proofErr w:type="spellStart"/>
+      <w:r>
+        <w:rPr>
+          <w:rFonts w:ascii="Courier New" w:eastAsia="Times New Roman" w:hAnsi="Courier New" w:cs="Courier New"/>
+          <w:color w:val="BCBEC4"/>
+          <w:sz w:val="20"/>
+          <w:szCs w:val="20"/>
+          <w:lang w:eastAsia="pt-BR"/>
+        </w:rPr>
+        <w:t>Cliente.</w:t>
       </w:r>
       <w:r>
         <w:rPr>
@@ -6866,15 +7386,38 @@
         </w:rPr>
         <w:t>class</w:t>
       </w:r>
-      <w:r>
-        <w:rPr>
-          <w:rFonts w:ascii="Courier New" w:eastAsia="Times New Roman" w:hAnsi="Courier New" w:cs="Courier New"/>
-          <w:color w:val="BCBEC4"/>
-          <w:sz w:val="20"/>
-          <w:szCs w:val="20"/>
-          <w:lang w:eastAsia="pt-BR"/>
-        </w:rPr>
-        <w:t>))).thenReturn(</w:t>
+      <w:proofErr w:type="spellEnd"/>
+      <w:r>
+        <w:rPr>
+          <w:rFonts w:ascii="Courier New" w:eastAsia="Times New Roman" w:hAnsi="Courier New" w:cs="Courier New"/>
+          <w:color w:val="BCBEC4"/>
+          <w:sz w:val="20"/>
+          <w:szCs w:val="20"/>
+          <w:lang w:eastAsia="pt-BR"/>
+        </w:rPr>
+        <w:t>))).</w:t>
+      </w:r>
+      <w:proofErr w:type="spellStart"/>
+      <w:r>
+        <w:rPr>
+          <w:rFonts w:ascii="Courier New" w:eastAsia="Times New Roman" w:hAnsi="Courier New" w:cs="Courier New"/>
+          <w:color w:val="BCBEC4"/>
+          <w:sz w:val="20"/>
+          <w:szCs w:val="20"/>
+          <w:lang w:eastAsia="pt-BR"/>
+        </w:rPr>
+        <w:t>thenReturn</w:t>
+      </w:r>
+      <w:proofErr w:type="spellEnd"/>
+      <w:r>
+        <w:rPr>
+          <w:rFonts w:ascii="Courier New" w:eastAsia="Times New Roman" w:hAnsi="Courier New" w:cs="Courier New"/>
+          <w:color w:val="BCBEC4"/>
+          <w:sz w:val="20"/>
+          <w:szCs w:val="20"/>
+          <w:lang w:eastAsia="pt-BR"/>
+        </w:rPr>
+        <w:t>(</w:t>
       </w:r>
       <w:r>
         <w:rPr>
@@ -6917,6 +7460,7 @@
         <w:br/>
         <w:t xml:space="preserve">    </w:t>
       </w:r>
+      <w:proofErr w:type="spellStart"/>
       <w:r>
         <w:rPr>
           <w:rFonts w:ascii="Courier New" w:eastAsia="Times New Roman" w:hAnsi="Courier New" w:cs="Courier New"/>
@@ -6935,7 +7479,18 @@
           <w:szCs w:val="20"/>
           <w:lang w:eastAsia="pt-BR"/>
         </w:rPr>
-        <w:t>.perform(</w:t>
+        <w:t>.perform</w:t>
+      </w:r>
+      <w:proofErr w:type="spellEnd"/>
+      <w:r>
+        <w:rPr>
+          <w:rFonts w:ascii="Courier New" w:eastAsia="Times New Roman" w:hAnsi="Courier New" w:cs="Courier New"/>
+          <w:color w:val="BCBEC4"/>
+          <w:sz w:val="20"/>
+          <w:szCs w:val="20"/>
+          <w:lang w:eastAsia="pt-BR"/>
+        </w:rPr>
+        <w:t>(</w:t>
       </w:r>
       <w:r>
         <w:rPr>
@@ -6988,7 +7543,40 @@
           <w:lang w:eastAsia="pt-BR"/>
         </w:rPr>
         <w:br/>
-        <w:t xml:space="preserve">                    .contentType(MediaType.</w:t>
+        <w:t xml:space="preserve">                    .</w:t>
+      </w:r>
+      <w:proofErr w:type="spellStart"/>
+      <w:r>
+        <w:rPr>
+          <w:rFonts w:ascii="Courier New" w:eastAsia="Times New Roman" w:hAnsi="Courier New" w:cs="Courier New"/>
+          <w:color w:val="BCBEC4"/>
+          <w:sz w:val="20"/>
+          <w:szCs w:val="20"/>
+          <w:lang w:eastAsia="pt-BR"/>
+        </w:rPr>
+        <w:t>contentType</w:t>
+      </w:r>
+      <w:proofErr w:type="spellEnd"/>
+      <w:r>
+        <w:rPr>
+          <w:rFonts w:ascii="Courier New" w:eastAsia="Times New Roman" w:hAnsi="Courier New" w:cs="Courier New"/>
+          <w:color w:val="BCBEC4"/>
+          <w:sz w:val="20"/>
+          <w:szCs w:val="20"/>
+          <w:lang w:eastAsia="pt-BR"/>
+        </w:rPr>
+        <w:t>(</w:t>
+      </w:r>
+      <w:proofErr w:type="spellStart"/>
+      <w:r>
+        <w:rPr>
+          <w:rFonts w:ascii="Courier New" w:eastAsia="Times New Roman" w:hAnsi="Courier New" w:cs="Courier New"/>
+          <w:color w:val="BCBEC4"/>
+          <w:sz w:val="20"/>
+          <w:szCs w:val="20"/>
+          <w:lang w:eastAsia="pt-BR"/>
+        </w:rPr>
+        <w:t>MediaType.</w:t>
       </w:r>
       <w:r>
         <w:rPr>
@@ -7002,6 +7590,7 @@
         </w:rPr>
         <w:t>APPLICATION_JSON</w:t>
       </w:r>
+      <w:proofErr w:type="spellEnd"/>
       <w:r>
         <w:rPr>
           <w:rFonts w:ascii="Courier New" w:eastAsia="Times New Roman" w:hAnsi="Courier New" w:cs="Courier New"/>
@@ -7021,8 +7610,31 @@
           <w:lang w:eastAsia="pt-BR"/>
         </w:rPr>
         <w:br/>
-        <w:t xml:space="preserve">                    .content(</w:t>
-      </w:r>
+        <w:t xml:space="preserve">                    .</w:t>
+      </w:r>
+      <w:proofErr w:type="spellStart"/>
+      <w:r>
+        <w:rPr>
+          <w:rFonts w:ascii="Courier New" w:eastAsia="Times New Roman" w:hAnsi="Courier New" w:cs="Courier New"/>
+          <w:color w:val="BCBEC4"/>
+          <w:sz w:val="20"/>
+          <w:szCs w:val="20"/>
+          <w:lang w:eastAsia="pt-BR"/>
+        </w:rPr>
+        <w:t>content</w:t>
+      </w:r>
+      <w:proofErr w:type="spellEnd"/>
+      <w:r>
+        <w:rPr>
+          <w:rFonts w:ascii="Courier New" w:eastAsia="Times New Roman" w:hAnsi="Courier New" w:cs="Courier New"/>
+          <w:color w:val="BCBEC4"/>
+          <w:sz w:val="20"/>
+          <w:szCs w:val="20"/>
+          <w:lang w:eastAsia="pt-BR"/>
+        </w:rPr>
+        <w:t>(</w:t>
+      </w:r>
+      <w:proofErr w:type="spellStart"/>
       <w:r>
         <w:rPr>
           <w:rFonts w:ascii="Courier New" w:eastAsia="Times New Roman" w:hAnsi="Courier New" w:cs="Courier New"/>
@@ -7041,7 +7653,18 @@
           <w:szCs w:val="20"/>
           <w:lang w:eastAsia="pt-BR"/>
         </w:rPr>
-        <w:t>.writeValueAsString(</w:t>
+        <w:t>.writeValueAsString</w:t>
+      </w:r>
+      <w:proofErr w:type="spellEnd"/>
+      <w:r>
+        <w:rPr>
+          <w:rFonts w:ascii="Courier New" w:eastAsia="Times New Roman" w:hAnsi="Courier New" w:cs="Courier New"/>
+          <w:color w:val="BCBEC4"/>
+          <w:sz w:val="20"/>
+          <w:szCs w:val="20"/>
+          <w:lang w:eastAsia="pt-BR"/>
+        </w:rPr>
+        <w:t>(</w:t>
       </w:r>
       <w:r>
         <w:rPr>
@@ -7072,7 +7695,29 @@
           <w:lang w:eastAsia="pt-BR"/>
         </w:rPr>
         <w:br/>
-        <w:t xml:space="preserve">            .andExpect(</w:t>
+        <w:t xml:space="preserve">            .</w:t>
+      </w:r>
+      <w:proofErr w:type="spellStart"/>
+      <w:r>
+        <w:rPr>
+          <w:rFonts w:ascii="Courier New" w:eastAsia="Times New Roman" w:hAnsi="Courier New" w:cs="Courier New"/>
+          <w:color w:val="BCBEC4"/>
+          <w:sz w:val="20"/>
+          <w:szCs w:val="20"/>
+          <w:lang w:eastAsia="pt-BR"/>
+        </w:rPr>
+        <w:t>andExpect</w:t>
+      </w:r>
+      <w:proofErr w:type="spellEnd"/>
+      <w:r>
+        <w:rPr>
+          <w:rFonts w:ascii="Courier New" w:eastAsia="Times New Roman" w:hAnsi="Courier New" w:cs="Courier New"/>
+          <w:color w:val="BCBEC4"/>
+          <w:sz w:val="20"/>
+          <w:szCs w:val="20"/>
+          <w:lang w:eastAsia="pt-BR"/>
+        </w:rPr>
+        <w:t>(</w:t>
       </w:r>
       <w:r>
         <w:rPr>
@@ -7094,7 +7739,29 @@
           <w:szCs w:val="20"/>
           <w:lang w:eastAsia="pt-BR"/>
         </w:rPr>
-        <w:t>().isCreated())</w:t>
+        <w:t>().</w:t>
+      </w:r>
+      <w:proofErr w:type="spellStart"/>
+      <w:r>
+        <w:rPr>
+          <w:rFonts w:ascii="Courier New" w:eastAsia="Times New Roman" w:hAnsi="Courier New" w:cs="Courier New"/>
+          <w:color w:val="BCBEC4"/>
+          <w:sz w:val="20"/>
+          <w:szCs w:val="20"/>
+          <w:lang w:eastAsia="pt-BR"/>
+        </w:rPr>
+        <w:t>isCreated</w:t>
+      </w:r>
+      <w:proofErr w:type="spellEnd"/>
+      <w:r>
+        <w:rPr>
+          <w:rFonts w:ascii="Courier New" w:eastAsia="Times New Roman" w:hAnsi="Courier New" w:cs="Courier New"/>
+          <w:color w:val="BCBEC4"/>
+          <w:sz w:val="20"/>
+          <w:szCs w:val="20"/>
+          <w:lang w:eastAsia="pt-BR"/>
+        </w:rPr>
+        <w:t>())</w:t>
       </w:r>
       <w:r>
         <w:rPr>
@@ -7105,8 +7772,31 @@
           <w:lang w:eastAsia="pt-BR"/>
         </w:rPr>
         <w:br/>
-        <w:t xml:space="preserve">            .andExpect(</w:t>
-      </w:r>
+        <w:t xml:space="preserve">            .</w:t>
+      </w:r>
+      <w:proofErr w:type="spellStart"/>
+      <w:r>
+        <w:rPr>
+          <w:rFonts w:ascii="Courier New" w:eastAsia="Times New Roman" w:hAnsi="Courier New" w:cs="Courier New"/>
+          <w:color w:val="BCBEC4"/>
+          <w:sz w:val="20"/>
+          <w:szCs w:val="20"/>
+          <w:lang w:eastAsia="pt-BR"/>
+        </w:rPr>
+        <w:t>andExpect</w:t>
+      </w:r>
+      <w:proofErr w:type="spellEnd"/>
+      <w:r>
+        <w:rPr>
+          <w:rFonts w:ascii="Courier New" w:eastAsia="Times New Roman" w:hAnsi="Courier New" w:cs="Courier New"/>
+          <w:color w:val="BCBEC4"/>
+          <w:sz w:val="20"/>
+          <w:szCs w:val="20"/>
+          <w:lang w:eastAsia="pt-BR"/>
+        </w:rPr>
+        <w:t>(</w:t>
+      </w:r>
+      <w:proofErr w:type="spellStart"/>
       <w:r>
         <w:rPr>
           <w:rFonts w:ascii="Courier New" w:eastAsia="Times New Roman" w:hAnsi="Courier New" w:cs="Courier New"/>
@@ -7119,6 +7809,7 @@
         </w:rPr>
         <w:t>jsonPath</w:t>
       </w:r>
+      <w:proofErr w:type="spellEnd"/>
       <w:r>
         <w:rPr>
           <w:rFonts w:ascii="Courier New" w:eastAsia="Times New Roman" w:hAnsi="Courier New" w:cs="Courier New"/>
@@ -7211,6 +7902,7 @@
         <w:br/>
         <w:t xml:space="preserve">    </w:t>
       </w:r>
+      <w:proofErr w:type="spellStart"/>
       <w:r>
         <w:rPr>
           <w:rFonts w:ascii="Courier New" w:eastAsia="Times New Roman" w:hAnsi="Courier New" w:cs="Courier New"/>
@@ -7223,6 +7915,7 @@
         </w:rPr>
         <w:t>verify</w:t>
       </w:r>
+      <w:proofErr w:type="spellEnd"/>
       <w:r>
         <w:rPr>
           <w:rFonts w:ascii="Courier New" w:eastAsia="Times New Roman" w:hAnsi="Courier New" w:cs="Courier New"/>
@@ -7233,6 +7926,7 @@
         </w:rPr>
         <w:t>(</w:t>
       </w:r>
+      <w:proofErr w:type="spellStart"/>
       <w:r>
         <w:rPr>
           <w:rFonts w:ascii="Courier New" w:eastAsia="Times New Roman" w:hAnsi="Courier New" w:cs="Courier New"/>
@@ -7243,6 +7937,7 @@
         </w:rPr>
         <w:t>service</w:t>
       </w:r>
+      <w:proofErr w:type="spellEnd"/>
       <w:r>
         <w:rPr>
           <w:rFonts w:ascii="Courier New" w:eastAsia="Times New Roman" w:hAnsi="Courier New" w:cs="Courier New"/>
@@ -7293,7 +7988,29 @@
           <w:szCs w:val="20"/>
           <w:lang w:eastAsia="pt-BR"/>
         </w:rPr>
-        <w:t>)).create(</w:t>
+        <w:t>)).</w:t>
+      </w:r>
+      <w:proofErr w:type="spellStart"/>
+      <w:r>
+        <w:rPr>
+          <w:rFonts w:ascii="Courier New" w:eastAsia="Times New Roman" w:hAnsi="Courier New" w:cs="Courier New"/>
+          <w:color w:val="BCBEC4"/>
+          <w:sz w:val="20"/>
+          <w:szCs w:val="20"/>
+          <w:lang w:eastAsia="pt-BR"/>
+        </w:rPr>
+        <w:t>create</w:t>
+      </w:r>
+      <w:proofErr w:type="spellEnd"/>
+      <w:r>
+        <w:rPr>
+          <w:rFonts w:ascii="Courier New" w:eastAsia="Times New Roman" w:hAnsi="Courier New" w:cs="Courier New"/>
+          <w:color w:val="BCBEC4"/>
+          <w:sz w:val="20"/>
+          <w:szCs w:val="20"/>
+          <w:lang w:eastAsia="pt-BR"/>
+        </w:rPr>
+        <w:t>(</w:t>
       </w:r>
       <w:r>
         <w:rPr>
@@ -7315,7 +8032,18 @@
           <w:szCs w:val="20"/>
           <w:lang w:eastAsia="pt-BR"/>
         </w:rPr>
-        <w:t>(Cliente.</w:t>
+        <w:t>(</w:t>
+      </w:r>
+      <w:proofErr w:type="spellStart"/>
+      <w:r>
+        <w:rPr>
+          <w:rFonts w:ascii="Courier New" w:eastAsia="Times New Roman" w:hAnsi="Courier New" w:cs="Courier New"/>
+          <w:color w:val="BCBEC4"/>
+          <w:sz w:val="20"/>
+          <w:szCs w:val="20"/>
+          <w:lang w:eastAsia="pt-BR"/>
+        </w:rPr>
+        <w:t>Cliente.</w:t>
       </w:r>
       <w:r>
         <w:rPr>
@@ -7327,6 +8055,7 @@
         </w:rPr>
         <w:t>class</w:t>
       </w:r>
+      <w:proofErr w:type="spellEnd"/>
       <w:r>
         <w:rPr>
           <w:rFonts w:ascii="Courier New" w:eastAsia="Times New Roman" w:hAnsi="Courier New" w:cs="Courier New"/>
@@ -7367,15 +8096,100 @@
           <w:b/>
           <w:bCs/>
         </w:rPr>
-        <w:t>when(service.create(any(Cliente.class))).thenReturn(cliente1);</w:t>
-      </w:r>
-    </w:p>
-    <w:p>
-      <w:r>
-        <w:t>Q</w:t>
-      </w:r>
-      <w:r>
-        <w:t>uando o mock service receber uma chamada create(...) com qualquer instância de Cliente (any(Cliente.class)), deve retornar o objeto cliente1 (pré-criado no teste).</w:t>
+        <w:t>when(</w:t>
+      </w:r>
+      <w:proofErr w:type="spellStart"/>
+      <w:r>
+        <w:rPr>
+          <w:b/>
+          <w:bCs/>
+        </w:rPr>
+        <w:t>service.create</w:t>
+      </w:r>
+      <w:proofErr w:type="spellEnd"/>
+      <w:r>
+        <w:rPr>
+          <w:b/>
+          <w:bCs/>
+        </w:rPr>
+        <w:t>(any(</w:t>
+      </w:r>
+      <w:proofErr w:type="spellStart"/>
+      <w:r>
+        <w:rPr>
+          <w:b/>
+          <w:bCs/>
+        </w:rPr>
+        <w:t>Cliente.class</w:t>
+      </w:r>
+      <w:proofErr w:type="spellEnd"/>
+      <w:r>
+        <w:rPr>
+          <w:b/>
+          <w:bCs/>
+        </w:rPr>
+        <w:t>))).</w:t>
+      </w:r>
+      <w:proofErr w:type="spellStart"/>
+      <w:r>
+        <w:rPr>
+          <w:b/>
+          <w:bCs/>
+        </w:rPr>
+        <w:t>thenReturn</w:t>
+      </w:r>
+      <w:proofErr w:type="spellEnd"/>
+      <w:r>
+        <w:rPr>
+          <w:b/>
+          <w:bCs/>
+        </w:rPr>
+        <w:t>(cliente1);</w:t>
+      </w:r>
+    </w:p>
+    <w:p>
+      <w:r>
+        <w:t xml:space="preserve">Quando o </w:t>
+      </w:r>
+      <w:proofErr w:type="spellStart"/>
+      <w:r>
+        <w:t>mock</w:t>
+      </w:r>
+      <w:proofErr w:type="spellEnd"/>
+      <w:r>
+        <w:t xml:space="preserve"> </w:t>
+      </w:r>
+      <w:proofErr w:type="spellStart"/>
+      <w:r>
+        <w:t>service</w:t>
+      </w:r>
+      <w:proofErr w:type="spellEnd"/>
+      <w:r>
+        <w:t xml:space="preserve"> receber uma chamada </w:t>
+      </w:r>
+      <w:proofErr w:type="spellStart"/>
+      <w:r>
+        <w:t>create</w:t>
+      </w:r>
+      <w:proofErr w:type="spellEnd"/>
+      <w:r>
+        <w:t>(...) com qualquer instância de Cliente (any(</w:t>
+      </w:r>
+      <w:proofErr w:type="spellStart"/>
+      <w:r>
+        <w:t>Cliente.class</w:t>
+      </w:r>
+      <w:proofErr w:type="spellEnd"/>
+      <w:r>
+        <w:t>)), deve retornar o objeto cliente1 (</w:t>
+      </w:r>
+      <w:proofErr w:type="spellStart"/>
+      <w:r>
+        <w:t>pré</w:t>
+      </w:r>
+      <w:proofErr w:type="spellEnd"/>
+      <w:r>
+        <w:t>-criado no teste).</w:t>
       </w:r>
     </w:p>
     <w:p/>
@@ -7391,17 +8205,50 @@
           <w:bCs/>
         </w:rPr>
       </w:pPr>
+      <w:proofErr w:type="spellStart"/>
       <w:r>
         <w:rPr>
           <w:b/>
           <w:bCs/>
         </w:rPr>
-        <w:t>mockMvc.perform(post("/clientes")</w:t>
-      </w:r>
-    </w:p>
-    <w:p>
-      <w:r>
-        <w:t>Inicia a simulação de uma requisição HTTP do tipo POST para o endpoint /clientes. mockMvc simula o dispatcher do Spring MVC sem subir servidor HTTP real.</w:t>
+        <w:t>mockMvc.perform</w:t>
+      </w:r>
+      <w:proofErr w:type="spellEnd"/>
+      <w:r>
+        <w:rPr>
+          <w:b/>
+          <w:bCs/>
+        </w:rPr>
+        <w:t>(post("/clientes")</w:t>
+      </w:r>
+    </w:p>
+    <w:p>
+      <w:r>
+        <w:t xml:space="preserve">Inicia a simulação de uma requisição HTTP do tipo POST para o </w:t>
+      </w:r>
+      <w:proofErr w:type="spellStart"/>
+      <w:r>
+        <w:t>endpoint</w:t>
+      </w:r>
+      <w:proofErr w:type="spellEnd"/>
+      <w:r>
+        <w:t xml:space="preserve"> /clientes. </w:t>
+      </w:r>
+      <w:proofErr w:type="spellStart"/>
+      <w:r>
+        <w:t>mockMvc</w:t>
+      </w:r>
+      <w:proofErr w:type="spellEnd"/>
+      <w:r>
+        <w:t xml:space="preserve"> simula o </w:t>
+      </w:r>
+      <w:proofErr w:type="spellStart"/>
+      <w:r>
+        <w:t>dispatcher</w:t>
+      </w:r>
+      <w:proofErr w:type="spellEnd"/>
+      <w:r>
+        <w:t xml:space="preserve"> do Spring MVC sem subir servidor HTTP real.</w:t>
       </w:r>
     </w:p>
     <w:p/>
@@ -7422,12 +8269,84 @@
           <w:b/>
           <w:bCs/>
         </w:rPr>
-        <w:t>.contentType(MediaType.APPLICATION_JSON)</w:t>
-      </w:r>
-    </w:p>
-    <w:p>
-      <w:r>
-        <w:t>Define o header Content-Type: application/json. Importante porque o controller provavelmente espera JSON e usa @RequestBody para desserializar.</w:t>
+        <w:t>.</w:t>
+      </w:r>
+      <w:proofErr w:type="spellStart"/>
+      <w:r>
+        <w:rPr>
+          <w:b/>
+          <w:bCs/>
+        </w:rPr>
+        <w:t>contentType</w:t>
+      </w:r>
+      <w:proofErr w:type="spellEnd"/>
+      <w:r>
+        <w:rPr>
+          <w:b/>
+          <w:bCs/>
+        </w:rPr>
+        <w:t>(</w:t>
+      </w:r>
+      <w:proofErr w:type="spellStart"/>
+      <w:r>
+        <w:rPr>
+          <w:b/>
+          <w:bCs/>
+        </w:rPr>
+        <w:t>MediaType.APPLICATION_JSON</w:t>
+      </w:r>
+      <w:proofErr w:type="spellEnd"/>
+      <w:r>
+        <w:rPr>
+          <w:b/>
+          <w:bCs/>
+        </w:rPr>
+        <w:t>)</w:t>
+      </w:r>
+    </w:p>
+    <w:p>
+      <w:r>
+        <w:t xml:space="preserve">Define o header </w:t>
+      </w:r>
+      <w:proofErr w:type="spellStart"/>
+      <w:r>
+        <w:t>Content-Type</w:t>
+      </w:r>
+      <w:proofErr w:type="spellEnd"/>
+      <w:r>
+        <w:t xml:space="preserve">: </w:t>
+      </w:r>
+      <w:proofErr w:type="spellStart"/>
+      <w:r>
+        <w:t>application</w:t>
+      </w:r>
+      <w:proofErr w:type="spellEnd"/>
+      <w:r>
+        <w:t>/</w:t>
+      </w:r>
+      <w:proofErr w:type="spellStart"/>
+      <w:r>
+        <w:t>json</w:t>
+      </w:r>
+      <w:proofErr w:type="spellEnd"/>
+      <w:r>
+        <w:t xml:space="preserve">. Importante porque o </w:t>
+      </w:r>
+      <w:proofErr w:type="spellStart"/>
+      <w:r>
+        <w:t>controller</w:t>
+      </w:r>
+      <w:proofErr w:type="spellEnd"/>
+      <w:r>
+        <w:t xml:space="preserve"> provavelmente espera JSON e usa @RequestBody para </w:t>
+      </w:r>
+      <w:proofErr w:type="spellStart"/>
+      <w:r>
+        <w:t>desserializar</w:t>
+      </w:r>
+      <w:proofErr w:type="spellEnd"/>
+      <w:r>
+        <w:t>.</w:t>
       </w:r>
     </w:p>
     <w:p/>
@@ -7448,12 +8367,60 @@
           <w:b/>
           <w:bCs/>
         </w:rPr>
-        <w:t>.content(objectMapper.writeValueAsString(cliente1)))</w:t>
-      </w:r>
-    </w:p>
-    <w:p>
-      <w:r>
-        <w:t>O corpo da requisição é o JSON gerado a partir de cliente1 (pela ObjectMapper do Jackson). Assim o controller receberá um JSON igual ao objeto cliente1.</w:t>
+        <w:t>.</w:t>
+      </w:r>
+      <w:proofErr w:type="spellStart"/>
+      <w:r>
+        <w:rPr>
+          <w:b/>
+          <w:bCs/>
+        </w:rPr>
+        <w:t>content</w:t>
+      </w:r>
+      <w:proofErr w:type="spellEnd"/>
+      <w:r>
+        <w:rPr>
+          <w:b/>
+          <w:bCs/>
+        </w:rPr>
+        <w:t>(</w:t>
+      </w:r>
+      <w:proofErr w:type="spellStart"/>
+      <w:r>
+        <w:rPr>
+          <w:b/>
+          <w:bCs/>
+        </w:rPr>
+        <w:t>objectMapper.writeValueAsString</w:t>
+      </w:r>
+      <w:proofErr w:type="spellEnd"/>
+      <w:r>
+        <w:rPr>
+          <w:b/>
+          <w:bCs/>
+        </w:rPr>
+        <w:t>(cliente1)))</w:t>
+      </w:r>
+    </w:p>
+    <w:p>
+      <w:r>
+        <w:t xml:space="preserve">O corpo da requisição é o JSON gerado a partir de cliente1 (pela </w:t>
+      </w:r>
+      <w:proofErr w:type="spellStart"/>
+      <w:r>
+        <w:t>ObjectMapper</w:t>
+      </w:r>
+      <w:proofErr w:type="spellEnd"/>
+      <w:r>
+        <w:t xml:space="preserve"> do Jackson). Assim o </w:t>
+      </w:r>
+      <w:proofErr w:type="spellStart"/>
+      <w:r>
+        <w:t>controller</w:t>
+      </w:r>
+      <w:proofErr w:type="spellEnd"/>
+      <w:r>
+        <w:t xml:space="preserve"> receberá um JSON igual ao objeto cliente1.</w:t>
       </w:r>
     </w:p>
     <w:p/>
@@ -7474,12 +8441,60 @@
           <w:b/>
           <w:bCs/>
         </w:rPr>
-        <w:t>.andExpect(status().isCreated())</w:t>
-      </w:r>
-    </w:p>
-    <w:p>
-      <w:r>
-        <w:t xml:space="preserve">Verifica que a resposta HTTP do controller foi 201 Created. </w:t>
+        <w:t>.</w:t>
+      </w:r>
+      <w:proofErr w:type="spellStart"/>
+      <w:r>
+        <w:rPr>
+          <w:b/>
+          <w:bCs/>
+        </w:rPr>
+        <w:t>andExpect</w:t>
+      </w:r>
+      <w:proofErr w:type="spellEnd"/>
+      <w:r>
+        <w:rPr>
+          <w:b/>
+          <w:bCs/>
+        </w:rPr>
+        <w:t>(status().</w:t>
+      </w:r>
+      <w:proofErr w:type="spellStart"/>
+      <w:r>
+        <w:rPr>
+          <w:b/>
+          <w:bCs/>
+        </w:rPr>
+        <w:t>isCreated</w:t>
+      </w:r>
+      <w:proofErr w:type="spellEnd"/>
+      <w:r>
+        <w:rPr>
+          <w:b/>
+          <w:bCs/>
+        </w:rPr>
+        <w:t>())</w:t>
+      </w:r>
+    </w:p>
+    <w:p>
+      <w:r>
+        <w:t xml:space="preserve">Verifica que a resposta HTTP do </w:t>
+      </w:r>
+      <w:proofErr w:type="spellStart"/>
+      <w:r>
+        <w:t>controller</w:t>
+      </w:r>
+      <w:proofErr w:type="spellEnd"/>
+      <w:r>
+        <w:t xml:space="preserve"> foi 201 </w:t>
+      </w:r>
+      <w:proofErr w:type="spellStart"/>
+      <w:r>
+        <w:t>Created</w:t>
+      </w:r>
+      <w:proofErr w:type="spellEnd"/>
+      <w:r>
+        <w:t xml:space="preserve">. </w:t>
       </w:r>
       <w:r>
         <w:t>I</w:t>
@@ -7512,12 +8527,52 @@
           <w:b/>
           <w:bCs/>
         </w:rPr>
-        <w:t>.andExpect(jsonPath("$.nome").value("João da Silva"));</w:t>
-      </w:r>
-    </w:p>
-    <w:p>
-      <w:r>
-        <w:t>Verifica o corpo da resposta (JSON) com JSONPath: $.nome pega o campo nome da raiz do objeto JSON e exige que seu valor seja "João da Silva".</w:t>
+        <w:t>.</w:t>
+      </w:r>
+      <w:proofErr w:type="spellStart"/>
+      <w:r>
+        <w:rPr>
+          <w:b/>
+          <w:bCs/>
+        </w:rPr>
+        <w:t>andExpect</w:t>
+      </w:r>
+      <w:proofErr w:type="spellEnd"/>
+      <w:r>
+        <w:rPr>
+          <w:b/>
+          <w:bCs/>
+        </w:rPr>
+        <w:t>(</w:t>
+      </w:r>
+      <w:proofErr w:type="spellStart"/>
+      <w:r>
+        <w:rPr>
+          <w:b/>
+          <w:bCs/>
+        </w:rPr>
+        <w:t>jsonPath</w:t>
+      </w:r>
+      <w:proofErr w:type="spellEnd"/>
+      <w:r>
+        <w:rPr>
+          <w:b/>
+          <w:bCs/>
+        </w:rPr>
+        <w:t>("$.nome").value("João da Silva"));</w:t>
+      </w:r>
+    </w:p>
+    <w:p>
+      <w:r>
+        <w:t xml:space="preserve">Verifica o corpo da resposta (JSON) com </w:t>
+      </w:r>
+      <w:proofErr w:type="spellStart"/>
+      <w:r>
+        <w:t>JSONPath</w:t>
+      </w:r>
+      <w:proofErr w:type="spellEnd"/>
+      <w:r>
+        <w:t>: $.nome pega o campo nome da raiz do objeto JSON e exige que seu valor seja "João da Silva".</w:t>
       </w:r>
     </w:p>
     <w:p/>
@@ -7533,40 +8588,1725 @@
           <w:bCs/>
         </w:rPr>
       </w:pPr>
+      <w:proofErr w:type="spellStart"/>
       <w:r>
         <w:rPr>
           <w:b/>
           <w:bCs/>
         </w:rPr>
-        <w:t>verify(service, times(1)).create(any(Cliente.class));</w:t>
-      </w:r>
-    </w:p>
-    <w:p>
-      <w:r>
-        <w:t xml:space="preserve">Verificação de interação: confirma que service.create(...) foi chamado </w:t>
+        <w:t>verify</w:t>
+      </w:r>
+      <w:proofErr w:type="spellEnd"/>
+      <w:r>
+        <w:rPr>
+          <w:b/>
+          <w:bCs/>
+        </w:rPr>
+        <w:t>(</w:t>
+      </w:r>
+      <w:proofErr w:type="spellStart"/>
+      <w:r>
+        <w:rPr>
+          <w:b/>
+          <w:bCs/>
+        </w:rPr>
+        <w:t>service</w:t>
+      </w:r>
+      <w:proofErr w:type="spellEnd"/>
+      <w:r>
+        <w:rPr>
+          <w:b/>
+          <w:bCs/>
+        </w:rPr>
+        <w:t>, times(1)).</w:t>
+      </w:r>
+      <w:proofErr w:type="spellStart"/>
+      <w:r>
+        <w:rPr>
+          <w:b/>
+          <w:bCs/>
+        </w:rPr>
+        <w:t>create</w:t>
+      </w:r>
+      <w:proofErr w:type="spellEnd"/>
+      <w:r>
+        <w:rPr>
+          <w:b/>
+          <w:bCs/>
+        </w:rPr>
+        <w:t>(any(</w:t>
+      </w:r>
+      <w:proofErr w:type="spellStart"/>
+      <w:r>
+        <w:rPr>
+          <w:b/>
+          <w:bCs/>
+        </w:rPr>
+        <w:t>Cliente.class</w:t>
+      </w:r>
+      <w:proofErr w:type="spellEnd"/>
+      <w:r>
+        <w:rPr>
+          <w:b/>
+          <w:bCs/>
+        </w:rPr>
+        <w:t>));</w:t>
+      </w:r>
+    </w:p>
+    <w:p>
+      <w:r>
+        <w:t xml:space="preserve">Verificação de interação: confirma que </w:t>
+      </w:r>
+      <w:proofErr w:type="spellStart"/>
+      <w:r>
+        <w:t>service.create</w:t>
+      </w:r>
+      <w:proofErr w:type="spellEnd"/>
+      <w:r>
+        <w:t xml:space="preserve">(...) foi chamado </w:t>
       </w:r>
       <w:r>
         <w:t xml:space="preserve">apenas </w:t>
       </w:r>
       <w:r>
-        <w:t xml:space="preserve">uma vez durante a execução do controller. </w:t>
+        <w:t xml:space="preserve">uma vez durante a execução do </w:t>
+      </w:r>
+      <w:proofErr w:type="spellStart"/>
+      <w:r>
+        <w:t>controller</w:t>
+      </w:r>
+      <w:proofErr w:type="spellEnd"/>
+      <w:r>
+        <w:t xml:space="preserve">. </w:t>
       </w:r>
     </w:p>
     <w:p>
       <w:pPr>
         <w:pStyle w:val="Ttulo1"/>
-      </w:pPr>
-      <w:r>
+        <w:sectPr>
+          <w:pgSz w:w="11906" w:h="16838"/>
+          <w:pgMar w:top="851" w:right="851" w:bottom="851" w:left="851" w:header="709" w:footer="709" w:gutter="0"/>
+          <w:pgNumType w:start="0"/>
+          <w:cols w:space="708"/>
+          <w:titlePg/>
+          <w:docGrid w:linePitch="360"/>
+        </w:sectPr>
+      </w:pPr>
+    </w:p>
+    <w:p>
+      <w:pPr>
+        <w:pStyle w:val="Ttulo1"/>
+      </w:pPr>
+      <w:r>
+        <w:lastRenderedPageBreak/>
         <w:t>No Assessment, iremos implementar um serviço com as seguintes funcionalidades:</w:t>
       </w:r>
     </w:p>
+    <w:p>
+      <w:pPr>
+        <w:pStyle w:val="Ttulo2"/>
+      </w:pPr>
+      <w:r>
+        <w:t xml:space="preserve"> </w:t>
+      </w:r>
+      <w:r>
+        <w:t>Cadastrar Aluno</w:t>
+      </w:r>
+    </w:p>
+    <w:p>
+      <w:pPr>
+        <w:pStyle w:val="PargrafodaLista"/>
+        <w:numPr>
+          <w:ilvl w:val="0"/>
+          <w:numId w:val="12"/>
+        </w:numPr>
+        <w:rPr>
+          <w:b/>
+          <w:bCs/>
+        </w:rPr>
+      </w:pPr>
+      <w:r>
+        <w:rPr>
+          <w:b/>
+          <w:bCs/>
+        </w:rPr>
+        <w:t>Não autorizado</w:t>
+      </w:r>
+    </w:p>
+    <w:p>
+      <w:r>
+        <w:drawing>
+          <wp:inline distT="0" distB="0" distL="0" distR="0" wp14:anchorId="5E6DC5FC" wp14:editId="18FC923F">
+            <wp:extent cx="6479540" cy="3509645"/>
+            <wp:effectExtent l="0" t="0" r="0" b="0"/>
+            <wp:docPr id="40" name="Imagem 40"/>
+            <wp:cNvGraphicFramePr>
+              <a:graphicFrameLocks xmlns:a="http://schemas.openxmlformats.org/drawingml/2006/main" noChangeAspect="1"/>
+            </wp:cNvGraphicFramePr>
+            <a:graphic xmlns:a="http://schemas.openxmlformats.org/drawingml/2006/main">
+              <a:graphicData uri="http://schemas.openxmlformats.org/drawingml/2006/picture">
+                <pic:pic xmlns:pic="http://schemas.openxmlformats.org/drawingml/2006/picture">
+                  <pic:nvPicPr>
+                    <pic:cNvPr id="1" name=""/>
+                    <pic:cNvPicPr/>
+                  </pic:nvPicPr>
+                  <pic:blipFill>
+                    <a:blip r:embed="rId11"/>
+                    <a:stretch>
+                      <a:fillRect/>
+                    </a:stretch>
+                  </pic:blipFill>
+                  <pic:spPr>
+                    <a:xfrm>
+                      <a:off x="0" y="0"/>
+                      <a:ext cx="6479540" cy="3509645"/>
+                    </a:xfrm>
+                    <a:prstGeom prst="rect">
+                      <a:avLst/>
+                    </a:prstGeom>
+                  </pic:spPr>
+                </pic:pic>
+              </a:graphicData>
+            </a:graphic>
+          </wp:inline>
+        </w:drawing>
+      </w:r>
+    </w:p>
     <w:p/>
     <w:p>
       <w:pPr>
+        <w:pStyle w:val="PargrafodaLista"/>
+        <w:numPr>
+          <w:ilvl w:val="0"/>
+          <w:numId w:val="12"/>
+        </w:numPr>
+        <w:rPr>
+          <w:b/>
+          <w:bCs/>
+        </w:rPr>
+      </w:pPr>
+      <w:r>
+        <w:rPr>
+          <w:b/>
+          <w:bCs/>
+        </w:rPr>
+        <w:t>Autorizado</w:t>
+      </w:r>
+      <w:r>
+        <w:rPr>
+          <w:b/>
+          <w:bCs/>
+        </w:rPr>
+        <w:t xml:space="preserve"> Token</w:t>
+      </w:r>
+    </w:p>
+    <w:p>
+      <w:r>
+        <w:drawing>
+          <wp:inline distT="0" distB="0" distL="0" distR="0" wp14:anchorId="1A96212A" wp14:editId="350494F2">
+            <wp:extent cx="6479540" cy="3509645"/>
+            <wp:effectExtent l="0" t="0" r="0" b="0"/>
+            <wp:docPr id="41" name="Imagem 41"/>
+            <wp:cNvGraphicFramePr>
+              <a:graphicFrameLocks xmlns:a="http://schemas.openxmlformats.org/drawingml/2006/main" noChangeAspect="1"/>
+            </wp:cNvGraphicFramePr>
+            <a:graphic xmlns:a="http://schemas.openxmlformats.org/drawingml/2006/main">
+              <a:graphicData uri="http://schemas.openxmlformats.org/drawingml/2006/picture">
+                <pic:pic xmlns:pic="http://schemas.openxmlformats.org/drawingml/2006/picture">
+                  <pic:nvPicPr>
+                    <pic:cNvPr id="1" name=""/>
+                    <pic:cNvPicPr/>
+                  </pic:nvPicPr>
+                  <pic:blipFill>
+                    <a:blip r:embed="rId12"/>
+                    <a:stretch>
+                      <a:fillRect/>
+                    </a:stretch>
+                  </pic:blipFill>
+                  <pic:spPr>
+                    <a:xfrm>
+                      <a:off x="0" y="0"/>
+                      <a:ext cx="6479540" cy="3509645"/>
+                    </a:xfrm>
+                    <a:prstGeom prst="rect">
+                      <a:avLst/>
+                    </a:prstGeom>
+                  </pic:spPr>
+                </pic:pic>
+              </a:graphicData>
+            </a:graphic>
+          </wp:inline>
+        </w:drawing>
+      </w:r>
+    </w:p>
+    <w:p>
+      <w:pPr>
+        <w:pStyle w:val="PargrafodaLista"/>
+        <w:numPr>
+          <w:ilvl w:val="0"/>
+          <w:numId w:val="12"/>
+        </w:numPr>
+        <w:rPr>
+          <w:b/>
+          <w:bCs/>
+        </w:rPr>
+        <w:sectPr>
+          <w:pgSz w:w="11906" w:h="16838"/>
+          <w:pgMar w:top="851" w:right="851" w:bottom="851" w:left="851" w:header="709" w:footer="709" w:gutter="0"/>
+          <w:pgNumType w:start="0"/>
+          <w:cols w:space="708"/>
+          <w:titlePg/>
+          <w:docGrid w:linePitch="360"/>
+        </w:sectPr>
+      </w:pPr>
+    </w:p>
+    <w:p>
+      <w:pPr>
+        <w:pStyle w:val="PargrafodaLista"/>
+        <w:numPr>
+          <w:ilvl w:val="0"/>
+          <w:numId w:val="12"/>
+        </w:numPr>
+        <w:rPr>
+          <w:b/>
+          <w:bCs/>
+        </w:rPr>
+      </w:pPr>
+      <w:r>
+        <w:rPr>
+          <w:b/>
+          <w:bCs/>
+        </w:rPr>
+        <w:lastRenderedPageBreak/>
+        <w:t>Autorizado</w:t>
+      </w:r>
+      <w:r>
+        <w:rPr>
+          <w:b/>
+          <w:bCs/>
+        </w:rPr>
+        <w:t xml:space="preserve"> </w:t>
+      </w:r>
+      <w:r>
+        <w:rPr>
+          <w:b/>
+          <w:bCs/>
+        </w:rPr>
+        <w:t>Body</w:t>
+      </w:r>
+    </w:p>
+    <w:p>
+      <w:r>
+        <w:drawing>
+          <wp:inline distT="0" distB="0" distL="0" distR="0" wp14:anchorId="2F648931" wp14:editId="5AB06B20">
+            <wp:extent cx="6479540" cy="3509645"/>
+            <wp:effectExtent l="0" t="0" r="0" b="0"/>
+            <wp:docPr id="42" name="Imagem 42"/>
+            <wp:cNvGraphicFramePr>
+              <a:graphicFrameLocks xmlns:a="http://schemas.openxmlformats.org/drawingml/2006/main" noChangeAspect="1"/>
+            </wp:cNvGraphicFramePr>
+            <a:graphic xmlns:a="http://schemas.openxmlformats.org/drawingml/2006/main">
+              <a:graphicData uri="http://schemas.openxmlformats.org/drawingml/2006/picture">
+                <pic:pic xmlns:pic="http://schemas.openxmlformats.org/drawingml/2006/picture">
+                  <pic:nvPicPr>
+                    <pic:cNvPr id="1" name=""/>
+                    <pic:cNvPicPr/>
+                  </pic:nvPicPr>
+                  <pic:blipFill>
+                    <a:blip r:embed="rId13"/>
+                    <a:stretch>
+                      <a:fillRect/>
+                    </a:stretch>
+                  </pic:blipFill>
+                  <pic:spPr>
+                    <a:xfrm>
+                      <a:off x="0" y="0"/>
+                      <a:ext cx="6479540" cy="3509645"/>
+                    </a:xfrm>
+                    <a:prstGeom prst="rect">
+                      <a:avLst/>
+                    </a:prstGeom>
+                  </pic:spPr>
+                </pic:pic>
+              </a:graphicData>
+            </a:graphic>
+          </wp:inline>
+        </w:drawing>
+      </w:r>
+    </w:p>
+    <w:p>
+      <w:pPr>
+        <w:pStyle w:val="Ttulo2"/>
+      </w:pPr>
+      <w:r>
+        <w:t xml:space="preserve"> </w:t>
+      </w:r>
+      <w:r>
+        <w:t>Cadastrar Disciplina</w:t>
+      </w:r>
+    </w:p>
+    <w:p>
+      <w:r>
+        <w:drawing>
+          <wp:inline distT="0" distB="0" distL="0" distR="0" wp14:anchorId="46C6B16B" wp14:editId="3810F27D">
+            <wp:extent cx="6479540" cy="3509645"/>
+            <wp:effectExtent l="0" t="0" r="0" b="0"/>
+            <wp:docPr id="43" name="Imagem 43"/>
+            <wp:cNvGraphicFramePr>
+              <a:graphicFrameLocks xmlns:a="http://schemas.openxmlformats.org/drawingml/2006/main" noChangeAspect="1"/>
+            </wp:cNvGraphicFramePr>
+            <a:graphic xmlns:a="http://schemas.openxmlformats.org/drawingml/2006/main">
+              <a:graphicData uri="http://schemas.openxmlformats.org/drawingml/2006/picture">
+                <pic:pic xmlns:pic="http://schemas.openxmlformats.org/drawingml/2006/picture">
+                  <pic:nvPicPr>
+                    <pic:cNvPr id="1" name=""/>
+                    <pic:cNvPicPr/>
+                  </pic:nvPicPr>
+                  <pic:blipFill>
+                    <a:blip r:embed="rId14"/>
+                    <a:stretch>
+                      <a:fillRect/>
+                    </a:stretch>
+                  </pic:blipFill>
+                  <pic:spPr>
+                    <a:xfrm>
+                      <a:off x="0" y="0"/>
+                      <a:ext cx="6479540" cy="3509645"/>
+                    </a:xfrm>
+                    <a:prstGeom prst="rect">
+                      <a:avLst/>
+                    </a:prstGeom>
+                  </pic:spPr>
+                </pic:pic>
+              </a:graphicData>
+            </a:graphic>
+          </wp:inline>
+        </w:drawing>
+      </w:r>
+    </w:p>
+    <w:p>
+      <w:pPr>
+        <w:pStyle w:val="Ttulo2"/>
+        <w:sectPr>
+          <w:pgSz w:w="11906" w:h="16838"/>
+          <w:pgMar w:top="851" w:right="851" w:bottom="851" w:left="851" w:header="709" w:footer="709" w:gutter="0"/>
+          <w:pgNumType w:start="0"/>
+          <w:cols w:space="708"/>
+          <w:titlePg/>
+          <w:docGrid w:linePitch="360"/>
+        </w:sectPr>
+      </w:pPr>
+    </w:p>
+    <w:p>
+      <w:pPr>
+        <w:pStyle w:val="Ttulo2"/>
+      </w:pPr>
+      <w:r>
+        <w:lastRenderedPageBreak/>
+        <w:t xml:space="preserve"> </w:t>
+      </w:r>
+      <w:r>
+        <w:t>Alocar aluno em disciplina</w:t>
+      </w:r>
+    </w:p>
+    <w:p>
+      <w:pPr>
+        <w:pStyle w:val="PargrafodaLista"/>
+        <w:numPr>
+          <w:ilvl w:val="0"/>
+          <w:numId w:val="12"/>
+        </w:numPr>
+        <w:rPr>
+          <w:b/>
+          <w:bCs/>
+        </w:rPr>
+      </w:pPr>
+      <w:r>
+        <w:rPr>
+          <w:b/>
+          <w:bCs/>
+        </w:rPr>
+        <w:t>Aluno com id=1 em disciplina com id=1</w:t>
+      </w:r>
+    </w:p>
+    <w:p>
+      <w:r>
+        <w:drawing>
+          <wp:inline distT="0" distB="0" distL="0" distR="0" wp14:anchorId="2081E1E0" wp14:editId="7BFBAD39">
+            <wp:extent cx="6479540" cy="3509645"/>
+            <wp:effectExtent l="0" t="0" r="0" b="0"/>
+            <wp:docPr id="44" name="Imagem 44"/>
+            <wp:cNvGraphicFramePr>
+              <a:graphicFrameLocks xmlns:a="http://schemas.openxmlformats.org/drawingml/2006/main" noChangeAspect="1"/>
+            </wp:cNvGraphicFramePr>
+            <a:graphic xmlns:a="http://schemas.openxmlformats.org/drawingml/2006/main">
+              <a:graphicData uri="http://schemas.openxmlformats.org/drawingml/2006/picture">
+                <pic:pic xmlns:pic="http://schemas.openxmlformats.org/drawingml/2006/picture">
+                  <pic:nvPicPr>
+                    <pic:cNvPr id="1" name=""/>
+                    <pic:cNvPicPr/>
+                  </pic:nvPicPr>
+                  <pic:blipFill>
+                    <a:blip r:embed="rId15"/>
+                    <a:stretch>
+                      <a:fillRect/>
+                    </a:stretch>
+                  </pic:blipFill>
+                  <pic:spPr>
+                    <a:xfrm>
+                      <a:off x="0" y="0"/>
+                      <a:ext cx="6479540" cy="3509645"/>
+                    </a:xfrm>
+                    <a:prstGeom prst="rect">
+                      <a:avLst/>
+                    </a:prstGeom>
+                  </pic:spPr>
+                </pic:pic>
+              </a:graphicData>
+            </a:graphic>
+          </wp:inline>
+        </w:drawing>
+      </w:r>
+    </w:p>
+    <w:p>
+      <w:pPr>
+        <w:pStyle w:val="Ttulo2"/>
+      </w:pPr>
+      <w:r>
+        <w:t xml:space="preserve"> </w:t>
+      </w:r>
+      <w:r>
+        <w:t>Atribuir Nota</w:t>
+      </w:r>
+    </w:p>
+    <w:p>
+      <w:pPr>
+        <w:pStyle w:val="PargrafodaLista"/>
+        <w:numPr>
+          <w:ilvl w:val="0"/>
+          <w:numId w:val="12"/>
+        </w:numPr>
+      </w:pPr>
+      <w:r>
+        <w:t>Atribuir nota disciplina id = 1 e aluno id = 1, nota 8.5</w:t>
+      </w:r>
+    </w:p>
+    <w:p>
+      <w:r>
+        <w:drawing>
+          <wp:inline distT="0" distB="0" distL="0" distR="0" wp14:anchorId="17504B7B" wp14:editId="25E11BE9">
+            <wp:extent cx="6479540" cy="3509645"/>
+            <wp:effectExtent l="0" t="0" r="0" b="0"/>
+            <wp:docPr id="46" name="Imagem 46"/>
+            <wp:cNvGraphicFramePr>
+              <a:graphicFrameLocks xmlns:a="http://schemas.openxmlformats.org/drawingml/2006/main" noChangeAspect="1"/>
+            </wp:cNvGraphicFramePr>
+            <a:graphic xmlns:a="http://schemas.openxmlformats.org/drawingml/2006/main">
+              <a:graphicData uri="http://schemas.openxmlformats.org/drawingml/2006/picture">
+                <pic:pic xmlns:pic="http://schemas.openxmlformats.org/drawingml/2006/picture">
+                  <pic:nvPicPr>
+                    <pic:cNvPr id="1" name=""/>
+                    <pic:cNvPicPr/>
+                  </pic:nvPicPr>
+                  <pic:blipFill>
+                    <a:blip r:embed="rId16"/>
+                    <a:stretch>
+                      <a:fillRect/>
+                    </a:stretch>
+                  </pic:blipFill>
+                  <pic:spPr>
+                    <a:xfrm>
+                      <a:off x="0" y="0"/>
+                      <a:ext cx="6479540" cy="3509645"/>
+                    </a:xfrm>
+                    <a:prstGeom prst="rect">
+                      <a:avLst/>
+                    </a:prstGeom>
+                  </pic:spPr>
+                </pic:pic>
+              </a:graphicData>
+            </a:graphic>
+          </wp:inline>
+        </w:drawing>
+      </w:r>
+    </w:p>
+    <w:p>
+      <w:pPr>
+        <w:pStyle w:val="PargrafodaLista"/>
+        <w:numPr>
+          <w:ilvl w:val="0"/>
+          <w:numId w:val="12"/>
+        </w:numPr>
+        <w:sectPr>
+          <w:pgSz w:w="11906" w:h="16838"/>
+          <w:pgMar w:top="851" w:right="851" w:bottom="851" w:left="851" w:header="709" w:footer="709" w:gutter="0"/>
+          <w:pgNumType w:start="0"/>
+          <w:cols w:space="708"/>
+          <w:titlePg/>
+          <w:docGrid w:linePitch="360"/>
+        </w:sectPr>
+      </w:pPr>
+    </w:p>
+    <w:p>
+      <w:pPr>
+        <w:pStyle w:val="PargrafodaLista"/>
+        <w:numPr>
+          <w:ilvl w:val="0"/>
+          <w:numId w:val="12"/>
+        </w:numPr>
+      </w:pPr>
+      <w:r>
+        <w:lastRenderedPageBreak/>
+        <w:t>Consultar notas do aluno id=1</w:t>
+      </w:r>
+    </w:p>
+    <w:p>
+      <w:r>
+        <w:drawing>
+          <wp:inline distT="0" distB="0" distL="0" distR="0" wp14:anchorId="35AC2B13" wp14:editId="27B631AD">
+            <wp:extent cx="6479540" cy="3509645"/>
+            <wp:effectExtent l="0" t="0" r="0" b="0"/>
+            <wp:docPr id="48" name="Imagem 48"/>
+            <wp:cNvGraphicFramePr>
+              <a:graphicFrameLocks xmlns:a="http://schemas.openxmlformats.org/drawingml/2006/main" noChangeAspect="1"/>
+            </wp:cNvGraphicFramePr>
+            <a:graphic xmlns:a="http://schemas.openxmlformats.org/drawingml/2006/main">
+              <a:graphicData uri="http://schemas.openxmlformats.org/drawingml/2006/picture">
+                <pic:pic xmlns:pic="http://schemas.openxmlformats.org/drawingml/2006/picture">
+                  <pic:nvPicPr>
+                    <pic:cNvPr id="1" name=""/>
+                    <pic:cNvPicPr/>
+                  </pic:nvPicPr>
+                  <pic:blipFill>
+                    <a:blip r:embed="rId17"/>
+                    <a:stretch>
+                      <a:fillRect/>
+                    </a:stretch>
+                  </pic:blipFill>
+                  <pic:spPr>
+                    <a:xfrm>
+                      <a:off x="0" y="0"/>
+                      <a:ext cx="6479540" cy="3509645"/>
+                    </a:xfrm>
+                    <a:prstGeom prst="rect">
+                      <a:avLst/>
+                    </a:prstGeom>
+                  </pic:spPr>
+                </pic:pic>
+              </a:graphicData>
+            </a:graphic>
+          </wp:inline>
+        </w:drawing>
+      </w:r>
+    </w:p>
+    <w:p>
+      <w:pPr>
+        <w:pStyle w:val="Ttulo2"/>
+      </w:pPr>
+      <w:r>
+        <w:t>Listar Alunos</w:t>
+      </w:r>
+    </w:p>
+    <w:p>
+      <w:r>
+        <w:drawing>
+          <wp:inline distT="0" distB="0" distL="0" distR="0" wp14:anchorId="2E69589D" wp14:editId="3F268DD2">
+            <wp:extent cx="6479540" cy="3509645"/>
+            <wp:effectExtent l="0" t="0" r="0" b="0"/>
+            <wp:docPr id="45" name="Imagem 45"/>
+            <wp:cNvGraphicFramePr>
+              <a:graphicFrameLocks xmlns:a="http://schemas.openxmlformats.org/drawingml/2006/main" noChangeAspect="1"/>
+            </wp:cNvGraphicFramePr>
+            <a:graphic xmlns:a="http://schemas.openxmlformats.org/drawingml/2006/main">
+              <a:graphicData uri="http://schemas.openxmlformats.org/drawingml/2006/picture">
+                <pic:pic xmlns:pic="http://schemas.openxmlformats.org/drawingml/2006/picture">
+                  <pic:nvPicPr>
+                    <pic:cNvPr id="1" name=""/>
+                    <pic:cNvPicPr/>
+                  </pic:nvPicPr>
+                  <pic:blipFill>
+                    <a:blip r:embed="rId18"/>
+                    <a:stretch>
+                      <a:fillRect/>
+                    </a:stretch>
+                  </pic:blipFill>
+                  <pic:spPr>
+                    <a:xfrm>
+                      <a:off x="0" y="0"/>
+                      <a:ext cx="6479540" cy="3509645"/>
+                    </a:xfrm>
+                    <a:prstGeom prst="rect">
+                      <a:avLst/>
+                    </a:prstGeom>
+                  </pic:spPr>
+                </pic:pic>
+              </a:graphicData>
+            </a:graphic>
+          </wp:inline>
+        </w:drawing>
+      </w:r>
+    </w:p>
+    <w:p>
+      <w:pPr>
+        <w:pStyle w:val="Ttulo2"/>
+      </w:pPr>
+      <w:r>
+        <w:lastRenderedPageBreak/>
+        <w:t>Listar Disciplinas</w:t>
+      </w:r>
+      <w:r>
+        <w:t xml:space="preserve"> </w:t>
+      </w:r>
+    </w:p>
+    <w:p>
+      <w:r>
+        <w:drawing>
+          <wp:inline distT="0" distB="0" distL="0" distR="0" wp14:anchorId="1004422F" wp14:editId="721BF573">
+            <wp:extent cx="6479540" cy="3509645"/>
+            <wp:effectExtent l="0" t="0" r="0" b="0"/>
+            <wp:docPr id="49" name="Imagem 49"/>
+            <wp:cNvGraphicFramePr>
+              <a:graphicFrameLocks xmlns:a="http://schemas.openxmlformats.org/drawingml/2006/main" noChangeAspect="1"/>
+            </wp:cNvGraphicFramePr>
+            <a:graphic xmlns:a="http://schemas.openxmlformats.org/drawingml/2006/main">
+              <a:graphicData uri="http://schemas.openxmlformats.org/drawingml/2006/picture">
+                <pic:pic xmlns:pic="http://schemas.openxmlformats.org/drawingml/2006/picture">
+                  <pic:nvPicPr>
+                    <pic:cNvPr id="1" name=""/>
+                    <pic:cNvPicPr/>
+                  </pic:nvPicPr>
+                  <pic:blipFill>
+                    <a:blip r:embed="rId19"/>
+                    <a:stretch>
+                      <a:fillRect/>
+                    </a:stretch>
+                  </pic:blipFill>
+                  <pic:spPr>
+                    <a:xfrm>
+                      <a:off x="0" y="0"/>
+                      <a:ext cx="6479540" cy="3509645"/>
+                    </a:xfrm>
+                    <a:prstGeom prst="rect">
+                      <a:avLst/>
+                    </a:prstGeom>
+                  </pic:spPr>
+                </pic:pic>
+              </a:graphicData>
+            </a:graphic>
+          </wp:inline>
+        </w:drawing>
+      </w:r>
+    </w:p>
+    <w:p>
+      <w:pPr>
+        <w:pStyle w:val="Ttulo2"/>
+      </w:pPr>
+      <w:r>
+        <w:t xml:space="preserve"> </w:t>
+      </w:r>
+      <w:r>
+        <w:t>A</w:t>
+      </w:r>
+      <w:r>
+        <w:t>lunos aprovados em uma determinada disciplina</w:t>
+      </w:r>
+    </w:p>
+    <w:p>
+      <w:pPr>
+        <w:pStyle w:val="PargrafodaLista"/>
+        <w:numPr>
+          <w:ilvl w:val="0"/>
+          <w:numId w:val="12"/>
+        </w:numPr>
+        <w:rPr>
+          <w:b/>
+          <w:bCs/>
+        </w:rPr>
+      </w:pPr>
+      <w:r>
+        <w:rPr>
+          <w:b/>
+          <w:bCs/>
+        </w:rPr>
+        <w:t>Disciplina id = 1</w:t>
+      </w:r>
+    </w:p>
+    <w:p>
+      <w:r>
+        <w:drawing>
+          <wp:inline distT="0" distB="0" distL="0" distR="0" wp14:anchorId="1856D9D3" wp14:editId="5125A94A">
+            <wp:extent cx="6479540" cy="3509645"/>
+            <wp:effectExtent l="0" t="0" r="0" b="0"/>
+            <wp:docPr id="50" name="Imagem 50"/>
+            <wp:cNvGraphicFramePr>
+              <a:graphicFrameLocks xmlns:a="http://schemas.openxmlformats.org/drawingml/2006/main" noChangeAspect="1"/>
+            </wp:cNvGraphicFramePr>
+            <a:graphic xmlns:a="http://schemas.openxmlformats.org/drawingml/2006/main">
+              <a:graphicData uri="http://schemas.openxmlformats.org/drawingml/2006/picture">
+                <pic:pic xmlns:pic="http://schemas.openxmlformats.org/drawingml/2006/picture">
+                  <pic:nvPicPr>
+                    <pic:cNvPr id="1" name=""/>
+                    <pic:cNvPicPr/>
+                  </pic:nvPicPr>
+                  <pic:blipFill>
+                    <a:blip r:embed="rId20"/>
+                    <a:stretch>
+                      <a:fillRect/>
+                    </a:stretch>
+                  </pic:blipFill>
+                  <pic:spPr>
+                    <a:xfrm>
+                      <a:off x="0" y="0"/>
+                      <a:ext cx="6479540" cy="3509645"/>
+                    </a:xfrm>
+                    <a:prstGeom prst="rect">
+                      <a:avLst/>
+                    </a:prstGeom>
+                  </pic:spPr>
+                </pic:pic>
+              </a:graphicData>
+            </a:graphic>
+          </wp:inline>
+        </w:drawing>
+      </w:r>
+    </w:p>
+    <w:p>
+      <w:pPr>
+        <w:pStyle w:val="Ttulo2"/>
+        <w:sectPr>
+          <w:pgSz w:w="11906" w:h="16838"/>
+          <w:pgMar w:top="851" w:right="851" w:bottom="851" w:left="851" w:header="709" w:footer="709" w:gutter="0"/>
+          <w:pgNumType w:start="0"/>
+          <w:cols w:space="708"/>
+          <w:titlePg/>
+          <w:docGrid w:linePitch="360"/>
+        </w:sectPr>
+      </w:pPr>
+    </w:p>
+    <w:p>
+      <w:pPr>
+        <w:pStyle w:val="Ttulo2"/>
+      </w:pPr>
+      <w:r>
+        <w:lastRenderedPageBreak/>
+        <w:t xml:space="preserve"> </w:t>
+      </w:r>
+      <w:r>
+        <w:t>A</w:t>
+      </w:r>
+      <w:r>
+        <w:t>lunos reprovados em uma determinada disciplina</w:t>
+      </w:r>
+    </w:p>
+    <w:p>
+      <w:pPr>
+        <w:pStyle w:val="PargrafodaLista"/>
+        <w:numPr>
+          <w:ilvl w:val="0"/>
+          <w:numId w:val="12"/>
+        </w:numPr>
+        <w:rPr>
+          <w:b/>
+          <w:bCs/>
+        </w:rPr>
+      </w:pPr>
+      <w:r>
+        <w:rPr>
+          <w:b/>
+          <w:bCs/>
+        </w:rPr>
+        <w:t xml:space="preserve">Disciplina id = </w:t>
+      </w:r>
+      <w:r>
+        <w:rPr>
+          <w:b/>
+          <w:bCs/>
+        </w:rPr>
+        <w:t>2</w:t>
+      </w:r>
+    </w:p>
+    <w:p/>
+    <w:p>
+      <w:r>
+        <w:drawing>
+          <wp:inline distT="0" distB="0" distL="0" distR="0" wp14:anchorId="3BBE530E" wp14:editId="1EEBA540">
+            <wp:extent cx="6479540" cy="3509645"/>
+            <wp:effectExtent l="0" t="0" r="0" b="0"/>
+            <wp:docPr id="51" name="Imagem 51"/>
+            <wp:cNvGraphicFramePr>
+              <a:graphicFrameLocks xmlns:a="http://schemas.openxmlformats.org/drawingml/2006/main" noChangeAspect="1"/>
+            </wp:cNvGraphicFramePr>
+            <a:graphic xmlns:a="http://schemas.openxmlformats.org/drawingml/2006/main">
+              <a:graphicData uri="http://schemas.openxmlformats.org/drawingml/2006/picture">
+                <pic:pic xmlns:pic="http://schemas.openxmlformats.org/drawingml/2006/picture">
+                  <pic:nvPicPr>
+                    <pic:cNvPr id="1" name=""/>
+                    <pic:cNvPicPr/>
+                  </pic:nvPicPr>
+                  <pic:blipFill>
+                    <a:blip r:embed="rId21"/>
+                    <a:stretch>
+                      <a:fillRect/>
+                    </a:stretch>
+                  </pic:blipFill>
+                  <pic:spPr>
+                    <a:xfrm>
+                      <a:off x="0" y="0"/>
+                      <a:ext cx="6479540" cy="3509645"/>
+                    </a:xfrm>
+                    <a:prstGeom prst="rect">
+                      <a:avLst/>
+                    </a:prstGeom>
+                  </pic:spPr>
+                </pic:pic>
+              </a:graphicData>
+            </a:graphic>
+          </wp:inline>
+        </w:drawing>
+      </w:r>
+    </w:p>
+    <w:p>
+      <w:pPr>
+        <w:pStyle w:val="Ttulo2"/>
+      </w:pPr>
+      <w:r>
+        <w:t>T</w:t>
+      </w:r>
+      <w:r>
+        <w:t>estes unitários para todos os métodos</w:t>
+      </w:r>
+    </w:p>
+    <w:p>
+      <w:r>
+        <w:t xml:space="preserve">Crie arquivos </w:t>
+      </w:r>
+      <w:proofErr w:type="spellStart"/>
+      <w:r>
+        <w:rPr>
+          <w:b/>
+          <w:bCs/>
+        </w:rPr>
+        <w:t>json</w:t>
+      </w:r>
+      <w:proofErr w:type="spellEnd"/>
+      <w:r>
+        <w:t xml:space="preserve"> na pasta documentos para os testes, facilita o processo de testes no </w:t>
+      </w:r>
+      <w:proofErr w:type="spellStart"/>
+      <w:r>
+        <w:rPr>
+          <w:b/>
+          <w:bCs/>
+        </w:rPr>
+        <w:t>Postman</w:t>
+      </w:r>
+      <w:proofErr w:type="spellEnd"/>
+      <w:r>
+        <w:t xml:space="preserve"> ou </w:t>
+      </w:r>
+      <w:proofErr w:type="spellStart"/>
+      <w:r>
+        <w:rPr>
+          <w:b/>
+          <w:bCs/>
+        </w:rPr>
+        <w:t>Insomnia</w:t>
+      </w:r>
+      <w:proofErr w:type="spellEnd"/>
+      <w:r>
+        <w:t xml:space="preserve">, além disso na pasta documentos tem também um arquivo com todas as rotas para teste no </w:t>
+      </w:r>
+      <w:proofErr w:type="spellStart"/>
+      <w:r>
+        <w:rPr>
+          <w:b/>
+          <w:bCs/>
+        </w:rPr>
+        <w:t>Postman</w:t>
+      </w:r>
+      <w:proofErr w:type="spellEnd"/>
+      <w:r>
+        <w:t>.</w:t>
+      </w:r>
+    </w:p>
+    <w:p/>
+    <w:p>
+      <w:pPr>
+        <w:pStyle w:val="PargrafodaLista"/>
+        <w:numPr>
+          <w:ilvl w:val="0"/>
+          <w:numId w:val="12"/>
+        </w:numPr>
+        <w:rPr>
+          <w:b/>
+          <w:bCs/>
+        </w:rPr>
+      </w:pPr>
+      <w:proofErr w:type="spellStart"/>
+      <w:r>
+        <w:rPr>
+          <w:b/>
+          <w:bCs/>
+        </w:rPr>
+        <w:t>Professor</w:t>
+      </w:r>
+      <w:r>
+        <w:rPr>
+          <w:b/>
+          <w:bCs/>
+        </w:rPr>
+        <w:t>Controller</w:t>
+      </w:r>
+      <w:r>
+        <w:rPr>
+          <w:b/>
+          <w:bCs/>
+        </w:rPr>
+        <w:t>Test</w:t>
+      </w:r>
+      <w:proofErr w:type="spellEnd"/>
+    </w:p>
+    <w:p>
+      <w:r>
+        <w:drawing>
+          <wp:inline distT="0" distB="0" distL="0" distR="0" wp14:anchorId="69CEAE70" wp14:editId="51597815">
+            <wp:extent cx="6479540" cy="3509645"/>
+            <wp:effectExtent l="0" t="0" r="0" b="0"/>
+            <wp:docPr id="55" name="Imagem 55"/>
+            <wp:cNvGraphicFramePr>
+              <a:graphicFrameLocks xmlns:a="http://schemas.openxmlformats.org/drawingml/2006/main" noChangeAspect="1"/>
+            </wp:cNvGraphicFramePr>
+            <a:graphic xmlns:a="http://schemas.openxmlformats.org/drawingml/2006/main">
+              <a:graphicData uri="http://schemas.openxmlformats.org/drawingml/2006/picture">
+                <pic:pic xmlns:pic="http://schemas.openxmlformats.org/drawingml/2006/picture">
+                  <pic:nvPicPr>
+                    <pic:cNvPr id="1" name=""/>
+                    <pic:cNvPicPr/>
+                  </pic:nvPicPr>
+                  <pic:blipFill>
+                    <a:blip r:embed="rId22"/>
+                    <a:stretch>
+                      <a:fillRect/>
+                    </a:stretch>
+                  </pic:blipFill>
+                  <pic:spPr>
+                    <a:xfrm>
+                      <a:off x="0" y="0"/>
+                      <a:ext cx="6479540" cy="3509645"/>
+                    </a:xfrm>
+                    <a:prstGeom prst="rect">
+                      <a:avLst/>
+                    </a:prstGeom>
+                  </pic:spPr>
+                </pic:pic>
+              </a:graphicData>
+            </a:graphic>
+          </wp:inline>
+        </w:drawing>
+      </w:r>
+    </w:p>
+    <w:p/>
+    <w:p>
+      <w:pPr>
+        <w:pStyle w:val="PargrafodaLista"/>
+        <w:numPr>
+          <w:ilvl w:val="0"/>
+          <w:numId w:val="12"/>
+        </w:numPr>
+        <w:rPr>
+          <w:b/>
+          <w:bCs/>
+        </w:rPr>
+        <w:sectPr>
+          <w:pgSz w:w="11906" w:h="16838"/>
+          <w:pgMar w:top="851" w:right="851" w:bottom="851" w:left="851" w:header="709" w:footer="709" w:gutter="0"/>
+          <w:pgNumType w:start="0"/>
+          <w:cols w:space="708"/>
+          <w:titlePg/>
+          <w:docGrid w:linePitch="360"/>
+        </w:sectPr>
+      </w:pPr>
+    </w:p>
+    <w:p>
+      <w:pPr>
+        <w:pStyle w:val="PargrafodaLista"/>
+        <w:numPr>
+          <w:ilvl w:val="0"/>
+          <w:numId w:val="12"/>
+        </w:numPr>
+        <w:rPr>
+          <w:b/>
+          <w:bCs/>
+        </w:rPr>
+      </w:pPr>
+      <w:proofErr w:type="spellStart"/>
+      <w:r>
+        <w:rPr>
+          <w:b/>
+          <w:bCs/>
+        </w:rPr>
+        <w:lastRenderedPageBreak/>
+        <w:t>AlunoServiceTest</w:t>
+      </w:r>
+      <w:proofErr w:type="spellEnd"/>
+    </w:p>
+    <w:p>
+      <w:r>
+        <w:drawing>
+          <wp:inline distT="0" distB="0" distL="0" distR="0" wp14:anchorId="4E42B9BC" wp14:editId="1CC80CDF">
+            <wp:extent cx="6479540" cy="3509645"/>
+            <wp:effectExtent l="0" t="0" r="0" b="0"/>
+            <wp:docPr id="56" name="Imagem 56"/>
+            <wp:cNvGraphicFramePr>
+              <a:graphicFrameLocks xmlns:a="http://schemas.openxmlformats.org/drawingml/2006/main" noChangeAspect="1"/>
+            </wp:cNvGraphicFramePr>
+            <a:graphic xmlns:a="http://schemas.openxmlformats.org/drawingml/2006/main">
+              <a:graphicData uri="http://schemas.openxmlformats.org/drawingml/2006/picture">
+                <pic:pic xmlns:pic="http://schemas.openxmlformats.org/drawingml/2006/picture">
+                  <pic:nvPicPr>
+                    <pic:cNvPr id="1" name=""/>
+                    <pic:cNvPicPr/>
+                  </pic:nvPicPr>
+                  <pic:blipFill>
+                    <a:blip r:embed="rId23"/>
+                    <a:stretch>
+                      <a:fillRect/>
+                    </a:stretch>
+                  </pic:blipFill>
+                  <pic:spPr>
+                    <a:xfrm>
+                      <a:off x="0" y="0"/>
+                      <a:ext cx="6479540" cy="3509645"/>
+                    </a:xfrm>
+                    <a:prstGeom prst="rect">
+                      <a:avLst/>
+                    </a:prstGeom>
+                  </pic:spPr>
+                </pic:pic>
+              </a:graphicData>
+            </a:graphic>
+          </wp:inline>
+        </w:drawing>
+      </w:r>
+    </w:p>
+    <w:p/>
+    <w:p>
+      <w:pPr>
+        <w:pStyle w:val="PargrafodaLista"/>
+        <w:numPr>
+          <w:ilvl w:val="0"/>
+          <w:numId w:val="12"/>
+        </w:numPr>
+        <w:rPr>
+          <w:b/>
+          <w:bCs/>
+        </w:rPr>
+      </w:pPr>
+      <w:proofErr w:type="spellStart"/>
+      <w:r>
+        <w:rPr>
+          <w:b/>
+          <w:bCs/>
+        </w:rPr>
+        <w:t>Disciplina</w:t>
+      </w:r>
+      <w:r>
+        <w:rPr>
+          <w:b/>
+          <w:bCs/>
+        </w:rPr>
+        <w:t>ServiceTest</w:t>
+      </w:r>
+      <w:proofErr w:type="spellEnd"/>
+    </w:p>
+    <w:p>
+      <w:r>
+        <w:drawing>
+          <wp:inline distT="0" distB="0" distL="0" distR="0" wp14:anchorId="5BE73A15" wp14:editId="2B6A5294">
+            <wp:extent cx="6479540" cy="3509645"/>
+            <wp:effectExtent l="0" t="0" r="0" b="0"/>
+            <wp:docPr id="57" name="Imagem 57"/>
+            <wp:cNvGraphicFramePr>
+              <a:graphicFrameLocks xmlns:a="http://schemas.openxmlformats.org/drawingml/2006/main" noChangeAspect="1"/>
+            </wp:cNvGraphicFramePr>
+            <a:graphic xmlns:a="http://schemas.openxmlformats.org/drawingml/2006/main">
+              <a:graphicData uri="http://schemas.openxmlformats.org/drawingml/2006/picture">
+                <pic:pic xmlns:pic="http://schemas.openxmlformats.org/drawingml/2006/picture">
+                  <pic:nvPicPr>
+                    <pic:cNvPr id="1" name=""/>
+                    <pic:cNvPicPr/>
+                  </pic:nvPicPr>
+                  <pic:blipFill>
+                    <a:blip r:embed="rId24"/>
+                    <a:stretch>
+                      <a:fillRect/>
+                    </a:stretch>
+                  </pic:blipFill>
+                  <pic:spPr>
+                    <a:xfrm>
+                      <a:off x="0" y="0"/>
+                      <a:ext cx="6479540" cy="3509645"/>
+                    </a:xfrm>
+                    <a:prstGeom prst="rect">
+                      <a:avLst/>
+                    </a:prstGeom>
+                  </pic:spPr>
+                </pic:pic>
+              </a:graphicData>
+            </a:graphic>
+          </wp:inline>
+        </w:drawing>
+      </w:r>
+    </w:p>
+    <w:p>
+      <w:pPr>
+        <w:sectPr>
+          <w:pgSz w:w="11906" w:h="16838"/>
+          <w:pgMar w:top="851" w:right="851" w:bottom="851" w:left="851" w:header="709" w:footer="709" w:gutter="0"/>
+          <w:pgNumType w:start="0"/>
+          <w:cols w:space="708"/>
+          <w:titlePg/>
+          <w:docGrid w:linePitch="360"/>
+        </w:sectPr>
+      </w:pPr>
+    </w:p>
+    <w:p>
+      <w:pPr>
+        <w:pStyle w:val="Ttulo2"/>
+      </w:pPr>
+      <w:r>
+        <w:lastRenderedPageBreak/>
+        <w:t xml:space="preserve">  </w:t>
+      </w:r>
+      <w:r>
+        <w:t>A</w:t>
+      </w:r>
+      <w:r>
+        <w:t>utenticado</w:t>
+      </w:r>
+      <w:r>
+        <w:t xml:space="preserve"> do professor</w:t>
+      </w:r>
+    </w:p>
+    <w:p>
+      <w:pPr>
+        <w:pStyle w:val="PargrafodaLista"/>
+        <w:numPr>
+          <w:ilvl w:val="0"/>
+          <w:numId w:val="12"/>
+        </w:numPr>
+        <w:rPr>
+          <w:b/>
+          <w:bCs/>
+        </w:rPr>
+      </w:pPr>
+      <w:r>
+        <w:rPr>
+          <w:b/>
+          <w:bCs/>
+        </w:rPr>
+        <w:t>Site pra encriptação</w:t>
+      </w:r>
+    </w:p>
+    <w:p>
+      <w:hyperlink r:id="rId25" w:history="1">
+        <w:r>
+          <w:rPr>
+            <w:rStyle w:val="Hyperlink"/>
+          </w:rPr>
+          <w:t>https://bcrypt-generator.com/</w:t>
+        </w:r>
+      </w:hyperlink>
+    </w:p>
+    <w:p>
+      <w:pPr>
+        <w:pStyle w:val="PargrafodaLista"/>
+        <w:numPr>
+          <w:ilvl w:val="0"/>
+          <w:numId w:val="12"/>
+        </w:numPr>
+        <w:rPr>
+          <w:b/>
+          <w:bCs/>
+        </w:rPr>
+      </w:pPr>
+      <w:r>
+        <w:rPr>
+          <w:b/>
+          <w:bCs/>
+        </w:rPr>
+        <w:t>Obter Token</w:t>
+      </w:r>
+    </w:p>
+    <w:p>
+      <w:r>
+        <w:drawing>
+          <wp:inline distT="0" distB="0" distL="0" distR="0" wp14:anchorId="4EE03C43" wp14:editId="35C6A57A">
+            <wp:extent cx="6479540" cy="3509645"/>
+            <wp:effectExtent l="0" t="0" r="0" b="0"/>
+            <wp:docPr id="38" name="Imagem 38"/>
+            <wp:cNvGraphicFramePr>
+              <a:graphicFrameLocks xmlns:a="http://schemas.openxmlformats.org/drawingml/2006/main" noChangeAspect="1"/>
+            </wp:cNvGraphicFramePr>
+            <a:graphic xmlns:a="http://schemas.openxmlformats.org/drawingml/2006/main">
+              <a:graphicData uri="http://schemas.openxmlformats.org/drawingml/2006/picture">
+                <pic:pic xmlns:pic="http://schemas.openxmlformats.org/drawingml/2006/picture">
+                  <pic:nvPicPr>
+                    <pic:cNvPr id="1" name=""/>
+                    <pic:cNvPicPr/>
+                  </pic:nvPicPr>
+                  <pic:blipFill>
+                    <a:blip r:embed="rId26"/>
+                    <a:stretch>
+                      <a:fillRect/>
+                    </a:stretch>
+                  </pic:blipFill>
+                  <pic:spPr>
+                    <a:xfrm>
+                      <a:off x="0" y="0"/>
+                      <a:ext cx="6479540" cy="3509645"/>
+                    </a:xfrm>
+                    <a:prstGeom prst="rect">
+                      <a:avLst/>
+                    </a:prstGeom>
+                  </pic:spPr>
+                </pic:pic>
+              </a:graphicData>
+            </a:graphic>
+          </wp:inline>
+        </w:drawing>
+      </w:r>
+    </w:p>
+    <w:p>
+      <w:pPr>
+        <w:pStyle w:val="PargrafodaLista"/>
+        <w:numPr>
+          <w:ilvl w:val="0"/>
+          <w:numId w:val="12"/>
+        </w:numPr>
+        <w:rPr>
+          <w:b/>
+          <w:bCs/>
+        </w:rPr>
+      </w:pPr>
+      <w:proofErr w:type="spellStart"/>
+      <w:r>
+        <w:rPr>
+          <w:b/>
+          <w:bCs/>
+        </w:rPr>
+        <w:t>pg</w:t>
+      </w:r>
+      <w:proofErr w:type="spellEnd"/>
+      <w:r>
+        <w:rPr>
+          <w:b/>
+          <w:bCs/>
+        </w:rPr>
+        <w:t xml:space="preserve"> admin</w:t>
+      </w:r>
+    </w:p>
+    <w:p>
+      <w:pPr>
+        <w:ind w:left="360"/>
+      </w:pPr>
+      <w:r>
+        <w:t>user</w:t>
+      </w:r>
+      <w:r>
+        <w:t>: admin | senha: 123456</w:t>
+      </w:r>
+    </w:p>
+    <w:p>
+      <w:pPr>
+        <w:ind w:left="360"/>
+      </w:pPr>
+      <w:r>
+        <w:t>Token é salvo como uma varável pra facilitar os testes.</w:t>
+      </w:r>
+    </w:p>
+    <w:p>
+      <w:pPr>
+        <w:ind w:left="360"/>
+      </w:pPr>
+      <w:r>
+        <w:t>Endereço também é salvo como uma variável para facilitar os testes.</w:t>
+      </w:r>
+    </w:p>
+    <w:p>
+      <w:r>
+        <w:drawing>
+          <wp:inline distT="0" distB="0" distL="0" distR="0" wp14:anchorId="6D9DFC2F" wp14:editId="5B930E8F">
+            <wp:extent cx="6479540" cy="3509645"/>
+            <wp:effectExtent l="0" t="0" r="0" b="0"/>
+            <wp:docPr id="39" name="Imagem 39"/>
+            <wp:cNvGraphicFramePr>
+              <a:graphicFrameLocks xmlns:a="http://schemas.openxmlformats.org/drawingml/2006/main" noChangeAspect="1"/>
+            </wp:cNvGraphicFramePr>
+            <a:graphic xmlns:a="http://schemas.openxmlformats.org/drawingml/2006/main">
+              <a:graphicData uri="http://schemas.openxmlformats.org/drawingml/2006/picture">
+                <pic:pic xmlns:pic="http://schemas.openxmlformats.org/drawingml/2006/picture">
+                  <pic:nvPicPr>
+                    <pic:cNvPr id="1" name=""/>
+                    <pic:cNvPicPr/>
+                  </pic:nvPicPr>
+                  <pic:blipFill>
+                    <a:blip r:embed="rId27"/>
+                    <a:stretch>
+                      <a:fillRect/>
+                    </a:stretch>
+                  </pic:blipFill>
+                  <pic:spPr>
+                    <a:xfrm>
+                      <a:off x="0" y="0"/>
+                      <a:ext cx="6479540" cy="3509645"/>
+                    </a:xfrm>
+                    <a:prstGeom prst="rect">
+                      <a:avLst/>
+                    </a:prstGeom>
+                  </pic:spPr>
+                </pic:pic>
+              </a:graphicData>
+            </a:graphic>
+          </wp:inline>
+        </w:drawing>
+      </w:r>
+    </w:p>
+    <w:p>
+      <w:pPr>
+        <w:pStyle w:val="Ttulo2"/>
+        <w:sectPr>
+          <w:pgSz w:w="11906" w:h="16838"/>
+          <w:pgMar w:top="851" w:right="851" w:bottom="851" w:left="851" w:header="709" w:footer="709" w:gutter="0"/>
+          <w:pgNumType w:start="0"/>
+          <w:cols w:space="708"/>
+          <w:titlePg/>
+          <w:docGrid w:linePitch="360"/>
+        </w:sectPr>
+      </w:pPr>
+    </w:p>
+    <w:p>
+      <w:pPr>
+        <w:pStyle w:val="Ttulo2"/>
+      </w:pPr>
+      <w:r>
+        <w:lastRenderedPageBreak/>
+        <w:t>Banco de Dados escolhido</w:t>
+      </w:r>
+    </w:p>
+    <w:p>
+      <w:r>
+        <w:t xml:space="preserve">Fiz o projeto em dois bancos de dados para praticar mais, primeiro fiz em H2 porque é mais rápido pra min e depois fiz em </w:t>
+      </w:r>
+      <w:proofErr w:type="spellStart"/>
+      <w:r>
+        <w:t>postreSql</w:t>
+      </w:r>
+      <w:proofErr w:type="spellEnd"/>
+      <w:r>
+        <w:t>.</w:t>
+      </w:r>
+    </w:p>
+    <w:p/>
+    <w:p>
+      <w:r>
+        <w:t>O projeto está em duas branch:</w:t>
+      </w:r>
+    </w:p>
+    <w:p>
+      <w:pPr>
+        <w:pStyle w:val="PargrafodaLista"/>
+        <w:numPr>
+          <w:ilvl w:val="0"/>
+          <w:numId w:val="14"/>
+        </w:numPr>
+      </w:pPr>
+      <w:r>
+        <w:t xml:space="preserve">A branch </w:t>
+      </w:r>
+      <w:r>
+        <w:rPr>
+          <w:b/>
+          <w:bCs/>
+        </w:rPr>
+        <w:t>main</w:t>
+      </w:r>
+      <w:r>
+        <w:t xml:space="preserve"> está com H2, tem tudo</w:t>
+      </w:r>
+      <w:r>
+        <w:t xml:space="preserve"> menos </w:t>
+      </w:r>
+      <w:r>
+        <w:rPr>
+          <w:rStyle w:val="nfase"/>
+        </w:rPr>
+        <w:t>autenticação</w:t>
+      </w:r>
+      <w:r>
+        <w:rPr>
+          <w:rStyle w:val="nfase"/>
+        </w:rPr>
+        <w:t xml:space="preserve"> e</w:t>
+      </w:r>
+      <w:r>
+        <w:t xml:space="preserve"> arquivo </w:t>
+      </w:r>
+      <w:r>
+        <w:rPr>
+          <w:rStyle w:val="nfase"/>
+        </w:rPr>
+        <w:t>*.</w:t>
+      </w:r>
+      <w:proofErr w:type="spellStart"/>
+      <w:r>
+        <w:rPr>
+          <w:rStyle w:val="nfase"/>
+        </w:rPr>
+        <w:t>jar</w:t>
+      </w:r>
+      <w:proofErr w:type="spellEnd"/>
+      <w:r>
+        <w:t>.</w:t>
+      </w:r>
+    </w:p>
+    <w:p>
+      <w:pPr>
+        <w:pStyle w:val="PargrafodaLista"/>
+        <w:numPr>
+          <w:ilvl w:val="0"/>
+          <w:numId w:val="14"/>
+        </w:numPr>
+      </w:pPr>
+      <w:r>
+        <w:t xml:space="preserve">A branch </w:t>
+      </w:r>
+      <w:proofErr w:type="spellStart"/>
+      <w:r>
+        <w:t>postressql</w:t>
+      </w:r>
+      <w:proofErr w:type="spellEnd"/>
+      <w:r>
+        <w:t xml:space="preserve"> está em </w:t>
+      </w:r>
+      <w:proofErr w:type="spellStart"/>
+      <w:r>
+        <w:t>posgreSql</w:t>
+      </w:r>
+      <w:proofErr w:type="spellEnd"/>
+      <w:r>
+        <w:t xml:space="preserve">, </w:t>
+      </w:r>
+      <w:r>
+        <w:rPr>
+          <w:rStyle w:val="nfase"/>
+        </w:rPr>
+        <w:t>tem</w:t>
+      </w:r>
+      <w:r>
+        <w:rPr>
+          <w:rStyle w:val="nfase"/>
+        </w:rPr>
+        <w:t xml:space="preserve"> tudo (projeto, rotas, testes e autenticação)</w:t>
+      </w:r>
+      <w:r>
+        <w:t xml:space="preserve"> </w:t>
+      </w:r>
+      <w:r>
+        <w:t>.</w:t>
+      </w:r>
+    </w:p>
+    <w:p/>
+    <w:p>
+      <w:pPr>
+        <w:pStyle w:val="PargrafodaLista"/>
+        <w:numPr>
+          <w:ilvl w:val="0"/>
+          <w:numId w:val="12"/>
+        </w:numPr>
+      </w:pPr>
+      <w:r>
+        <w:rPr>
+          <w:b/>
+          <w:bCs/>
+        </w:rPr>
+        <w:t>Configuração do banco de Dados</w:t>
+      </w:r>
+      <w:r>
+        <w:br/>
+      </w:r>
+      <w:r>
+        <w:drawing>
+          <wp:inline distT="0" distB="0" distL="0" distR="0" wp14:anchorId="0FAC205C" wp14:editId="6E34553C">
+            <wp:extent cx="6479540" cy="3509645"/>
+            <wp:effectExtent l="0" t="0" r="0" b="0"/>
+            <wp:docPr id="52" name="Imagem 52"/>
+            <wp:cNvGraphicFramePr>
+              <a:graphicFrameLocks xmlns:a="http://schemas.openxmlformats.org/drawingml/2006/main" noChangeAspect="1"/>
+            </wp:cNvGraphicFramePr>
+            <a:graphic xmlns:a="http://schemas.openxmlformats.org/drawingml/2006/main">
+              <a:graphicData uri="http://schemas.openxmlformats.org/drawingml/2006/picture">
+                <pic:pic xmlns:pic="http://schemas.openxmlformats.org/drawingml/2006/picture">
+                  <pic:nvPicPr>
+                    <pic:cNvPr id="1" name=""/>
+                    <pic:cNvPicPr/>
+                  </pic:nvPicPr>
+                  <pic:blipFill>
+                    <a:blip r:embed="rId28"/>
+                    <a:stretch>
+                      <a:fillRect/>
+                    </a:stretch>
+                  </pic:blipFill>
+                  <pic:spPr>
+                    <a:xfrm>
+                      <a:off x="0" y="0"/>
+                      <a:ext cx="6479540" cy="3509645"/>
+                    </a:xfrm>
+                    <a:prstGeom prst="rect">
+                      <a:avLst/>
+                    </a:prstGeom>
+                  </pic:spPr>
+                </pic:pic>
+              </a:graphicData>
+            </a:graphic>
+          </wp:inline>
+        </w:drawing>
+      </w:r>
+    </w:p>
+    <w:p>
+      <w:pPr>
+        <w:pStyle w:val="PargrafodaLista"/>
+        <w:numPr>
+          <w:ilvl w:val="0"/>
+          <w:numId w:val="12"/>
+        </w:numPr>
+        <w:rPr>
+          <w:b/>
+          <w:bCs/>
+        </w:rPr>
+      </w:pPr>
+      <w:proofErr w:type="spellStart"/>
+      <w:r>
+        <w:rPr>
+          <w:b/>
+          <w:bCs/>
+        </w:rPr>
+        <w:t>schema.sql</w:t>
+      </w:r>
+      <w:proofErr w:type="spellEnd"/>
+    </w:p>
+    <w:p>
+      <w:pPr>
+        <w:ind w:left="360"/>
+      </w:pPr>
+      <w:r>
+        <w:drawing>
+          <wp:inline distT="0" distB="0" distL="0" distR="0" wp14:anchorId="45528140" wp14:editId="1ACEF1F6">
+            <wp:extent cx="6479540" cy="3509645"/>
+            <wp:effectExtent l="0" t="0" r="0" b="0"/>
+            <wp:docPr id="53" name="Imagem 53"/>
+            <wp:cNvGraphicFramePr>
+              <a:graphicFrameLocks xmlns:a="http://schemas.openxmlformats.org/drawingml/2006/main" noChangeAspect="1"/>
+            </wp:cNvGraphicFramePr>
+            <a:graphic xmlns:a="http://schemas.openxmlformats.org/drawingml/2006/main">
+              <a:graphicData uri="http://schemas.openxmlformats.org/drawingml/2006/picture">
+                <pic:pic xmlns:pic="http://schemas.openxmlformats.org/drawingml/2006/picture">
+                  <pic:nvPicPr>
+                    <pic:cNvPr id="1" name=""/>
+                    <pic:cNvPicPr/>
+                  </pic:nvPicPr>
+                  <pic:blipFill>
+                    <a:blip r:embed="rId29"/>
+                    <a:stretch>
+                      <a:fillRect/>
+                    </a:stretch>
+                  </pic:blipFill>
+                  <pic:spPr>
+                    <a:xfrm>
+                      <a:off x="0" y="0"/>
+                      <a:ext cx="6479540" cy="3509645"/>
+                    </a:xfrm>
+                    <a:prstGeom prst="rect">
+                      <a:avLst/>
+                    </a:prstGeom>
+                  </pic:spPr>
+                </pic:pic>
+              </a:graphicData>
+            </a:graphic>
+          </wp:inline>
+        </w:drawing>
+      </w:r>
+    </w:p>
+    <w:p>
+      <w:pPr>
         <w:pStyle w:val="Ttulo1"/>
       </w:pPr>
       <w:r>
+        <w:lastRenderedPageBreak/>
         <w:t>Faça o deploy do serviço/aplicação desenvolvido.</w:t>
+      </w:r>
+    </w:p>
+    <w:p>
+      <w:r>
+        <w:t xml:space="preserve">Gerei o arquivo </w:t>
+      </w:r>
+      <w:r>
+        <w:rPr>
+          <w:b/>
+          <w:bCs/>
+        </w:rPr>
+        <w:t>*.</w:t>
+      </w:r>
+      <w:proofErr w:type="spellStart"/>
+      <w:r>
+        <w:rPr>
+          <w:b/>
+          <w:bCs/>
+        </w:rPr>
+        <w:t>jar</w:t>
+      </w:r>
+      <w:proofErr w:type="spellEnd"/>
+      <w:r>
+        <w:t xml:space="preserve"> conforme informado em aula.</w:t>
+      </w:r>
+    </w:p>
+    <w:p>
+      <w:r>
+        <w:drawing>
+          <wp:inline distT="0" distB="0" distL="0" distR="0" wp14:anchorId="090025A9" wp14:editId="3696EB53">
+            <wp:extent cx="6479540" cy="3509645"/>
+            <wp:effectExtent l="0" t="0" r="0" b="0"/>
+            <wp:docPr id="54" name="Imagem 54"/>
+            <wp:cNvGraphicFramePr>
+              <a:graphicFrameLocks xmlns:a="http://schemas.openxmlformats.org/drawingml/2006/main" noChangeAspect="1"/>
+            </wp:cNvGraphicFramePr>
+            <a:graphic xmlns:a="http://schemas.openxmlformats.org/drawingml/2006/main">
+              <a:graphicData uri="http://schemas.openxmlformats.org/drawingml/2006/picture">
+                <pic:pic xmlns:pic="http://schemas.openxmlformats.org/drawingml/2006/picture">
+                  <pic:nvPicPr>
+                    <pic:cNvPr id="1" name=""/>
+                    <pic:cNvPicPr/>
+                  </pic:nvPicPr>
+                  <pic:blipFill>
+                    <a:blip r:embed="rId30"/>
+                    <a:stretch>
+                      <a:fillRect/>
+                    </a:stretch>
+                  </pic:blipFill>
+                  <pic:spPr>
+                    <a:xfrm>
+                      <a:off x="0" y="0"/>
+                      <a:ext cx="6479540" cy="3509645"/>
+                    </a:xfrm>
+                    <a:prstGeom prst="rect">
+                      <a:avLst/>
+                    </a:prstGeom>
+                  </pic:spPr>
+                </pic:pic>
+              </a:graphicData>
+            </a:graphic>
+          </wp:inline>
+        </w:drawing>
       </w:r>
     </w:p>
     <w:sectPr>
@@ -7672,7 +10412,7 @@
   <w:abstractNum w:abstractNumId="1" w15:restartNumberingAfterBreak="0">
     <w:nsid w:val="25782FBF"/>
     <w:multiLevelType w:val="hybridMultilevel"/>
-    <w:tmpl w:val="2E8E87EA"/>
+    <w:tmpl w:val="B094C274"/>
     <w:lvl w:ilvl="0" w:tplc="04160001">
       <w:start w:val="1"/>
       <w:numFmt w:val="bullet"/>
@@ -7982,6 +10722,119 @@
     </w:lvl>
   </w:abstractNum>
   <w:abstractNum w:abstractNumId="4" w15:restartNumberingAfterBreak="0">
+    <w:nsid w:val="5D4D0AE7"/>
+    <w:multiLevelType w:val="hybridMultilevel"/>
+    <w:tmpl w:val="C8888568"/>
+    <w:lvl w:ilvl="0" w:tplc="04160003">
+      <w:start w:val="1"/>
+      <w:numFmt w:val="bullet"/>
+      <w:lvlText w:val="o"/>
+      <w:lvlJc w:val="left"/>
+      <w:pPr>
+        <w:ind w:left="720" w:hanging="360"/>
+      </w:pPr>
+      <w:rPr>
+        <w:rFonts w:ascii="Courier New" w:hAnsi="Courier New" w:cs="Courier New" w:hint="default"/>
+      </w:rPr>
+    </w:lvl>
+    <w:lvl w:ilvl="1" w:tplc="04160003" w:tentative="1">
+      <w:start w:val="1"/>
+      <w:numFmt w:val="bullet"/>
+      <w:lvlText w:val="o"/>
+      <w:lvlJc w:val="left"/>
+      <w:pPr>
+        <w:ind w:left="1440" w:hanging="360"/>
+      </w:pPr>
+      <w:rPr>
+        <w:rFonts w:ascii="Courier New" w:hAnsi="Courier New" w:cs="Courier New" w:hint="default"/>
+      </w:rPr>
+    </w:lvl>
+    <w:lvl w:ilvl="2" w:tplc="04160005" w:tentative="1">
+      <w:start w:val="1"/>
+      <w:numFmt w:val="bullet"/>
+      <w:lvlText w:val=""/>
+      <w:lvlJc w:val="left"/>
+      <w:pPr>
+        <w:ind w:left="2160" w:hanging="360"/>
+      </w:pPr>
+      <w:rPr>
+        <w:rFonts w:ascii="Wingdings" w:hAnsi="Wingdings" w:hint="default"/>
+      </w:rPr>
+    </w:lvl>
+    <w:lvl w:ilvl="3" w:tplc="04160001" w:tentative="1">
+      <w:start w:val="1"/>
+      <w:numFmt w:val="bullet"/>
+      <w:lvlText w:val=""/>
+      <w:lvlJc w:val="left"/>
+      <w:pPr>
+        <w:ind w:left="2880" w:hanging="360"/>
+      </w:pPr>
+      <w:rPr>
+        <w:rFonts w:ascii="Symbol" w:hAnsi="Symbol" w:hint="default"/>
+      </w:rPr>
+    </w:lvl>
+    <w:lvl w:ilvl="4" w:tplc="04160003" w:tentative="1">
+      <w:start w:val="1"/>
+      <w:numFmt w:val="bullet"/>
+      <w:lvlText w:val="o"/>
+      <w:lvlJc w:val="left"/>
+      <w:pPr>
+        <w:ind w:left="3600" w:hanging="360"/>
+      </w:pPr>
+      <w:rPr>
+        <w:rFonts w:ascii="Courier New" w:hAnsi="Courier New" w:cs="Courier New" w:hint="default"/>
+      </w:rPr>
+    </w:lvl>
+    <w:lvl w:ilvl="5" w:tplc="04160005" w:tentative="1">
+      <w:start w:val="1"/>
+      <w:numFmt w:val="bullet"/>
+      <w:lvlText w:val=""/>
+      <w:lvlJc w:val="left"/>
+      <w:pPr>
+        <w:ind w:left="4320" w:hanging="360"/>
+      </w:pPr>
+      <w:rPr>
+        <w:rFonts w:ascii="Wingdings" w:hAnsi="Wingdings" w:hint="default"/>
+      </w:rPr>
+    </w:lvl>
+    <w:lvl w:ilvl="6" w:tplc="04160001" w:tentative="1">
+      <w:start w:val="1"/>
+      <w:numFmt w:val="bullet"/>
+      <w:lvlText w:val=""/>
+      <w:lvlJc w:val="left"/>
+      <w:pPr>
+        <w:ind w:left="5040" w:hanging="360"/>
+      </w:pPr>
+      <w:rPr>
+        <w:rFonts w:ascii="Symbol" w:hAnsi="Symbol" w:hint="default"/>
+      </w:rPr>
+    </w:lvl>
+    <w:lvl w:ilvl="7" w:tplc="04160003" w:tentative="1">
+      <w:start w:val="1"/>
+      <w:numFmt w:val="bullet"/>
+      <w:lvlText w:val="o"/>
+      <w:lvlJc w:val="left"/>
+      <w:pPr>
+        <w:ind w:left="5760" w:hanging="360"/>
+      </w:pPr>
+      <w:rPr>
+        <w:rFonts w:ascii="Courier New" w:hAnsi="Courier New" w:cs="Courier New" w:hint="default"/>
+      </w:rPr>
+    </w:lvl>
+    <w:lvl w:ilvl="8" w:tplc="04160005" w:tentative="1">
+      <w:start w:val="1"/>
+      <w:numFmt w:val="bullet"/>
+      <w:lvlText w:val=""/>
+      <w:lvlJc w:val="left"/>
+      <w:pPr>
+        <w:ind w:left="6480" w:hanging="360"/>
+      </w:pPr>
+      <w:rPr>
+        <w:rFonts w:ascii="Wingdings" w:hAnsi="Wingdings" w:hint="default"/>
+      </w:rPr>
+    </w:lvl>
+  </w:abstractNum>
+  <w:abstractNum w:abstractNumId="5" w15:restartNumberingAfterBreak="0">
     <w:nsid w:val="60585075"/>
     <w:multiLevelType w:val="hybridMultilevel"/>
     <w:tmpl w:val="CF407560"/>
@@ -8071,7 +10924,7 @@
       </w:pPr>
     </w:lvl>
   </w:abstractNum>
-  <w:abstractNum w:abstractNumId="5" w15:restartNumberingAfterBreak="0">
+  <w:abstractNum w:abstractNumId="6" w15:restartNumberingAfterBreak="0">
     <w:nsid w:val="6B8B12A8"/>
     <w:multiLevelType w:val="hybridMultilevel"/>
     <w:tmpl w:val="9C2492EC"/>
@@ -8157,7 +11010,97 @@
       </w:pPr>
     </w:lvl>
   </w:abstractNum>
-  <w:abstractNum w:abstractNumId="6" w15:restartNumberingAfterBreak="0">
+  <w:abstractNum w:abstractNumId="7" w15:restartNumberingAfterBreak="0">
+    <w:nsid w:val="6FDF1ACC"/>
+    <w:multiLevelType w:val="hybridMultilevel"/>
+    <w:tmpl w:val="5D946066"/>
+    <w:lvl w:ilvl="0" w:tplc="C87CEC38">
+      <w:start w:val="1"/>
+      <w:numFmt w:val="decimal"/>
+      <w:pStyle w:val="Ttulo2"/>
+      <w:lvlText w:val="%1)"/>
+      <w:lvlJc w:val="left"/>
+      <w:pPr>
+        <w:ind w:left="720" w:hanging="360"/>
+      </w:pPr>
+      <w:rPr>
+        <w:rFonts w:hint="default"/>
+      </w:rPr>
+    </w:lvl>
+    <w:lvl w:ilvl="1" w:tplc="04160019" w:tentative="1">
+      <w:start w:val="1"/>
+      <w:numFmt w:val="lowerLetter"/>
+      <w:lvlText w:val="%2."/>
+      <w:lvlJc w:val="left"/>
+      <w:pPr>
+        <w:ind w:left="1440" w:hanging="360"/>
+      </w:pPr>
+    </w:lvl>
+    <w:lvl w:ilvl="2" w:tplc="0416001B" w:tentative="1">
+      <w:start w:val="1"/>
+      <w:numFmt w:val="lowerRoman"/>
+      <w:lvlText w:val="%3."/>
+      <w:lvlJc w:val="right"/>
+      <w:pPr>
+        <w:ind w:left="2160" w:hanging="180"/>
+      </w:pPr>
+    </w:lvl>
+    <w:lvl w:ilvl="3" w:tplc="0416000F" w:tentative="1">
+      <w:start w:val="1"/>
+      <w:numFmt w:val="decimal"/>
+      <w:lvlText w:val="%4."/>
+      <w:lvlJc w:val="left"/>
+      <w:pPr>
+        <w:ind w:left="2880" w:hanging="360"/>
+      </w:pPr>
+    </w:lvl>
+    <w:lvl w:ilvl="4" w:tplc="04160019" w:tentative="1">
+      <w:start w:val="1"/>
+      <w:numFmt w:val="lowerLetter"/>
+      <w:lvlText w:val="%5."/>
+      <w:lvlJc w:val="left"/>
+      <w:pPr>
+        <w:ind w:left="3600" w:hanging="360"/>
+      </w:pPr>
+    </w:lvl>
+    <w:lvl w:ilvl="5" w:tplc="0416001B" w:tentative="1">
+      <w:start w:val="1"/>
+      <w:numFmt w:val="lowerRoman"/>
+      <w:lvlText w:val="%6."/>
+      <w:lvlJc w:val="right"/>
+      <w:pPr>
+        <w:ind w:left="4320" w:hanging="180"/>
+      </w:pPr>
+    </w:lvl>
+    <w:lvl w:ilvl="6" w:tplc="0416000F" w:tentative="1">
+      <w:start w:val="1"/>
+      <w:numFmt w:val="decimal"/>
+      <w:lvlText w:val="%7."/>
+      <w:lvlJc w:val="left"/>
+      <w:pPr>
+        <w:ind w:left="5040" w:hanging="360"/>
+      </w:pPr>
+    </w:lvl>
+    <w:lvl w:ilvl="7" w:tplc="04160019" w:tentative="1">
+      <w:start w:val="1"/>
+      <w:numFmt w:val="lowerLetter"/>
+      <w:lvlText w:val="%8."/>
+      <w:lvlJc w:val="left"/>
+      <w:pPr>
+        <w:ind w:left="5760" w:hanging="360"/>
+      </w:pPr>
+    </w:lvl>
+    <w:lvl w:ilvl="8" w:tplc="0416001B" w:tentative="1">
+      <w:start w:val="1"/>
+      <w:numFmt w:val="lowerRoman"/>
+      <w:lvlText w:val="%9."/>
+      <w:lvlJc w:val="right"/>
+      <w:pPr>
+        <w:ind w:left="6480" w:hanging="180"/>
+      </w:pPr>
+    </w:lvl>
+  </w:abstractNum>
+  <w:abstractNum w:abstractNumId="8" w15:restartNumberingAfterBreak="0">
     <w:nsid w:val="718A0047"/>
     <w:multiLevelType w:val="hybridMultilevel"/>
     <w:tmpl w:val="974E06F8"/>
@@ -8243,7 +11186,7 @@
       </w:pPr>
     </w:lvl>
   </w:abstractNum>
-  <w:abstractNum w:abstractNumId="7" w15:restartNumberingAfterBreak="0">
+  <w:abstractNum w:abstractNumId="9" w15:restartNumberingAfterBreak="0">
     <w:nsid w:val="7677085D"/>
     <w:multiLevelType w:val="hybridMultilevel"/>
     <w:tmpl w:val="1B90EBFC"/>
@@ -8356,7 +11299,7 @@
       </w:rPr>
     </w:lvl>
   </w:abstractNum>
-  <w:abstractNum w:abstractNumId="8" w15:restartNumberingAfterBreak="0">
+  <w:abstractNum w:abstractNumId="10" w15:restartNumberingAfterBreak="0">
     <w:nsid w:val="7A2D605C"/>
     <w:multiLevelType w:val="hybridMultilevel"/>
     <w:tmpl w:val="9C2492EC"/>
@@ -8443,31 +11386,31 @@
     </w:lvl>
   </w:abstractNum>
   <w:num w:numId="1">
-    <w:abstractNumId w:val="4"/>
+    <w:abstractNumId w:val="5"/>
   </w:num>
   <w:num w:numId="2">
     <w:abstractNumId w:val="2"/>
   </w:num>
   <w:num w:numId="3">
-    <w:abstractNumId w:val="8"/>
+    <w:abstractNumId w:val="10"/>
   </w:num>
   <w:num w:numId="4">
-    <w:abstractNumId w:val="5"/>
+    <w:abstractNumId w:val="6"/>
   </w:num>
   <w:num w:numId="5">
     <w:abstractNumId w:val="0"/>
   </w:num>
   <w:num w:numId="6">
-    <w:abstractNumId w:val="6"/>
+    <w:abstractNumId w:val="8"/>
   </w:num>
   <w:num w:numId="7">
-    <w:abstractNumId w:val="4"/>
+    <w:abstractNumId w:val="5"/>
   </w:num>
   <w:num w:numId="8">
-    <w:abstractNumId w:val="7"/>
+    <w:abstractNumId w:val="9"/>
   </w:num>
   <w:num w:numId="9">
-    <w:abstractNumId w:val="4"/>
+    <w:abstractNumId w:val="5"/>
     <w:lvlOverride w:ilvl="0">
       <w:startOverride w:val="9"/>
     </w:lvlOverride>
@@ -8476,10 +11419,16 @@
     <w:abstractNumId w:val="3"/>
   </w:num>
   <w:num w:numId="11">
-    <w:abstractNumId w:val="4"/>
+    <w:abstractNumId w:val="5"/>
   </w:num>
   <w:num w:numId="12">
     <w:abstractNumId w:val="1"/>
+  </w:num>
+  <w:num w:numId="13">
+    <w:abstractNumId w:val="7"/>
+  </w:num>
+  <w:num w:numId="14">
+    <w:abstractNumId w:val="4"/>
   </w:num>
   <w:numIdMacAtCleanup w:val="4"/>
 </w:numbering>
@@ -8922,11 +11871,15 @@
     <w:uiPriority w:val="9"/>
     <w:unhideWhenUsed/>
     <w:qFormat/>
-    <w:rsid w:val="00B06D7C"/>
+    <w:rsid w:val="006E74B5"/>
     <w:pPr>
       <w:keepNext/>
       <w:keepLines/>
-      <w:spacing w:before="40"/>
+      <w:numPr>
+        <w:numId w:val="13"/>
+      </w:numPr>
+      <w:spacing w:before="200"/>
+      <w:ind w:left="714" w:hanging="357"/>
       <w:outlineLvl w:val="1"/>
     </w:pPr>
     <w:rPr>
@@ -8962,6 +11915,7 @@
   <w:style w:type="character" w:default="1" w:styleId="Fontepargpadro">
     <w:name w:val="Default Paragraph Font"/>
     <w:uiPriority w:val="1"/>
+    <w:semiHidden/>
     <w:unhideWhenUsed/>
   </w:style>
   <w:style w:type="table" w:default="1" w:styleId="Tabelanormal">
@@ -9089,7 +12043,7 @@
     <w:basedOn w:val="Fontepargpadro"/>
     <w:link w:val="Ttulo2"/>
     <w:uiPriority w:val="9"/>
-    <w:rsid w:val="00B06D7C"/>
+    <w:rsid w:val="006E74B5"/>
     <w:rPr>
       <w:rFonts w:asciiTheme="majorHAnsi" w:eastAsiaTheme="majorEastAsia" w:hAnsiTheme="majorHAnsi" w:cstheme="majorBidi"/>
       <w:color w:val="2F5496" w:themeColor="accent1" w:themeShade="BF"/>
@@ -9549,7 +12503,7 @@
 
 <file path=customXml/item1.xml><?xml version="1.0" encoding="utf-8"?>
 <CoverPageProperties xmlns="http://schemas.microsoft.com/office/2006/coverPageProps">
-  <PublishDate>2025-09-22T00:00:00</PublishDate>
+  <PublishDate>2025-09-25T00:00:00</PublishDate>
   <Abstract/>
   <CompanyAddress/>
   <CompanyPhone/>

</xml_diff>

<commit_message>
Fix: Corrigido link dentro do PDF do AT
</commit_message>
<xml_diff>
--- a/AT/documentos/samuel_hermany_DR3_AT.docx
+++ b/AT/documentos/samuel_hermany_DR3_AT.docx
@@ -4552,10 +4552,89 @@
       </w:r>
     </w:p>
     <w:p>
-      <w:r>
-        <w:t>F</w:t>
-      </w:r>
-    </w:p>
+      <w:pPr>
+        <w:pStyle w:val="PargrafodaLista"/>
+        <w:numPr>
+          <w:ilvl w:val="0"/>
+          <w:numId w:val="15"/>
+        </w:numPr>
+        <w:rPr>
+          <w:b/>
+          <w:bCs/>
+        </w:rPr>
+      </w:pPr>
+      <w:r>
+        <w:rPr>
+          <w:b/>
+          <w:bCs/>
+        </w:rPr>
+        <w:t>Branch main – não tem Autenticação</w:t>
+      </w:r>
+    </w:p>
+    <w:p>
+      <w:hyperlink r:id="rId7" w:history="1">
+        <w:r>
+          <w:rPr>
+            <w:rStyle w:val="Hyperlink"/>
+          </w:rPr>
+          <w:t>https://github.com/faculdade-infnet/V-1-Spring_Boot/tree/main/AT</w:t>
+        </w:r>
+      </w:hyperlink>
+    </w:p>
+    <w:p>
+      <w:pPr>
+        <w:pStyle w:val="PargrafodaLista"/>
+        <w:numPr>
+          <w:ilvl w:val="0"/>
+          <w:numId w:val="15"/>
+        </w:numPr>
+        <w:rPr>
+          <w:b/>
+          <w:bCs/>
+        </w:rPr>
+      </w:pPr>
+      <w:r>
+        <w:rPr>
+          <w:b/>
+          <w:bCs/>
+        </w:rPr>
+        <w:t xml:space="preserve">Branch </w:t>
+      </w:r>
+      <w:proofErr w:type="spellStart"/>
+      <w:r>
+        <w:rPr>
+          <w:b/>
+          <w:bCs/>
+        </w:rPr>
+        <w:t>postgressql</w:t>
+      </w:r>
+      <w:proofErr w:type="spellEnd"/>
+      <w:r>
+        <w:rPr>
+          <w:b/>
+          <w:bCs/>
+        </w:rPr>
+        <w:t xml:space="preserve"> – </w:t>
+      </w:r>
+      <w:r>
+        <w:rPr>
+          <w:b/>
+          <w:bCs/>
+        </w:rPr>
+        <w:t>está completo</w:t>
+      </w:r>
+    </w:p>
+    <w:p>
+      <w:hyperlink r:id="rId8" w:history="1">
+        <w:r>
+          <w:rPr>
+            <w:rStyle w:val="Hyperlink"/>
+          </w:rPr>
+          <w:t>https://github.com/faculdade-infnet/V-1-Spring_Boot/tree/posgressql/AT</w:t>
+        </w:r>
+      </w:hyperlink>
+    </w:p>
+    <w:p/>
     <w:p>
       <w:pPr>
         <w:pStyle w:val="Ttulo1"/>
@@ -4865,13 +4944,13 @@
       </w:r>
     </w:p>
     <w:p>
-      <w:r>
-        <w:rPr>
-          <w:noProof/>
-        </w:rPr>
+      <w:pPr>
+        <w:pStyle w:val="Imagem"/>
+      </w:pPr>
+      <w:r>
         <w:drawing>
-          <wp:inline distT="0" distB="0" distL="0" distR="0" wp14:anchorId="115A47B5" wp14:editId="24C2A1D5">
-            <wp:extent cx="6479540" cy="5695315"/>
+          <wp:inline distT="0" distB="0" distL="0" distR="0" wp14:anchorId="115A47B5" wp14:editId="3996C42B">
+            <wp:extent cx="6003234" cy="5276657"/>
             <wp:effectExtent l="0" t="0" r="0" b="635"/>
             <wp:docPr id="33" name="Imagem 33"/>
             <wp:cNvGraphicFramePr>
@@ -4885,7 +4964,7 @@
                     <pic:cNvPicPr/>
                   </pic:nvPicPr>
                   <pic:blipFill>
-                    <a:blip r:embed="rId7"/>
+                    <a:blip r:embed="rId9"/>
                     <a:stretch>
                       <a:fillRect/>
                     </a:stretch>
@@ -4893,7 +4972,7 @@
                   <pic:spPr>
                     <a:xfrm>
                       <a:off x="0" y="0"/>
-                      <a:ext cx="6479540" cy="5695315"/>
+                      <a:ext cx="6014173" cy="5286272"/>
                     </a:xfrm>
                     <a:prstGeom prst="rect">
                       <a:avLst/>
@@ -5291,7 +5370,7 @@
                     <pic:cNvPicPr/>
                   </pic:nvPicPr>
                   <pic:blipFill>
-                    <a:blip r:embed="rId8"/>
+                    <a:blip r:embed="rId10"/>
                     <a:stretch>
                       <a:fillRect/>
                     </a:stretch>
@@ -5776,7 +5855,7 @@
                     <pic:cNvPicPr/>
                   </pic:nvPicPr>
                   <pic:blipFill>
-                    <a:blip r:embed="rId9"/>
+                    <a:blip r:embed="rId11"/>
                     <a:stretch>
                       <a:fillRect/>
                     </a:stretch>
@@ -6176,7 +6255,7 @@
                     <pic:cNvPicPr/>
                   </pic:nvPicPr>
                   <pic:blipFill>
-                    <a:blip r:embed="rId10"/>
+                    <a:blip r:embed="rId12"/>
                     <a:stretch>
                       <a:fillRect/>
                     </a:stretch>
@@ -8735,173 +8814,14 @@
     </w:p>
     <w:p>
       <w:r>
+        <w:rPr>
+          <w:noProof/>
+        </w:rPr>
         <w:drawing>
           <wp:inline distT="0" distB="0" distL="0" distR="0" wp14:anchorId="5E6DC5FC" wp14:editId="18FC923F">
             <wp:extent cx="6479540" cy="3509645"/>
             <wp:effectExtent l="0" t="0" r="0" b="0"/>
             <wp:docPr id="40" name="Imagem 40"/>
-            <wp:cNvGraphicFramePr>
-              <a:graphicFrameLocks xmlns:a="http://schemas.openxmlformats.org/drawingml/2006/main" noChangeAspect="1"/>
-            </wp:cNvGraphicFramePr>
-            <a:graphic xmlns:a="http://schemas.openxmlformats.org/drawingml/2006/main">
-              <a:graphicData uri="http://schemas.openxmlformats.org/drawingml/2006/picture">
-                <pic:pic xmlns:pic="http://schemas.openxmlformats.org/drawingml/2006/picture">
-                  <pic:nvPicPr>
-                    <pic:cNvPr id="1" name=""/>
-                    <pic:cNvPicPr/>
-                  </pic:nvPicPr>
-                  <pic:blipFill>
-                    <a:blip r:embed="rId11"/>
-                    <a:stretch>
-                      <a:fillRect/>
-                    </a:stretch>
-                  </pic:blipFill>
-                  <pic:spPr>
-                    <a:xfrm>
-                      <a:off x="0" y="0"/>
-                      <a:ext cx="6479540" cy="3509645"/>
-                    </a:xfrm>
-                    <a:prstGeom prst="rect">
-                      <a:avLst/>
-                    </a:prstGeom>
-                  </pic:spPr>
-                </pic:pic>
-              </a:graphicData>
-            </a:graphic>
-          </wp:inline>
-        </w:drawing>
-      </w:r>
-    </w:p>
-    <w:p/>
-    <w:p>
-      <w:pPr>
-        <w:pStyle w:val="PargrafodaLista"/>
-        <w:numPr>
-          <w:ilvl w:val="0"/>
-          <w:numId w:val="12"/>
-        </w:numPr>
-        <w:rPr>
-          <w:b/>
-          <w:bCs/>
-        </w:rPr>
-      </w:pPr>
-      <w:r>
-        <w:rPr>
-          <w:b/>
-          <w:bCs/>
-        </w:rPr>
-        <w:t>Autorizado</w:t>
-      </w:r>
-      <w:r>
-        <w:rPr>
-          <w:b/>
-          <w:bCs/>
-        </w:rPr>
-        <w:t xml:space="preserve"> Token</w:t>
-      </w:r>
-    </w:p>
-    <w:p>
-      <w:r>
-        <w:drawing>
-          <wp:inline distT="0" distB="0" distL="0" distR="0" wp14:anchorId="1A96212A" wp14:editId="350494F2">
-            <wp:extent cx="6479540" cy="3509645"/>
-            <wp:effectExtent l="0" t="0" r="0" b="0"/>
-            <wp:docPr id="41" name="Imagem 41"/>
-            <wp:cNvGraphicFramePr>
-              <a:graphicFrameLocks xmlns:a="http://schemas.openxmlformats.org/drawingml/2006/main" noChangeAspect="1"/>
-            </wp:cNvGraphicFramePr>
-            <a:graphic xmlns:a="http://schemas.openxmlformats.org/drawingml/2006/main">
-              <a:graphicData uri="http://schemas.openxmlformats.org/drawingml/2006/picture">
-                <pic:pic xmlns:pic="http://schemas.openxmlformats.org/drawingml/2006/picture">
-                  <pic:nvPicPr>
-                    <pic:cNvPr id="1" name=""/>
-                    <pic:cNvPicPr/>
-                  </pic:nvPicPr>
-                  <pic:blipFill>
-                    <a:blip r:embed="rId12"/>
-                    <a:stretch>
-                      <a:fillRect/>
-                    </a:stretch>
-                  </pic:blipFill>
-                  <pic:spPr>
-                    <a:xfrm>
-                      <a:off x="0" y="0"/>
-                      <a:ext cx="6479540" cy="3509645"/>
-                    </a:xfrm>
-                    <a:prstGeom prst="rect">
-                      <a:avLst/>
-                    </a:prstGeom>
-                  </pic:spPr>
-                </pic:pic>
-              </a:graphicData>
-            </a:graphic>
-          </wp:inline>
-        </w:drawing>
-      </w:r>
-    </w:p>
-    <w:p>
-      <w:pPr>
-        <w:pStyle w:val="PargrafodaLista"/>
-        <w:numPr>
-          <w:ilvl w:val="0"/>
-          <w:numId w:val="12"/>
-        </w:numPr>
-        <w:rPr>
-          <w:b/>
-          <w:bCs/>
-        </w:rPr>
-        <w:sectPr>
-          <w:pgSz w:w="11906" w:h="16838"/>
-          <w:pgMar w:top="851" w:right="851" w:bottom="851" w:left="851" w:header="709" w:footer="709" w:gutter="0"/>
-          <w:pgNumType w:start="0"/>
-          <w:cols w:space="708"/>
-          <w:titlePg/>
-          <w:docGrid w:linePitch="360"/>
-        </w:sectPr>
-      </w:pPr>
-    </w:p>
-    <w:p>
-      <w:pPr>
-        <w:pStyle w:val="PargrafodaLista"/>
-        <w:numPr>
-          <w:ilvl w:val="0"/>
-          <w:numId w:val="12"/>
-        </w:numPr>
-        <w:rPr>
-          <w:b/>
-          <w:bCs/>
-        </w:rPr>
-      </w:pPr>
-      <w:r>
-        <w:rPr>
-          <w:b/>
-          <w:bCs/>
-        </w:rPr>
-        <w:lastRenderedPageBreak/>
-        <w:t>Autorizado</w:t>
-      </w:r>
-      <w:r>
-        <w:rPr>
-          <w:b/>
-          <w:bCs/>
-        </w:rPr>
-        <w:t xml:space="preserve"> </w:t>
-      </w:r>
-      <w:r>
-        <w:rPr>
-          <w:b/>
-          <w:bCs/>
-        </w:rPr>
-        <w:t>Body</w:t>
-      </w:r>
-    </w:p>
-    <w:p>
-      <w:r>
-        <w:drawing>
-          <wp:inline distT="0" distB="0" distL="0" distR="0" wp14:anchorId="2F648931" wp14:editId="5AB06B20">
-            <wp:extent cx="6479540" cy="3509645"/>
-            <wp:effectExtent l="0" t="0" r="0" b="0"/>
-            <wp:docPr id="42" name="Imagem 42"/>
             <wp:cNvGraphicFramePr>
               <a:graphicFrameLocks xmlns:a="http://schemas.openxmlformats.org/drawingml/2006/main" noChangeAspect="1"/>
             </wp:cNvGraphicFramePr>
@@ -8934,24 +8854,44 @@
         </w:drawing>
       </w:r>
     </w:p>
-    <w:p>
-      <w:pPr>
-        <w:pStyle w:val="Ttulo2"/>
-      </w:pPr>
-      <w:r>
-        <w:t xml:space="preserve"> </w:t>
-      </w:r>
-      <w:r>
-        <w:t>Cadastrar Disciplina</w:t>
-      </w:r>
-    </w:p>
-    <w:p>
-      <w:r>
+    <w:p/>
+    <w:p>
+      <w:pPr>
+        <w:pStyle w:val="PargrafodaLista"/>
+        <w:numPr>
+          <w:ilvl w:val="0"/>
+          <w:numId w:val="12"/>
+        </w:numPr>
+        <w:rPr>
+          <w:b/>
+          <w:bCs/>
+        </w:rPr>
+      </w:pPr>
+      <w:r>
+        <w:rPr>
+          <w:b/>
+          <w:bCs/>
+        </w:rPr>
+        <w:t>Autorizado</w:t>
+      </w:r>
+      <w:r>
+        <w:rPr>
+          <w:b/>
+          <w:bCs/>
+        </w:rPr>
+        <w:t xml:space="preserve"> Token</w:t>
+      </w:r>
+    </w:p>
+    <w:p>
+      <w:r>
+        <w:rPr>
+          <w:noProof/>
+        </w:rPr>
         <w:drawing>
-          <wp:inline distT="0" distB="0" distL="0" distR="0" wp14:anchorId="46C6B16B" wp14:editId="3810F27D">
+          <wp:inline distT="0" distB="0" distL="0" distR="0" wp14:anchorId="1A96212A" wp14:editId="350494F2">
             <wp:extent cx="6479540" cy="3509645"/>
             <wp:effectExtent l="0" t="0" r="0" b="0"/>
-            <wp:docPr id="43" name="Imagem 43"/>
+            <wp:docPr id="41" name="Imagem 41"/>
             <wp:cNvGraphicFramePr>
               <a:graphicFrameLocks xmlns:a="http://schemas.openxmlformats.org/drawingml/2006/main" noChangeAspect="1"/>
             </wp:cNvGraphicFramePr>
@@ -8986,7 +8926,15 @@
     </w:p>
     <w:p>
       <w:pPr>
-        <w:pStyle w:val="Ttulo2"/>
+        <w:pStyle w:val="PargrafodaLista"/>
+        <w:numPr>
+          <w:ilvl w:val="0"/>
+          <w:numId w:val="12"/>
+        </w:numPr>
+        <w:rPr>
+          <w:b/>
+          <w:bCs/>
+        </w:rPr>
         <w:sectPr>
           <w:pgSz w:w="11906" w:h="16838"/>
           <w:pgMar w:top="851" w:right="851" w:bottom="851" w:left="851" w:header="709" w:footer="709" w:gutter="0"/>
@@ -8999,18 +8947,6 @@
     </w:p>
     <w:p>
       <w:pPr>
-        <w:pStyle w:val="Ttulo2"/>
-      </w:pPr>
-      <w:r>
-        <w:lastRenderedPageBreak/>
-        <w:t xml:space="preserve"> </w:t>
-      </w:r>
-      <w:r>
-        <w:t>Alocar aluno em disciplina</w:t>
-      </w:r>
-    </w:p>
-    <w:p>
-      <w:pPr>
         <w:pStyle w:val="PargrafodaLista"/>
         <w:numPr>
           <w:ilvl w:val="0"/>
@@ -9026,16 +8962,27 @@
           <w:b/>
           <w:bCs/>
         </w:rPr>
-        <w:t>Aluno com id=1 em disciplina com id=1</w:t>
-      </w:r>
-    </w:p>
-    <w:p>
-      <w:r>
+        <w:lastRenderedPageBreak/>
+        <w:t>Autorizado</w:t>
+      </w:r>
+      <w:r>
+        <w:rPr>
+          <w:b/>
+          <w:bCs/>
+        </w:rPr>
+        <w:t xml:space="preserve"> Body</w:t>
+      </w:r>
+    </w:p>
+    <w:p>
+      <w:r>
+        <w:rPr>
+          <w:noProof/>
+        </w:rPr>
         <w:drawing>
-          <wp:inline distT="0" distB="0" distL="0" distR="0" wp14:anchorId="2081E1E0" wp14:editId="7BFBAD39">
+          <wp:inline distT="0" distB="0" distL="0" distR="0" wp14:anchorId="2F648931" wp14:editId="5AB06B20">
             <wp:extent cx="6479540" cy="3509645"/>
             <wp:effectExtent l="0" t="0" r="0" b="0"/>
-            <wp:docPr id="44" name="Imagem 44"/>
+            <wp:docPr id="42" name="Imagem 42"/>
             <wp:cNvGraphicFramePr>
               <a:graphicFrameLocks xmlns:a="http://schemas.openxmlformats.org/drawingml/2006/main" noChangeAspect="1"/>
             </wp:cNvGraphicFramePr>
@@ -9076,28 +9023,19 @@
         <w:t xml:space="preserve"> </w:t>
       </w:r>
       <w:r>
-        <w:t>Atribuir Nota</w:t>
-      </w:r>
-    </w:p>
-    <w:p>
-      <w:pPr>
-        <w:pStyle w:val="PargrafodaLista"/>
-        <w:numPr>
-          <w:ilvl w:val="0"/>
-          <w:numId w:val="12"/>
-        </w:numPr>
-      </w:pPr>
-      <w:r>
-        <w:t>Atribuir nota disciplina id = 1 e aluno id = 1, nota 8.5</w:t>
-      </w:r>
-    </w:p>
-    <w:p>
-      <w:r>
+        <w:t>Cadastrar Disciplina</w:t>
+      </w:r>
+    </w:p>
+    <w:p>
+      <w:r>
+        <w:rPr>
+          <w:noProof/>
+        </w:rPr>
         <w:drawing>
-          <wp:inline distT="0" distB="0" distL="0" distR="0" wp14:anchorId="17504B7B" wp14:editId="25E11BE9">
+          <wp:inline distT="0" distB="0" distL="0" distR="0" wp14:anchorId="46C6B16B" wp14:editId="3810F27D">
             <wp:extent cx="6479540" cy="3509645"/>
             <wp:effectExtent l="0" t="0" r="0" b="0"/>
-            <wp:docPr id="46" name="Imagem 46"/>
+            <wp:docPr id="43" name="Imagem 43"/>
             <wp:cNvGraphicFramePr>
               <a:graphicFrameLocks xmlns:a="http://schemas.openxmlformats.org/drawingml/2006/main" noChangeAspect="1"/>
             </wp:cNvGraphicFramePr>
@@ -9132,11 +9070,7 @@
     </w:p>
     <w:p>
       <w:pPr>
-        <w:pStyle w:val="PargrafodaLista"/>
-        <w:numPr>
-          <w:ilvl w:val="0"/>
-          <w:numId w:val="12"/>
-        </w:numPr>
+        <w:pStyle w:val="Ttulo2"/>
         <w:sectPr>
           <w:pgSz w:w="11906" w:h="16838"/>
           <w:pgMar w:top="851" w:right="851" w:bottom="851" w:left="851" w:header="709" w:footer="709" w:gutter="0"/>
@@ -9149,24 +9083,46 @@
     </w:p>
     <w:p>
       <w:pPr>
+        <w:pStyle w:val="Ttulo2"/>
+      </w:pPr>
+      <w:r>
+        <w:lastRenderedPageBreak/>
+        <w:t xml:space="preserve"> </w:t>
+      </w:r>
+      <w:r>
+        <w:t>Alocar aluno em disciplina</w:t>
+      </w:r>
+    </w:p>
+    <w:p>
+      <w:pPr>
         <w:pStyle w:val="PargrafodaLista"/>
         <w:numPr>
           <w:ilvl w:val="0"/>
           <w:numId w:val="12"/>
         </w:numPr>
-      </w:pPr>
-      <w:r>
-        <w:lastRenderedPageBreak/>
-        <w:t>Consultar notas do aluno id=1</w:t>
-      </w:r>
-    </w:p>
-    <w:p>
-      <w:r>
+        <w:rPr>
+          <w:b/>
+          <w:bCs/>
+        </w:rPr>
+      </w:pPr>
+      <w:r>
+        <w:rPr>
+          <w:b/>
+          <w:bCs/>
+        </w:rPr>
+        <w:t>Aluno com id=1 em disciplina com id=1</w:t>
+      </w:r>
+    </w:p>
+    <w:p>
+      <w:r>
+        <w:rPr>
+          <w:noProof/>
+        </w:rPr>
         <w:drawing>
-          <wp:inline distT="0" distB="0" distL="0" distR="0" wp14:anchorId="35AC2B13" wp14:editId="27B631AD">
+          <wp:inline distT="0" distB="0" distL="0" distR="0" wp14:anchorId="2081E1E0" wp14:editId="7BFBAD39">
             <wp:extent cx="6479540" cy="3509645"/>
             <wp:effectExtent l="0" t="0" r="0" b="0"/>
-            <wp:docPr id="48" name="Imagem 48"/>
+            <wp:docPr id="44" name="Imagem 44"/>
             <wp:cNvGraphicFramePr>
               <a:graphicFrameLocks xmlns:a="http://schemas.openxmlformats.org/drawingml/2006/main" noChangeAspect="1"/>
             </wp:cNvGraphicFramePr>
@@ -9204,16 +9160,34 @@
         <w:pStyle w:val="Ttulo2"/>
       </w:pPr>
       <w:r>
-        <w:t>Listar Alunos</w:t>
-      </w:r>
-    </w:p>
-    <w:p>
-      <w:r>
+        <w:t xml:space="preserve"> </w:t>
+      </w:r>
+      <w:r>
+        <w:t>Atribuir Nota</w:t>
+      </w:r>
+    </w:p>
+    <w:p>
+      <w:pPr>
+        <w:pStyle w:val="PargrafodaLista"/>
+        <w:numPr>
+          <w:ilvl w:val="0"/>
+          <w:numId w:val="12"/>
+        </w:numPr>
+      </w:pPr>
+      <w:r>
+        <w:t>Atribuir nota disciplina id = 1 e aluno id = 1, nota 8.5</w:t>
+      </w:r>
+    </w:p>
+    <w:p>
+      <w:r>
+        <w:rPr>
+          <w:noProof/>
+        </w:rPr>
         <w:drawing>
-          <wp:inline distT="0" distB="0" distL="0" distR="0" wp14:anchorId="2E69589D" wp14:editId="3F268DD2">
+          <wp:inline distT="0" distB="0" distL="0" distR="0" wp14:anchorId="17504B7B" wp14:editId="25E11BE9">
             <wp:extent cx="6479540" cy="3509645"/>
             <wp:effectExtent l="0" t="0" r="0" b="0"/>
-            <wp:docPr id="45" name="Imagem 45"/>
+            <wp:docPr id="46" name="Imagem 46"/>
             <wp:cNvGraphicFramePr>
               <a:graphicFrameLocks xmlns:a="http://schemas.openxmlformats.org/drawingml/2006/main" noChangeAspect="1"/>
             </wp:cNvGraphicFramePr>
@@ -9248,23 +9222,44 @@
     </w:p>
     <w:p>
       <w:pPr>
-        <w:pStyle w:val="Ttulo2"/>
+        <w:pStyle w:val="PargrafodaLista"/>
+        <w:numPr>
+          <w:ilvl w:val="0"/>
+          <w:numId w:val="12"/>
+        </w:numPr>
+        <w:sectPr>
+          <w:pgSz w:w="11906" w:h="16838"/>
+          <w:pgMar w:top="851" w:right="851" w:bottom="851" w:left="851" w:header="709" w:footer="709" w:gutter="0"/>
+          <w:pgNumType w:start="0"/>
+          <w:cols w:space="708"/>
+          <w:titlePg/>
+          <w:docGrid w:linePitch="360"/>
+        </w:sectPr>
+      </w:pPr>
+    </w:p>
+    <w:p>
+      <w:pPr>
+        <w:pStyle w:val="PargrafodaLista"/>
+        <w:numPr>
+          <w:ilvl w:val="0"/>
+          <w:numId w:val="12"/>
+        </w:numPr>
       </w:pPr>
       <w:r>
         <w:lastRenderedPageBreak/>
-        <w:t>Listar Disciplinas</w:t>
-      </w:r>
-      <w:r>
-        <w:t xml:space="preserve"> </w:t>
-      </w:r>
-    </w:p>
-    <w:p>
-      <w:r>
+        <w:t>Consultar notas do aluno id=1</w:t>
+      </w:r>
+    </w:p>
+    <w:p>
+      <w:r>
+        <w:rPr>
+          <w:noProof/>
+        </w:rPr>
         <w:drawing>
-          <wp:inline distT="0" distB="0" distL="0" distR="0" wp14:anchorId="1004422F" wp14:editId="721BF573">
+          <wp:inline distT="0" distB="0" distL="0" distR="0" wp14:anchorId="35AC2B13" wp14:editId="27B631AD">
             <wp:extent cx="6479540" cy="3509645"/>
             <wp:effectExtent l="0" t="0" r="0" b="0"/>
-            <wp:docPr id="49" name="Imagem 49"/>
+            <wp:docPr id="48" name="Imagem 48"/>
             <wp:cNvGraphicFramePr>
               <a:graphicFrameLocks xmlns:a="http://schemas.openxmlformats.org/drawingml/2006/main" noChangeAspect="1"/>
             </wp:cNvGraphicFramePr>
@@ -9302,42 +9297,19 @@
         <w:pStyle w:val="Ttulo2"/>
       </w:pPr>
       <w:r>
-        <w:t xml:space="preserve"> </w:t>
-      </w:r>
-      <w:r>
-        <w:t>A</w:t>
-      </w:r>
-      <w:r>
-        <w:t>lunos aprovados em uma determinada disciplina</w:t>
-      </w:r>
-    </w:p>
-    <w:p>
-      <w:pPr>
-        <w:pStyle w:val="PargrafodaLista"/>
-        <w:numPr>
-          <w:ilvl w:val="0"/>
-          <w:numId w:val="12"/>
-        </w:numPr>
-        <w:rPr>
-          <w:b/>
-          <w:bCs/>
-        </w:rPr>
-      </w:pPr>
-      <w:r>
-        <w:rPr>
-          <w:b/>
-          <w:bCs/>
-        </w:rPr>
-        <w:t>Disciplina id = 1</w:t>
-      </w:r>
-    </w:p>
-    <w:p>
-      <w:r>
+        <w:t>Listar Alunos</w:t>
+      </w:r>
+    </w:p>
+    <w:p>
+      <w:r>
+        <w:rPr>
+          <w:noProof/>
+        </w:rPr>
         <w:drawing>
-          <wp:inline distT="0" distB="0" distL="0" distR="0" wp14:anchorId="1856D9D3" wp14:editId="5125A94A">
+          <wp:inline distT="0" distB="0" distL="0" distR="0" wp14:anchorId="2E69589D" wp14:editId="3F268DD2">
             <wp:extent cx="6479540" cy="3509645"/>
             <wp:effectExtent l="0" t="0" r="0" b="0"/>
-            <wp:docPr id="50" name="Imagem 50"/>
+            <wp:docPr id="45" name="Imagem 45"/>
             <wp:cNvGraphicFramePr>
               <a:graphicFrameLocks xmlns:a="http://schemas.openxmlformats.org/drawingml/2006/main" noChangeAspect="1"/>
             </wp:cNvGraphicFramePr>
@@ -9373,66 +9345,25 @@
     <w:p>
       <w:pPr>
         <w:pStyle w:val="Ttulo2"/>
-        <w:sectPr>
-          <w:pgSz w:w="11906" w:h="16838"/>
-          <w:pgMar w:top="851" w:right="851" w:bottom="851" w:left="851" w:header="709" w:footer="709" w:gutter="0"/>
-          <w:pgNumType w:start="0"/>
-          <w:cols w:space="708"/>
-          <w:titlePg/>
-          <w:docGrid w:linePitch="360"/>
-        </w:sectPr>
-      </w:pPr>
-    </w:p>
-    <w:p>
-      <w:pPr>
-        <w:pStyle w:val="Ttulo2"/>
       </w:pPr>
       <w:r>
         <w:lastRenderedPageBreak/>
+        <w:t>Listar Disciplinas</w:t>
+      </w:r>
+      <w:r>
         <w:t xml:space="preserve"> </w:t>
       </w:r>
-      <w:r>
-        <w:t>A</w:t>
-      </w:r>
-      <w:r>
-        <w:t>lunos reprovados em uma determinada disciplina</w:t>
-      </w:r>
-    </w:p>
-    <w:p>
-      <w:pPr>
-        <w:pStyle w:val="PargrafodaLista"/>
-        <w:numPr>
-          <w:ilvl w:val="0"/>
-          <w:numId w:val="12"/>
-        </w:numPr>
-        <w:rPr>
-          <w:b/>
-          <w:bCs/>
-        </w:rPr>
-      </w:pPr>
-      <w:r>
-        <w:rPr>
-          <w:b/>
-          <w:bCs/>
-        </w:rPr>
-        <w:t xml:space="preserve">Disciplina id = </w:t>
-      </w:r>
-      <w:r>
-        <w:rPr>
-          <w:b/>
-          <w:bCs/>
-        </w:rPr>
-        <w:t>2</w:t>
-      </w:r>
-    </w:p>
-    <w:p/>
-    <w:p>
-      <w:r>
+    </w:p>
+    <w:p>
+      <w:r>
+        <w:rPr>
+          <w:noProof/>
+        </w:rPr>
         <w:drawing>
-          <wp:inline distT="0" distB="0" distL="0" distR="0" wp14:anchorId="3BBE530E" wp14:editId="1EEBA540">
+          <wp:inline distT="0" distB="0" distL="0" distR="0" wp14:anchorId="1004422F" wp14:editId="721BF573">
             <wp:extent cx="6479540" cy="3509645"/>
             <wp:effectExtent l="0" t="0" r="0" b="0"/>
-            <wp:docPr id="51" name="Imagem 51"/>
+            <wp:docPr id="49" name="Imagem 49"/>
             <wp:cNvGraphicFramePr>
               <a:graphicFrameLocks xmlns:a="http://schemas.openxmlformats.org/drawingml/2006/main" noChangeAspect="1"/>
             </wp:cNvGraphicFramePr>
@@ -9470,66 +9401,15 @@
         <w:pStyle w:val="Ttulo2"/>
       </w:pPr>
       <w:r>
-        <w:t>T</w:t>
-      </w:r>
-      <w:r>
-        <w:t>estes unitários para todos os métodos</w:t>
-      </w:r>
-    </w:p>
-    <w:p>
-      <w:r>
-        <w:t xml:space="preserve">Crie arquivos </w:t>
-      </w:r>
-      <w:proofErr w:type="spellStart"/>
-      <w:r>
-        <w:rPr>
-          <w:b/>
-          <w:bCs/>
-        </w:rPr>
-        <w:t>json</w:t>
-      </w:r>
-      <w:proofErr w:type="spellEnd"/>
-      <w:r>
-        <w:t xml:space="preserve"> na pasta documentos para os testes, facilita o processo de testes no </w:t>
-      </w:r>
-      <w:proofErr w:type="spellStart"/>
-      <w:r>
-        <w:rPr>
-          <w:b/>
-          <w:bCs/>
-        </w:rPr>
-        <w:t>Postman</w:t>
-      </w:r>
-      <w:proofErr w:type="spellEnd"/>
-      <w:r>
-        <w:t xml:space="preserve"> ou </w:t>
-      </w:r>
-      <w:proofErr w:type="spellStart"/>
-      <w:r>
-        <w:rPr>
-          <w:b/>
-          <w:bCs/>
-        </w:rPr>
-        <w:t>Insomnia</w:t>
-      </w:r>
-      <w:proofErr w:type="spellEnd"/>
-      <w:r>
-        <w:t xml:space="preserve">, além disso na pasta documentos tem também um arquivo com todas as rotas para teste no </w:t>
-      </w:r>
-      <w:proofErr w:type="spellStart"/>
-      <w:r>
-        <w:rPr>
-          <w:b/>
-          <w:bCs/>
-        </w:rPr>
-        <w:t>Postman</w:t>
-      </w:r>
-      <w:proofErr w:type="spellEnd"/>
-      <w:r>
-        <w:t>.</w:t>
-      </w:r>
-    </w:p>
-    <w:p/>
+        <w:t xml:space="preserve"> </w:t>
+      </w:r>
+      <w:r>
+        <w:t>A</w:t>
+      </w:r>
+      <w:r>
+        <w:t>lunos aprovados em uma determinada disciplina</w:t>
+      </w:r>
+    </w:p>
     <w:p>
       <w:pPr>
         <w:pStyle w:val="PargrafodaLista"/>
@@ -9542,37 +9422,24 @@
           <w:bCs/>
         </w:rPr>
       </w:pPr>
-      <w:proofErr w:type="spellStart"/>
       <w:r>
         <w:rPr>
           <w:b/>
           <w:bCs/>
         </w:rPr>
-        <w:t>Professor</w:t>
-      </w:r>
-      <w:r>
-        <w:rPr>
-          <w:b/>
-          <w:bCs/>
-        </w:rPr>
-        <w:t>Controller</w:t>
-      </w:r>
-      <w:r>
-        <w:rPr>
-          <w:b/>
-          <w:bCs/>
-        </w:rPr>
-        <w:t>Test</w:t>
-      </w:r>
-      <w:proofErr w:type="spellEnd"/>
-    </w:p>
-    <w:p>
-      <w:r>
+        <w:t>Disciplina id = 1</w:t>
+      </w:r>
+    </w:p>
+    <w:p>
+      <w:r>
+        <w:rPr>
+          <w:noProof/>
+        </w:rPr>
         <w:drawing>
-          <wp:inline distT="0" distB="0" distL="0" distR="0" wp14:anchorId="69CEAE70" wp14:editId="51597815">
+          <wp:inline distT="0" distB="0" distL="0" distR="0" wp14:anchorId="1856D9D3" wp14:editId="5125A94A">
             <wp:extent cx="6479540" cy="3509645"/>
             <wp:effectExtent l="0" t="0" r="0" b="0"/>
-            <wp:docPr id="55" name="Imagem 55"/>
+            <wp:docPr id="50" name="Imagem 50"/>
             <wp:cNvGraphicFramePr>
               <a:graphicFrameLocks xmlns:a="http://schemas.openxmlformats.org/drawingml/2006/main" noChangeAspect="1"/>
             </wp:cNvGraphicFramePr>
@@ -9605,18 +9472,9 @@
         </w:drawing>
       </w:r>
     </w:p>
-    <w:p/>
-    <w:p>
-      <w:pPr>
-        <w:pStyle w:val="PargrafodaLista"/>
-        <w:numPr>
-          <w:ilvl w:val="0"/>
-          <w:numId w:val="12"/>
-        </w:numPr>
-        <w:rPr>
-          <w:b/>
-          <w:bCs/>
-        </w:rPr>
+    <w:p>
+      <w:pPr>
+        <w:pStyle w:val="Ttulo2"/>
         <w:sectPr>
           <w:pgSz w:w="11906" w:h="16838"/>
           <w:pgMar w:top="851" w:right="851" w:bottom="851" w:left="851" w:header="709" w:footer="709" w:gutter="0"/>
@@ -9629,6 +9487,21 @@
     </w:p>
     <w:p>
       <w:pPr>
+        <w:pStyle w:val="Ttulo2"/>
+      </w:pPr>
+      <w:r>
+        <w:lastRenderedPageBreak/>
+        <w:t xml:space="preserve"> </w:t>
+      </w:r>
+      <w:r>
+        <w:t>A</w:t>
+      </w:r>
+      <w:r>
+        <w:t>lunos reprovados em uma determinada disciplina</w:t>
+      </w:r>
+    </w:p>
+    <w:p>
+      <w:pPr>
         <w:pStyle w:val="PargrafodaLista"/>
         <w:numPr>
           <w:ilvl w:val="0"/>
@@ -9639,24 +9512,32 @@
           <w:bCs/>
         </w:rPr>
       </w:pPr>
-      <w:proofErr w:type="spellStart"/>
       <w:r>
         <w:rPr>
           <w:b/>
           <w:bCs/>
         </w:rPr>
-        <w:lastRenderedPageBreak/>
-        <w:t>AlunoServiceTest</w:t>
-      </w:r>
-      <w:proofErr w:type="spellEnd"/>
-    </w:p>
-    <w:p>
-      <w:r>
+        <w:t xml:space="preserve">Disciplina id = </w:t>
+      </w:r>
+      <w:r>
+        <w:rPr>
+          <w:b/>
+          <w:bCs/>
+        </w:rPr>
+        <w:t>2</w:t>
+      </w:r>
+    </w:p>
+    <w:p/>
+    <w:p>
+      <w:r>
+        <w:rPr>
+          <w:noProof/>
+        </w:rPr>
         <w:drawing>
-          <wp:inline distT="0" distB="0" distL="0" distR="0" wp14:anchorId="4E42B9BC" wp14:editId="1CC80CDF">
+          <wp:inline distT="0" distB="0" distL="0" distR="0" wp14:anchorId="3BBE530E" wp14:editId="1EEBA540">
             <wp:extent cx="6479540" cy="3509645"/>
             <wp:effectExtent l="0" t="0" r="0" b="0"/>
-            <wp:docPr id="56" name="Imagem 56"/>
+            <wp:docPr id="51" name="Imagem 51"/>
             <wp:cNvGraphicFramePr>
               <a:graphicFrameLocks xmlns:a="http://schemas.openxmlformats.org/drawingml/2006/main" noChangeAspect="1"/>
             </wp:cNvGraphicFramePr>
@@ -9689,6 +9570,70 @@
         </w:drawing>
       </w:r>
     </w:p>
+    <w:p>
+      <w:pPr>
+        <w:pStyle w:val="Ttulo2"/>
+      </w:pPr>
+      <w:r>
+        <w:t>T</w:t>
+      </w:r>
+      <w:r>
+        <w:t>estes unitários para todos os métodos</w:t>
+      </w:r>
+    </w:p>
+    <w:p>
+      <w:r>
+        <w:t xml:space="preserve">Crie arquivos </w:t>
+      </w:r>
+      <w:proofErr w:type="spellStart"/>
+      <w:r>
+        <w:rPr>
+          <w:b/>
+          <w:bCs/>
+        </w:rPr>
+        <w:t>json</w:t>
+      </w:r>
+      <w:proofErr w:type="spellEnd"/>
+      <w:r>
+        <w:t xml:space="preserve"> na pasta documentos para os testes, facilita o processo de testes no </w:t>
+      </w:r>
+      <w:proofErr w:type="spellStart"/>
+      <w:r>
+        <w:rPr>
+          <w:b/>
+          <w:bCs/>
+        </w:rPr>
+        <w:t>Postman</w:t>
+      </w:r>
+      <w:proofErr w:type="spellEnd"/>
+      <w:r>
+        <w:t xml:space="preserve"> ou </w:t>
+      </w:r>
+      <w:proofErr w:type="spellStart"/>
+      <w:r>
+        <w:rPr>
+          <w:b/>
+          <w:bCs/>
+        </w:rPr>
+        <w:t>Insomnia</w:t>
+      </w:r>
+      <w:proofErr w:type="spellEnd"/>
+      <w:r>
+        <w:t xml:space="preserve">, além disso na pasta documentos tem também um arquivo com todas as rotas para teste no </w:t>
+      </w:r>
+      <w:proofErr w:type="spellStart"/>
+      <w:r>
+        <w:rPr>
+          <w:b/>
+          <w:bCs/>
+        </w:rPr>
+        <w:t>Postman</w:t>
+      </w:r>
+      <w:proofErr w:type="spellEnd"/>
+      <w:r>
+        <w:t>.</w:t>
+      </w:r>
+    </w:p>
     <w:p/>
     <w:p>
       <w:pPr>
@@ -9708,24 +9653,20 @@
           <w:b/>
           <w:bCs/>
         </w:rPr>
-        <w:t>Disciplina</w:t>
-      </w:r>
-      <w:r>
-        <w:rPr>
-          <w:b/>
-          <w:bCs/>
-        </w:rPr>
-        <w:t>ServiceTest</w:t>
+        <w:t>ProfessorControllerTest</w:t>
       </w:r>
       <w:proofErr w:type="spellEnd"/>
     </w:p>
     <w:p>
       <w:r>
+        <w:rPr>
+          <w:noProof/>
+        </w:rPr>
         <w:drawing>
-          <wp:inline distT="0" distB="0" distL="0" distR="0" wp14:anchorId="5BE73A15" wp14:editId="2B6A5294">
+          <wp:inline distT="0" distB="0" distL="0" distR="0" wp14:anchorId="69CEAE70" wp14:editId="51597815">
             <wp:extent cx="6479540" cy="3509645"/>
             <wp:effectExtent l="0" t="0" r="0" b="0"/>
-            <wp:docPr id="57" name="Imagem 57"/>
+            <wp:docPr id="55" name="Imagem 55"/>
             <wp:cNvGraphicFramePr>
               <a:graphicFrameLocks xmlns:a="http://schemas.openxmlformats.org/drawingml/2006/main" noChangeAspect="1"/>
             </wp:cNvGraphicFramePr>
@@ -9758,8 +9699,18 @@
         </w:drawing>
       </w:r>
     </w:p>
-    <w:p>
-      <w:pPr>
+    <w:p/>
+    <w:p>
+      <w:pPr>
+        <w:pStyle w:val="PargrafodaLista"/>
+        <w:numPr>
+          <w:ilvl w:val="0"/>
+          <w:numId w:val="12"/>
+        </w:numPr>
+        <w:rPr>
+          <w:b/>
+          <w:bCs/>
+        </w:rPr>
         <w:sectPr>
           <w:pgSz w:w="11906" w:h="16838"/>
           <w:pgMar w:top="851" w:right="851" w:bottom="851" w:left="851" w:header="709" w:footer="709" w:gutter="0"/>
@@ -9772,24 +9723,6 @@
     </w:p>
     <w:p>
       <w:pPr>
-        <w:pStyle w:val="Ttulo2"/>
-      </w:pPr>
-      <w:r>
-        <w:lastRenderedPageBreak/>
-        <w:t xml:space="preserve">  </w:t>
-      </w:r>
-      <w:r>
-        <w:t>A</w:t>
-      </w:r>
-      <w:r>
-        <w:t>utenticado</w:t>
-      </w:r>
-      <w:r>
-        <w:t xml:space="preserve"> do professor</w:t>
-      </w:r>
-    </w:p>
-    <w:p>
-      <w:pPr>
         <w:pStyle w:val="PargrafodaLista"/>
         <w:numPr>
           <w:ilvl w:val="0"/>
@@ -9800,24 +9733,60 @@
           <w:bCs/>
         </w:rPr>
       </w:pPr>
+      <w:proofErr w:type="spellStart"/>
       <w:r>
         <w:rPr>
           <w:b/>
           <w:bCs/>
         </w:rPr>
-        <w:t>Site pra encriptação</w:t>
-      </w:r>
-    </w:p>
-    <w:p>
-      <w:hyperlink r:id="rId25" w:history="1">
-        <w:r>
-          <w:rPr>
-            <w:rStyle w:val="Hyperlink"/>
-          </w:rPr>
-          <w:t>https://bcrypt-generator.com/</w:t>
-        </w:r>
-      </w:hyperlink>
-    </w:p>
+        <w:lastRenderedPageBreak/>
+        <w:t>AlunoServiceTest</w:t>
+      </w:r>
+      <w:proofErr w:type="spellEnd"/>
+    </w:p>
+    <w:p>
+      <w:r>
+        <w:rPr>
+          <w:noProof/>
+        </w:rPr>
+        <w:drawing>
+          <wp:inline distT="0" distB="0" distL="0" distR="0" wp14:anchorId="4E42B9BC" wp14:editId="1CC80CDF">
+            <wp:extent cx="6479540" cy="3509645"/>
+            <wp:effectExtent l="0" t="0" r="0" b="0"/>
+            <wp:docPr id="56" name="Imagem 56"/>
+            <wp:cNvGraphicFramePr>
+              <a:graphicFrameLocks xmlns:a="http://schemas.openxmlformats.org/drawingml/2006/main" noChangeAspect="1"/>
+            </wp:cNvGraphicFramePr>
+            <a:graphic xmlns:a="http://schemas.openxmlformats.org/drawingml/2006/main">
+              <a:graphicData uri="http://schemas.openxmlformats.org/drawingml/2006/picture">
+                <pic:pic xmlns:pic="http://schemas.openxmlformats.org/drawingml/2006/picture">
+                  <pic:nvPicPr>
+                    <pic:cNvPr id="1" name=""/>
+                    <pic:cNvPicPr/>
+                  </pic:nvPicPr>
+                  <pic:blipFill>
+                    <a:blip r:embed="rId25"/>
+                    <a:stretch>
+                      <a:fillRect/>
+                    </a:stretch>
+                  </pic:blipFill>
+                  <pic:spPr>
+                    <a:xfrm>
+                      <a:off x="0" y="0"/>
+                      <a:ext cx="6479540" cy="3509645"/>
+                    </a:xfrm>
+                    <a:prstGeom prst="rect">
+                      <a:avLst/>
+                    </a:prstGeom>
+                  </pic:spPr>
+                </pic:pic>
+              </a:graphicData>
+            </a:graphic>
+          </wp:inline>
+        </w:drawing>
+      </w:r>
+    </w:p>
+    <w:p/>
     <w:p>
       <w:pPr>
         <w:pStyle w:val="PargrafodaLista"/>
@@ -9830,21 +9799,26 @@
           <w:bCs/>
         </w:rPr>
       </w:pPr>
+      <w:proofErr w:type="spellStart"/>
       <w:r>
         <w:rPr>
           <w:b/>
           <w:bCs/>
         </w:rPr>
-        <w:t>Obter Token</w:t>
-      </w:r>
-    </w:p>
-    <w:p>
-      <w:r>
+        <w:t>DisciplinaServiceTest</w:t>
+      </w:r>
+      <w:proofErr w:type="spellEnd"/>
+    </w:p>
+    <w:p>
+      <w:r>
+        <w:rPr>
+          <w:noProof/>
+        </w:rPr>
         <w:drawing>
-          <wp:inline distT="0" distB="0" distL="0" distR="0" wp14:anchorId="4EE03C43" wp14:editId="35C6A57A">
+          <wp:inline distT="0" distB="0" distL="0" distR="0" wp14:anchorId="5BE73A15" wp14:editId="2B6A5294">
             <wp:extent cx="6479540" cy="3509645"/>
             <wp:effectExtent l="0" t="0" r="0" b="0"/>
-            <wp:docPr id="38" name="Imagem 38"/>
+            <wp:docPr id="57" name="Imagem 57"/>
             <wp:cNvGraphicFramePr>
               <a:graphicFrameLocks xmlns:a="http://schemas.openxmlformats.org/drawingml/2006/main" noChangeAspect="1"/>
             </wp:cNvGraphicFramePr>
@@ -9879,102 +9853,6 @@
     </w:p>
     <w:p>
       <w:pPr>
-        <w:pStyle w:val="PargrafodaLista"/>
-        <w:numPr>
-          <w:ilvl w:val="0"/>
-          <w:numId w:val="12"/>
-        </w:numPr>
-        <w:rPr>
-          <w:b/>
-          <w:bCs/>
-        </w:rPr>
-      </w:pPr>
-      <w:proofErr w:type="spellStart"/>
-      <w:r>
-        <w:rPr>
-          <w:b/>
-          <w:bCs/>
-        </w:rPr>
-        <w:t>pg</w:t>
-      </w:r>
-      <w:proofErr w:type="spellEnd"/>
-      <w:r>
-        <w:rPr>
-          <w:b/>
-          <w:bCs/>
-        </w:rPr>
-        <w:t xml:space="preserve"> admin</w:t>
-      </w:r>
-    </w:p>
-    <w:p>
-      <w:pPr>
-        <w:ind w:left="360"/>
-      </w:pPr>
-      <w:r>
-        <w:t>user</w:t>
-      </w:r>
-      <w:r>
-        <w:t>: admin | senha: 123456</w:t>
-      </w:r>
-    </w:p>
-    <w:p>
-      <w:pPr>
-        <w:ind w:left="360"/>
-      </w:pPr>
-      <w:r>
-        <w:t>Token é salvo como uma varável pra facilitar os testes.</w:t>
-      </w:r>
-    </w:p>
-    <w:p>
-      <w:pPr>
-        <w:ind w:left="360"/>
-      </w:pPr>
-      <w:r>
-        <w:t>Endereço também é salvo como uma variável para facilitar os testes.</w:t>
-      </w:r>
-    </w:p>
-    <w:p>
-      <w:r>
-        <w:drawing>
-          <wp:inline distT="0" distB="0" distL="0" distR="0" wp14:anchorId="6D9DFC2F" wp14:editId="5B930E8F">
-            <wp:extent cx="6479540" cy="3509645"/>
-            <wp:effectExtent l="0" t="0" r="0" b="0"/>
-            <wp:docPr id="39" name="Imagem 39"/>
-            <wp:cNvGraphicFramePr>
-              <a:graphicFrameLocks xmlns:a="http://schemas.openxmlformats.org/drawingml/2006/main" noChangeAspect="1"/>
-            </wp:cNvGraphicFramePr>
-            <a:graphic xmlns:a="http://schemas.openxmlformats.org/drawingml/2006/main">
-              <a:graphicData uri="http://schemas.openxmlformats.org/drawingml/2006/picture">
-                <pic:pic xmlns:pic="http://schemas.openxmlformats.org/drawingml/2006/picture">
-                  <pic:nvPicPr>
-                    <pic:cNvPr id="1" name=""/>
-                    <pic:cNvPicPr/>
-                  </pic:nvPicPr>
-                  <pic:blipFill>
-                    <a:blip r:embed="rId27"/>
-                    <a:stretch>
-                      <a:fillRect/>
-                    </a:stretch>
-                  </pic:blipFill>
-                  <pic:spPr>
-                    <a:xfrm>
-                      <a:off x="0" y="0"/>
-                      <a:ext cx="6479540" cy="3509645"/>
-                    </a:xfrm>
-                    <a:prstGeom prst="rect">
-                      <a:avLst/>
-                    </a:prstGeom>
-                  </pic:spPr>
-                </pic:pic>
-              </a:graphicData>
-            </a:graphic>
-          </wp:inline>
-        </w:drawing>
-      </w:r>
-    </w:p>
-    <w:p>
-      <w:pPr>
-        <w:pStyle w:val="Ttulo2"/>
         <w:sectPr>
           <w:pgSz w:w="11906" w:h="16838"/>
           <w:pgMar w:top="851" w:right="851" w:bottom="851" w:left="851" w:header="709" w:footer="709" w:gutter="0"/>
@@ -9991,132 +9869,15 @@
       </w:pPr>
       <w:r>
         <w:lastRenderedPageBreak/>
-        <w:t>Banco de Dados escolhido</w:t>
-      </w:r>
-    </w:p>
-    <w:p>
-      <w:r>
-        <w:t xml:space="preserve">Fiz o projeto em dois bancos de dados para praticar mais, primeiro fiz em H2 porque é mais rápido pra min e depois fiz em </w:t>
-      </w:r>
-      <w:proofErr w:type="spellStart"/>
-      <w:r>
-        <w:t>postreSql</w:t>
-      </w:r>
-      <w:proofErr w:type="spellEnd"/>
-      <w:r>
-        <w:t>.</w:t>
-      </w:r>
-    </w:p>
-    <w:p/>
-    <w:p>
-      <w:r>
-        <w:t>O projeto está em duas branch:</w:t>
-      </w:r>
-    </w:p>
-    <w:p>
-      <w:pPr>
-        <w:pStyle w:val="PargrafodaLista"/>
-        <w:numPr>
-          <w:ilvl w:val="0"/>
-          <w:numId w:val="14"/>
-        </w:numPr>
-      </w:pPr>
-      <w:r>
-        <w:t xml:space="preserve">A branch </w:t>
-      </w:r>
-      <w:r>
-        <w:rPr>
-          <w:b/>
-          <w:bCs/>
-        </w:rPr>
-        <w:t>main</w:t>
-      </w:r>
-      <w:r>
-        <w:t xml:space="preserve"> está com H2, tem tudo</w:t>
-      </w:r>
-      <w:r>
-        <w:t xml:space="preserve"> menos </w:t>
-      </w:r>
-      <w:r>
-        <w:rPr>
-          <w:rStyle w:val="nfase"/>
-        </w:rPr>
-        <w:t>autenticação</w:t>
-      </w:r>
-      <w:r>
-        <w:rPr>
-          <w:rStyle w:val="nfase"/>
-        </w:rPr>
-        <w:t xml:space="preserve"> e</w:t>
-      </w:r>
-      <w:r>
-        <w:t xml:space="preserve"> arquivo </w:t>
-      </w:r>
-      <w:r>
-        <w:rPr>
-          <w:rStyle w:val="nfase"/>
-        </w:rPr>
-        <w:t>*.</w:t>
-      </w:r>
-      <w:proofErr w:type="spellStart"/>
-      <w:r>
-        <w:rPr>
-          <w:rStyle w:val="nfase"/>
-        </w:rPr>
-        <w:t>jar</w:t>
-      </w:r>
-      <w:proofErr w:type="spellEnd"/>
-      <w:r>
-        <w:t>.</w:t>
-      </w:r>
-    </w:p>
-    <w:p>
-      <w:pPr>
-        <w:pStyle w:val="PargrafodaLista"/>
-        <w:numPr>
-          <w:ilvl w:val="0"/>
-          <w:numId w:val="14"/>
-        </w:numPr>
-      </w:pPr>
-      <w:r>
-        <w:t xml:space="preserve">A branch </w:t>
-      </w:r>
-      <w:proofErr w:type="spellStart"/>
-      <w:r>
-        <w:t>postressql</w:t>
-      </w:r>
-      <w:proofErr w:type="spellEnd"/>
-      <w:r>
-        <w:t xml:space="preserve"> está em </w:t>
-      </w:r>
-      <w:proofErr w:type="spellStart"/>
-      <w:r>
-        <w:t>posgreSql</w:t>
-      </w:r>
-      <w:proofErr w:type="spellEnd"/>
-      <w:r>
-        <w:t xml:space="preserve">, </w:t>
-      </w:r>
-      <w:r>
-        <w:rPr>
-          <w:rStyle w:val="nfase"/>
-        </w:rPr>
-        <w:t>tem</w:t>
-      </w:r>
-      <w:r>
-        <w:rPr>
-          <w:rStyle w:val="nfase"/>
-        </w:rPr>
-        <w:t xml:space="preserve"> tudo (projeto, rotas, testes e autenticação)</w:t>
-      </w:r>
-      <w:r>
-        <w:t xml:space="preserve"> </w:t>
-      </w:r>
-      <w:r>
-        <w:t>.</w:t>
-      </w:r>
-    </w:p>
-    <w:p/>
+        <w:t xml:space="preserve">  </w:t>
+      </w:r>
+      <w:r>
+        <w:t>Autenticado</w:t>
+      </w:r>
+      <w:r>
+        <w:t xml:space="preserve"> do professor</w:t>
+      </w:r>
+    </w:p>
     <w:p>
       <w:pPr>
         <w:pStyle w:val="PargrafodaLista"/>
@@ -10124,23 +9885,59 @@
           <w:ilvl w:val="0"/>
           <w:numId w:val="12"/>
         </w:numPr>
-      </w:pPr>
-      <w:r>
         <w:rPr>
           <w:b/>
           <w:bCs/>
         </w:rPr>
-        <w:t>Configuração do banco de Dados</w:t>
-      </w:r>
-      <w:r>
-        <w:br/>
-      </w:r>
-      <w:r>
+      </w:pPr>
+      <w:r>
+        <w:rPr>
+          <w:b/>
+          <w:bCs/>
+        </w:rPr>
+        <w:t>Site pra encriptação</w:t>
+      </w:r>
+    </w:p>
+    <w:p>
+      <w:hyperlink r:id="rId27" w:history="1">
+        <w:r>
+          <w:rPr>
+            <w:rStyle w:val="Hyperlink"/>
+          </w:rPr>
+          <w:t>https://bcrypt-generator.com/</w:t>
+        </w:r>
+      </w:hyperlink>
+    </w:p>
+    <w:p>
+      <w:pPr>
+        <w:pStyle w:val="PargrafodaLista"/>
+        <w:numPr>
+          <w:ilvl w:val="0"/>
+          <w:numId w:val="12"/>
+        </w:numPr>
+        <w:rPr>
+          <w:b/>
+          <w:bCs/>
+        </w:rPr>
+      </w:pPr>
+      <w:r>
+        <w:rPr>
+          <w:b/>
+          <w:bCs/>
+        </w:rPr>
+        <w:t>Obter Token</w:t>
+      </w:r>
+    </w:p>
+    <w:p>
+      <w:r>
+        <w:rPr>
+          <w:noProof/>
+        </w:rPr>
         <w:drawing>
-          <wp:inline distT="0" distB="0" distL="0" distR="0" wp14:anchorId="0FAC205C" wp14:editId="6E34553C">
+          <wp:inline distT="0" distB="0" distL="0" distR="0" wp14:anchorId="4EE03C43" wp14:editId="35C6A57A">
             <wp:extent cx="6479540" cy="3509645"/>
             <wp:effectExtent l="0" t="0" r="0" b="0"/>
-            <wp:docPr id="52" name="Imagem 52"/>
+            <wp:docPr id="38" name="Imagem 38"/>
             <wp:cNvGraphicFramePr>
               <a:graphicFrameLocks xmlns:a="http://schemas.openxmlformats.org/drawingml/2006/main" noChangeAspect="1"/>
             </wp:cNvGraphicFramePr>
@@ -10191,20 +9988,54 @@
           <w:b/>
           <w:bCs/>
         </w:rPr>
-        <w:t>schema.sql</w:t>
+        <w:t>pg</w:t>
       </w:r>
       <w:proofErr w:type="spellEnd"/>
+      <w:r>
+        <w:rPr>
+          <w:b/>
+          <w:bCs/>
+        </w:rPr>
+        <w:t xml:space="preserve"> admin</w:t>
+      </w:r>
     </w:p>
     <w:p>
       <w:pPr>
         <w:ind w:left="360"/>
       </w:pPr>
       <w:r>
+        <w:t>user</w:t>
+      </w:r>
+      <w:r>
+        <w:t>: admin | senha: 123456</w:t>
+      </w:r>
+    </w:p>
+    <w:p>
+      <w:pPr>
+        <w:ind w:left="360"/>
+      </w:pPr>
+      <w:r>
+        <w:t>Token é salvo como uma varável pra facilitar os testes.</w:t>
+      </w:r>
+    </w:p>
+    <w:p>
+      <w:pPr>
+        <w:ind w:left="360"/>
+      </w:pPr>
+      <w:r>
+        <w:t>Endereço também é salvo como uma variável para facilitar os testes.</w:t>
+      </w:r>
+    </w:p>
+    <w:p>
+      <w:r>
+        <w:rPr>
+          <w:noProof/>
+        </w:rPr>
         <w:drawing>
-          <wp:inline distT="0" distB="0" distL="0" distR="0" wp14:anchorId="45528140" wp14:editId="1ACEF1F6">
+          <wp:inline distT="0" distB="0" distL="0" distR="0" wp14:anchorId="6D9DFC2F" wp14:editId="5B930E8F">
             <wp:extent cx="6479540" cy="3509645"/>
             <wp:effectExtent l="0" t="0" r="0" b="0"/>
-            <wp:docPr id="53" name="Imagem 53"/>
+            <wp:docPr id="39" name="Imagem 39"/>
             <wp:cNvGraphicFramePr>
               <a:graphicFrameLocks xmlns:a="http://schemas.openxmlformats.org/drawingml/2006/main" noChangeAspect="1"/>
             </wp:cNvGraphicFramePr>
@@ -10239,44 +10070,176 @@
     </w:p>
     <w:p>
       <w:pPr>
-        <w:pStyle w:val="Ttulo1"/>
+        <w:pStyle w:val="Ttulo2"/>
+        <w:sectPr>
+          <w:pgSz w:w="11906" w:h="16838"/>
+          <w:pgMar w:top="851" w:right="851" w:bottom="851" w:left="851" w:header="709" w:footer="709" w:gutter="0"/>
+          <w:pgNumType w:start="0"/>
+          <w:cols w:space="708"/>
+          <w:titlePg/>
+          <w:docGrid w:linePitch="360"/>
+        </w:sectPr>
+      </w:pPr>
+    </w:p>
+    <w:p>
+      <w:pPr>
+        <w:pStyle w:val="Ttulo2"/>
       </w:pPr>
       <w:r>
         <w:lastRenderedPageBreak/>
-        <w:t>Faça o deploy do serviço/aplicação desenvolvido.</w:t>
-      </w:r>
-    </w:p>
-    <w:p>
-      <w:r>
-        <w:t xml:space="preserve">Gerei o arquivo </w:t>
+        <w:t>Banco de Dados escolhido</w:t>
+      </w:r>
+    </w:p>
+    <w:p>
+      <w:r>
+        <w:t xml:space="preserve">Fiz o projeto em dois bancos de dados para praticar mais, primeiro fiz em H2 porque é mais rápido pra min e depois fiz em </w:t>
+      </w:r>
+      <w:proofErr w:type="spellStart"/>
+      <w:r>
+        <w:t>postreSql</w:t>
+      </w:r>
+      <w:proofErr w:type="spellEnd"/>
+      <w:r>
+        <w:t>.</w:t>
+      </w:r>
+    </w:p>
+    <w:p/>
+    <w:p>
+      <w:r>
+        <w:t>O projeto está em duas branch:</w:t>
+      </w:r>
+    </w:p>
+    <w:p>
+      <w:pPr>
+        <w:pStyle w:val="PargrafodaLista"/>
+        <w:numPr>
+          <w:ilvl w:val="0"/>
+          <w:numId w:val="14"/>
+        </w:numPr>
+      </w:pPr>
+      <w:r>
+        <w:t xml:space="preserve">A branch </w:t>
       </w:r>
       <w:r>
         <w:rPr>
           <w:b/>
           <w:bCs/>
         </w:rPr>
+        <w:t>main</w:t>
+      </w:r>
+      <w:r>
+        <w:t xml:space="preserve"> está com H2, tem tudo</w:t>
+      </w:r>
+      <w:r>
+        <w:t xml:space="preserve"> menos </w:t>
+      </w:r>
+      <w:r>
+        <w:rPr>
+          <w:rStyle w:val="nfase"/>
+        </w:rPr>
+        <w:t>autenticação</w:t>
+      </w:r>
+      <w:r>
+        <w:rPr>
+          <w:rStyle w:val="nfase"/>
+        </w:rPr>
+        <w:t xml:space="preserve"> e</w:t>
+      </w:r>
+      <w:r>
+        <w:t xml:space="preserve"> arquivo </w:t>
+      </w:r>
+      <w:r>
+        <w:rPr>
+          <w:rStyle w:val="nfase"/>
+        </w:rPr>
         <w:t>*.</w:t>
       </w:r>
       <w:proofErr w:type="spellStart"/>
+      <w:r>
+        <w:rPr>
+          <w:rStyle w:val="nfase"/>
+        </w:rPr>
+        <w:t>jar</w:t>
+      </w:r>
+      <w:proofErr w:type="spellEnd"/>
+      <w:r>
+        <w:t>.</w:t>
+      </w:r>
+    </w:p>
+    <w:p>
+      <w:pPr>
+        <w:pStyle w:val="PargrafodaLista"/>
+        <w:numPr>
+          <w:ilvl w:val="0"/>
+          <w:numId w:val="14"/>
+        </w:numPr>
+      </w:pPr>
+      <w:r>
+        <w:t xml:space="preserve">A branch </w:t>
+      </w:r>
+      <w:proofErr w:type="spellStart"/>
+      <w:r>
+        <w:t>postressql</w:t>
+      </w:r>
+      <w:proofErr w:type="spellEnd"/>
+      <w:r>
+        <w:t xml:space="preserve"> está em </w:t>
+      </w:r>
+      <w:proofErr w:type="spellStart"/>
+      <w:r>
+        <w:t>posgreSql</w:t>
+      </w:r>
+      <w:proofErr w:type="spellEnd"/>
+      <w:r>
+        <w:t xml:space="preserve">, </w:t>
+      </w:r>
+      <w:r>
+        <w:rPr>
+          <w:rStyle w:val="nfase"/>
+        </w:rPr>
+        <w:t>tem</w:t>
+      </w:r>
+      <w:r>
+        <w:rPr>
+          <w:rStyle w:val="nfase"/>
+        </w:rPr>
+        <w:t xml:space="preserve"> tudo (projeto, rotas, testes e autenticação)</w:t>
+      </w:r>
+      <w:r>
+        <w:t xml:space="preserve"> </w:t>
+      </w:r>
+      <w:r>
+        <w:t>.</w:t>
+      </w:r>
+    </w:p>
+    <w:p/>
+    <w:p>
+      <w:pPr>
+        <w:pStyle w:val="PargrafodaLista"/>
+        <w:numPr>
+          <w:ilvl w:val="0"/>
+          <w:numId w:val="12"/>
+        </w:numPr>
+      </w:pPr>
       <w:r>
         <w:rPr>
           <w:b/>
           <w:bCs/>
         </w:rPr>
-        <w:t>jar</w:t>
-      </w:r>
-      <w:proofErr w:type="spellEnd"/>
-      <w:r>
-        <w:t xml:space="preserve"> conforme informado em aula.</w:t>
-      </w:r>
-    </w:p>
-    <w:p>
-      <w:r>
+        <w:t>Configuração do banco de Dados</w:t>
+      </w:r>
+      <w:r>
+        <w:br/>
+      </w:r>
+      <w:r>
+        <w:rPr>
+          <w:noProof/>
+        </w:rPr>
         <w:drawing>
-          <wp:inline distT="0" distB="0" distL="0" distR="0" wp14:anchorId="090025A9" wp14:editId="3696EB53">
+          <wp:inline distT="0" distB="0" distL="0" distR="0" wp14:anchorId="0FAC205C" wp14:editId="6E34553C">
             <wp:extent cx="6479540" cy="3509645"/>
             <wp:effectExtent l="0" t="0" r="0" b="0"/>
-            <wp:docPr id="54" name="Imagem 54"/>
+            <wp:docPr id="52" name="Imagem 52"/>
             <wp:cNvGraphicFramePr>
               <a:graphicFrameLocks xmlns:a="http://schemas.openxmlformats.org/drawingml/2006/main" noChangeAspect="1"/>
             </wp:cNvGraphicFramePr>
@@ -10309,6 +10272,148 @@
         </w:drawing>
       </w:r>
     </w:p>
+    <w:p>
+      <w:pPr>
+        <w:pStyle w:val="PargrafodaLista"/>
+        <w:numPr>
+          <w:ilvl w:val="0"/>
+          <w:numId w:val="12"/>
+        </w:numPr>
+        <w:rPr>
+          <w:b/>
+          <w:bCs/>
+        </w:rPr>
+      </w:pPr>
+      <w:proofErr w:type="spellStart"/>
+      <w:r>
+        <w:rPr>
+          <w:b/>
+          <w:bCs/>
+        </w:rPr>
+        <w:t>schema.sql</w:t>
+      </w:r>
+      <w:proofErr w:type="spellEnd"/>
+    </w:p>
+    <w:p>
+      <w:pPr>
+        <w:ind w:left="360"/>
+      </w:pPr>
+      <w:r>
+        <w:rPr>
+          <w:noProof/>
+        </w:rPr>
+        <w:drawing>
+          <wp:inline distT="0" distB="0" distL="0" distR="0" wp14:anchorId="45528140" wp14:editId="1ACEF1F6">
+            <wp:extent cx="6479540" cy="3509645"/>
+            <wp:effectExtent l="0" t="0" r="0" b="0"/>
+            <wp:docPr id="53" name="Imagem 53"/>
+            <wp:cNvGraphicFramePr>
+              <a:graphicFrameLocks xmlns:a="http://schemas.openxmlformats.org/drawingml/2006/main" noChangeAspect="1"/>
+            </wp:cNvGraphicFramePr>
+            <a:graphic xmlns:a="http://schemas.openxmlformats.org/drawingml/2006/main">
+              <a:graphicData uri="http://schemas.openxmlformats.org/drawingml/2006/picture">
+                <pic:pic xmlns:pic="http://schemas.openxmlformats.org/drawingml/2006/picture">
+                  <pic:nvPicPr>
+                    <pic:cNvPr id="1" name=""/>
+                    <pic:cNvPicPr/>
+                  </pic:nvPicPr>
+                  <pic:blipFill>
+                    <a:blip r:embed="rId31"/>
+                    <a:stretch>
+                      <a:fillRect/>
+                    </a:stretch>
+                  </pic:blipFill>
+                  <pic:spPr>
+                    <a:xfrm>
+                      <a:off x="0" y="0"/>
+                      <a:ext cx="6479540" cy="3509645"/>
+                    </a:xfrm>
+                    <a:prstGeom prst="rect">
+                      <a:avLst/>
+                    </a:prstGeom>
+                  </pic:spPr>
+                </pic:pic>
+              </a:graphicData>
+            </a:graphic>
+          </wp:inline>
+        </w:drawing>
+      </w:r>
+    </w:p>
+    <w:p>
+      <w:pPr>
+        <w:pStyle w:val="Ttulo1"/>
+      </w:pPr>
+      <w:r>
+        <w:lastRenderedPageBreak/>
+        <w:t>Faça o deploy do serviço/aplicação desenvolvido.</w:t>
+      </w:r>
+    </w:p>
+    <w:p>
+      <w:r>
+        <w:t xml:space="preserve">Gerei o arquivo </w:t>
+      </w:r>
+      <w:r>
+        <w:rPr>
+          <w:b/>
+          <w:bCs/>
+        </w:rPr>
+        <w:t>*.</w:t>
+      </w:r>
+      <w:proofErr w:type="spellStart"/>
+      <w:r>
+        <w:rPr>
+          <w:b/>
+          <w:bCs/>
+        </w:rPr>
+        <w:t>jar</w:t>
+      </w:r>
+      <w:proofErr w:type="spellEnd"/>
+      <w:r>
+        <w:t xml:space="preserve"> conforme informado em aula.</w:t>
+      </w:r>
+    </w:p>
+    <w:p>
+      <w:r>
+        <w:rPr>
+          <w:noProof/>
+        </w:rPr>
+        <w:drawing>
+          <wp:inline distT="0" distB="0" distL="0" distR="0" wp14:anchorId="090025A9" wp14:editId="3696EB53">
+            <wp:extent cx="6479540" cy="3509645"/>
+            <wp:effectExtent l="0" t="0" r="0" b="0"/>
+            <wp:docPr id="54" name="Imagem 54"/>
+            <wp:cNvGraphicFramePr>
+              <a:graphicFrameLocks xmlns:a="http://schemas.openxmlformats.org/drawingml/2006/main" noChangeAspect="1"/>
+            </wp:cNvGraphicFramePr>
+            <a:graphic xmlns:a="http://schemas.openxmlformats.org/drawingml/2006/main">
+              <a:graphicData uri="http://schemas.openxmlformats.org/drawingml/2006/picture">
+                <pic:pic xmlns:pic="http://schemas.openxmlformats.org/drawingml/2006/picture">
+                  <pic:nvPicPr>
+                    <pic:cNvPr id="1" name=""/>
+                    <pic:cNvPicPr/>
+                  </pic:nvPicPr>
+                  <pic:blipFill>
+                    <a:blip r:embed="rId32"/>
+                    <a:stretch>
+                      <a:fillRect/>
+                    </a:stretch>
+                  </pic:blipFill>
+                  <pic:spPr>
+                    <a:xfrm>
+                      <a:off x="0" y="0"/>
+                      <a:ext cx="6479540" cy="3509645"/>
+                    </a:xfrm>
+                    <a:prstGeom prst="rect">
+                      <a:avLst/>
+                    </a:prstGeom>
+                  </pic:spPr>
+                </pic:pic>
+              </a:graphicData>
+            </a:graphic>
+          </wp:inline>
+        </w:drawing>
+      </w:r>
+    </w:p>
     <w:sectPr>
       <w:pgSz w:w="11906" w:h="16838"/>
       <w:pgMar w:top="851" w:right="851" w:bottom="851" w:left="851" w:header="709" w:footer="709" w:gutter="0"/>
@@ -10722,6 +10827,119 @@
     </w:lvl>
   </w:abstractNum>
   <w:abstractNum w:abstractNumId="4" w15:restartNumberingAfterBreak="0">
+    <w:nsid w:val="457A151E"/>
+    <w:multiLevelType w:val="hybridMultilevel"/>
+    <w:tmpl w:val="B08C6F92"/>
+    <w:lvl w:ilvl="0" w:tplc="04160001">
+      <w:start w:val="1"/>
+      <w:numFmt w:val="bullet"/>
+      <w:lvlText w:val=""/>
+      <w:lvlJc w:val="left"/>
+      <w:pPr>
+        <w:ind w:left="720" w:hanging="360"/>
+      </w:pPr>
+      <w:rPr>
+        <w:rFonts w:ascii="Symbol" w:hAnsi="Symbol" w:hint="default"/>
+      </w:rPr>
+    </w:lvl>
+    <w:lvl w:ilvl="1" w:tplc="04160003" w:tentative="1">
+      <w:start w:val="1"/>
+      <w:numFmt w:val="bullet"/>
+      <w:lvlText w:val="o"/>
+      <w:lvlJc w:val="left"/>
+      <w:pPr>
+        <w:ind w:left="1440" w:hanging="360"/>
+      </w:pPr>
+      <w:rPr>
+        <w:rFonts w:ascii="Courier New" w:hAnsi="Courier New" w:cs="Courier New" w:hint="default"/>
+      </w:rPr>
+    </w:lvl>
+    <w:lvl w:ilvl="2" w:tplc="04160005" w:tentative="1">
+      <w:start w:val="1"/>
+      <w:numFmt w:val="bullet"/>
+      <w:lvlText w:val=""/>
+      <w:lvlJc w:val="left"/>
+      <w:pPr>
+        <w:ind w:left="2160" w:hanging="360"/>
+      </w:pPr>
+      <w:rPr>
+        <w:rFonts w:ascii="Wingdings" w:hAnsi="Wingdings" w:hint="default"/>
+      </w:rPr>
+    </w:lvl>
+    <w:lvl w:ilvl="3" w:tplc="04160001" w:tentative="1">
+      <w:start w:val="1"/>
+      <w:numFmt w:val="bullet"/>
+      <w:lvlText w:val=""/>
+      <w:lvlJc w:val="left"/>
+      <w:pPr>
+        <w:ind w:left="2880" w:hanging="360"/>
+      </w:pPr>
+      <w:rPr>
+        <w:rFonts w:ascii="Symbol" w:hAnsi="Symbol" w:hint="default"/>
+      </w:rPr>
+    </w:lvl>
+    <w:lvl w:ilvl="4" w:tplc="04160003" w:tentative="1">
+      <w:start w:val="1"/>
+      <w:numFmt w:val="bullet"/>
+      <w:lvlText w:val="o"/>
+      <w:lvlJc w:val="left"/>
+      <w:pPr>
+        <w:ind w:left="3600" w:hanging="360"/>
+      </w:pPr>
+      <w:rPr>
+        <w:rFonts w:ascii="Courier New" w:hAnsi="Courier New" w:cs="Courier New" w:hint="default"/>
+      </w:rPr>
+    </w:lvl>
+    <w:lvl w:ilvl="5" w:tplc="04160005" w:tentative="1">
+      <w:start w:val="1"/>
+      <w:numFmt w:val="bullet"/>
+      <w:lvlText w:val=""/>
+      <w:lvlJc w:val="left"/>
+      <w:pPr>
+        <w:ind w:left="4320" w:hanging="360"/>
+      </w:pPr>
+      <w:rPr>
+        <w:rFonts w:ascii="Wingdings" w:hAnsi="Wingdings" w:hint="default"/>
+      </w:rPr>
+    </w:lvl>
+    <w:lvl w:ilvl="6" w:tplc="04160001" w:tentative="1">
+      <w:start w:val="1"/>
+      <w:numFmt w:val="bullet"/>
+      <w:lvlText w:val=""/>
+      <w:lvlJc w:val="left"/>
+      <w:pPr>
+        <w:ind w:left="5040" w:hanging="360"/>
+      </w:pPr>
+      <w:rPr>
+        <w:rFonts w:ascii="Symbol" w:hAnsi="Symbol" w:hint="default"/>
+      </w:rPr>
+    </w:lvl>
+    <w:lvl w:ilvl="7" w:tplc="04160003" w:tentative="1">
+      <w:start w:val="1"/>
+      <w:numFmt w:val="bullet"/>
+      <w:lvlText w:val="o"/>
+      <w:lvlJc w:val="left"/>
+      <w:pPr>
+        <w:ind w:left="5760" w:hanging="360"/>
+      </w:pPr>
+      <w:rPr>
+        <w:rFonts w:ascii="Courier New" w:hAnsi="Courier New" w:cs="Courier New" w:hint="default"/>
+      </w:rPr>
+    </w:lvl>
+    <w:lvl w:ilvl="8" w:tplc="04160005" w:tentative="1">
+      <w:start w:val="1"/>
+      <w:numFmt w:val="bullet"/>
+      <w:lvlText w:val=""/>
+      <w:lvlJc w:val="left"/>
+      <w:pPr>
+        <w:ind w:left="6480" w:hanging="360"/>
+      </w:pPr>
+      <w:rPr>
+        <w:rFonts w:ascii="Wingdings" w:hAnsi="Wingdings" w:hint="default"/>
+      </w:rPr>
+    </w:lvl>
+  </w:abstractNum>
+  <w:abstractNum w:abstractNumId="5" w15:restartNumberingAfterBreak="0">
     <w:nsid w:val="5D4D0AE7"/>
     <w:multiLevelType w:val="hybridMultilevel"/>
     <w:tmpl w:val="C8888568"/>
@@ -10834,7 +11052,7 @@
       </w:rPr>
     </w:lvl>
   </w:abstractNum>
-  <w:abstractNum w:abstractNumId="5" w15:restartNumberingAfterBreak="0">
+  <w:abstractNum w:abstractNumId="6" w15:restartNumberingAfterBreak="0">
     <w:nsid w:val="60585075"/>
     <w:multiLevelType w:val="hybridMultilevel"/>
     <w:tmpl w:val="CF407560"/>
@@ -10924,7 +11142,7 @@
       </w:pPr>
     </w:lvl>
   </w:abstractNum>
-  <w:abstractNum w:abstractNumId="6" w15:restartNumberingAfterBreak="0">
+  <w:abstractNum w:abstractNumId="7" w15:restartNumberingAfterBreak="0">
     <w:nsid w:val="6B8B12A8"/>
     <w:multiLevelType w:val="hybridMultilevel"/>
     <w:tmpl w:val="9C2492EC"/>
@@ -11010,7 +11228,7 @@
       </w:pPr>
     </w:lvl>
   </w:abstractNum>
-  <w:abstractNum w:abstractNumId="7" w15:restartNumberingAfterBreak="0">
+  <w:abstractNum w:abstractNumId="8" w15:restartNumberingAfterBreak="0">
     <w:nsid w:val="6FDF1ACC"/>
     <w:multiLevelType w:val="hybridMultilevel"/>
     <w:tmpl w:val="5D946066"/>
@@ -11100,7 +11318,7 @@
       </w:pPr>
     </w:lvl>
   </w:abstractNum>
-  <w:abstractNum w:abstractNumId="8" w15:restartNumberingAfterBreak="0">
+  <w:abstractNum w:abstractNumId="9" w15:restartNumberingAfterBreak="0">
     <w:nsid w:val="718A0047"/>
     <w:multiLevelType w:val="hybridMultilevel"/>
     <w:tmpl w:val="974E06F8"/>
@@ -11186,7 +11404,7 @@
       </w:pPr>
     </w:lvl>
   </w:abstractNum>
-  <w:abstractNum w:abstractNumId="9" w15:restartNumberingAfterBreak="0">
+  <w:abstractNum w:abstractNumId="10" w15:restartNumberingAfterBreak="0">
     <w:nsid w:val="7677085D"/>
     <w:multiLevelType w:val="hybridMultilevel"/>
     <w:tmpl w:val="1B90EBFC"/>
@@ -11299,7 +11517,7 @@
       </w:rPr>
     </w:lvl>
   </w:abstractNum>
-  <w:abstractNum w:abstractNumId="10" w15:restartNumberingAfterBreak="0">
+  <w:abstractNum w:abstractNumId="11" w15:restartNumberingAfterBreak="0">
     <w:nsid w:val="7A2D605C"/>
     <w:multiLevelType w:val="hybridMultilevel"/>
     <w:tmpl w:val="9C2492EC"/>
@@ -11386,31 +11604,31 @@
     </w:lvl>
   </w:abstractNum>
   <w:num w:numId="1">
-    <w:abstractNumId w:val="5"/>
+    <w:abstractNumId w:val="6"/>
   </w:num>
   <w:num w:numId="2">
     <w:abstractNumId w:val="2"/>
   </w:num>
   <w:num w:numId="3">
-    <w:abstractNumId w:val="10"/>
+    <w:abstractNumId w:val="11"/>
   </w:num>
   <w:num w:numId="4">
-    <w:abstractNumId w:val="6"/>
+    <w:abstractNumId w:val="7"/>
   </w:num>
   <w:num w:numId="5">
     <w:abstractNumId w:val="0"/>
   </w:num>
   <w:num w:numId="6">
-    <w:abstractNumId w:val="8"/>
+    <w:abstractNumId w:val="9"/>
   </w:num>
   <w:num w:numId="7">
-    <w:abstractNumId w:val="5"/>
+    <w:abstractNumId w:val="6"/>
   </w:num>
   <w:num w:numId="8">
-    <w:abstractNumId w:val="9"/>
+    <w:abstractNumId w:val="10"/>
   </w:num>
   <w:num w:numId="9">
-    <w:abstractNumId w:val="5"/>
+    <w:abstractNumId w:val="6"/>
     <w:lvlOverride w:ilvl="0">
       <w:startOverride w:val="9"/>
     </w:lvlOverride>
@@ -11419,15 +11637,18 @@
     <w:abstractNumId w:val="3"/>
   </w:num>
   <w:num w:numId="11">
-    <w:abstractNumId w:val="5"/>
+    <w:abstractNumId w:val="6"/>
   </w:num>
   <w:num w:numId="12">
     <w:abstractNumId w:val="1"/>
   </w:num>
   <w:num w:numId="13">
-    <w:abstractNumId w:val="7"/>
+    <w:abstractNumId w:val="8"/>
   </w:num>
   <w:num w:numId="14">
+    <w:abstractNumId w:val="5"/>
+  </w:num>
+  <w:num w:numId="15">
     <w:abstractNumId w:val="4"/>
   </w:num>
   <w:numIdMacAtCleanup w:val="4"/>

</xml_diff>